<commit_message>
Report - O aplikaciji
+ changed some texts
</commit_message>
<xml_diff>
--- a/Strokovno Porocilo.docx
+++ b/Strokovno Porocilo.docx
@@ -194,13 +194,67 @@
     </w:p>
     <w:p>
       <w:pPr>
+        <w:pStyle w:val="SummaryHeading"/>
+      </w:pPr>
+      <w:bookmarkStart w:id="0" w:name="_Toc226486070"/>
+      <w:bookmarkStart w:id="1" w:name="_Toc226486563"/>
+      <w:bookmarkStart w:id="2" w:name="_Toc226486626"/>
+      <w:r>
+        <w:lastRenderedPageBreak/>
+        <w:t>Abstract</w:t>
+      </w:r>
+      <w:bookmarkEnd w:id="0"/>
+      <w:bookmarkEnd w:id="1"/>
+      <w:bookmarkEnd w:id="2"/>
+    </w:p>
+    <w:p/>
+    <w:p/>
+    <w:p/>
+    <w:p/>
+    <w:p/>
+    <w:p>
+      <w:pPr>
+        <w:pStyle w:val="SummaryHeading"/>
+      </w:pPr>
+      <w:bookmarkStart w:id="3" w:name="_Toc226486071"/>
+      <w:bookmarkStart w:id="4" w:name="_Toc226486564"/>
+      <w:bookmarkStart w:id="5" w:name="_Toc226486627"/>
+      <w:r>
+        <w:t>Povzetek</w:t>
+      </w:r>
+      <w:bookmarkEnd w:id="3"/>
+      <w:bookmarkEnd w:id="4"/>
+      <w:bookmarkEnd w:id="5"/>
+    </w:p>
+    <w:p/>
+    <w:p>
+      <w:pPr>
+        <w:pStyle w:val="TOC1"/>
+        <w:tabs>
+          <w:tab w:val="right" w:leader="dot" w:pos="9360"/>
+        </w:tabs>
+        <w:rPr>
+          <w:color w:val="467886"/>
+          <w:u w:val="single"/>
+        </w:rPr>
+      </w:pPr>
+    </w:p>
+    <w:p>
+      <w:r>
+        <w:br w:type="page"/>
+      </w:r>
+    </w:p>
+    <w:p>
+      <w:pPr>
         <w:pStyle w:val="Heading1"/>
         <w:rPr>
           <w:rFonts w:eastAsia="Arial"/>
         </w:rPr>
       </w:pPr>
-      <w:bookmarkStart w:id="0" w:name="_Toc1038483689"/>
-      <w:bookmarkStart w:id="1" w:name="_Toc226483302"/>
+      <w:bookmarkStart w:id="6" w:name="_Toc1038483689"/>
+      <w:bookmarkStart w:id="7" w:name="_Toc226486565"/>
+      <w:bookmarkStart w:id="8" w:name="_Toc226486628"/>
+      <w:bookmarkStart w:id="9" w:name="_Toc226487773"/>
       <w:r>
         <w:rPr>
           <w:rFonts w:eastAsia="Arial"/>
@@ -208,18 +262,37 @@
         <w:lastRenderedPageBreak/>
         <w:t>Kazalo vsebine</w:t>
       </w:r>
-      <w:bookmarkEnd w:id="0"/>
-      <w:bookmarkEnd w:id="1"/>
+      <w:bookmarkEnd w:id="6"/>
+      <w:bookmarkEnd w:id="7"/>
+      <w:bookmarkEnd w:id="8"/>
+      <w:bookmarkEnd w:id="9"/>
     </w:p>
     <w:sdt>
       <w:sdtPr>
-        <w:id w:val="1742778213"/>
+        <w:id w:val="1033764718"/>
         <w:docPartObj>
           <w:docPartGallery w:val="Table of Contents"/>
           <w:docPartUnique/>
         </w:docPartObj>
       </w:sdtPr>
+      <w:sdtEndPr>
+        <w:rPr>
+          <w:rFonts w:ascii="Arial" w:eastAsia="Arial" w:hAnsi="Arial" w:cs="Arial"/>
+          <w:b/>
+          <w:bCs/>
+          <w:noProof/>
+          <w:color w:val="000000" w:themeColor="text1"/>
+          <w:sz w:val="24"/>
+          <w:szCs w:val="24"/>
+          <w:lang w:val="sl" w:eastAsia="ja-JP"/>
+        </w:rPr>
+      </w:sdtEndPr>
       <w:sdtContent>
+        <w:p>
+          <w:pPr>
+            <w:pStyle w:val="TOCHeading"/>
+          </w:pPr>
+        </w:p>
         <w:p>
           <w:pPr>
             <w:pStyle w:val="TOC1"/>
@@ -239,12 +312,12 @@
             <w:fldChar w:fldCharType="begin"/>
           </w:r>
           <w:r>
-            <w:instrText>TOC \o "1-9" \z \u \h</w:instrText>
+            <w:instrText xml:space="preserve"> TOC \o "1-3" \h \z \u </w:instrText>
           </w:r>
           <w:r>
             <w:fldChar w:fldCharType="separate"/>
           </w:r>
-          <w:hyperlink w:anchor="_Toc226483302" w:history="1">
+          <w:hyperlink w:anchor="_Toc226487773" w:history="1">
             <w:r>
               <w:rPr>
                 <w:rStyle w:val="Hyperlink"/>
@@ -271,7 +344,7 @@
                 <w:noProof/>
                 <w:webHidden/>
               </w:rPr>
-              <w:instrText xml:space="preserve"> PAGEREF _Toc226483302 \h </w:instrText>
+              <w:instrText xml:space="preserve"> PAGEREF _Toc226487773 \h </w:instrText>
             </w:r>
             <w:r>
               <w:rPr>
@@ -291,7 +364,7 @@
                 <w:noProof/>
                 <w:webHidden/>
               </w:rPr>
-              <w:t>2</w:t>
+              <w:t>3</w:t>
             </w:r>
             <w:r>
               <w:rPr>
@@ -317,13 +390,13 @@
               <w14:ligatures w14:val="standardContextual"/>
             </w:rPr>
           </w:pPr>
-          <w:hyperlink w:anchor="_Toc226483303" w:history="1">
+          <w:hyperlink w:anchor="_Toc226487774" w:history="1">
             <w:r>
               <w:rPr>
                 <w:rStyle w:val="Hyperlink"/>
                 <w:noProof/>
               </w:rPr>
-              <w:t>Abstract</w:t>
+              <w:t>1. Uvod</w:t>
             </w:r>
             <w:r>
               <w:rPr>
@@ -344,7 +417,7 @@
                 <w:noProof/>
                 <w:webHidden/>
               </w:rPr>
-              <w:instrText xml:space="preserve"> PAGEREF _Toc226483303 \h </w:instrText>
+              <w:instrText xml:space="preserve"> PAGEREF _Toc226487774 \h </w:instrText>
             </w:r>
             <w:r>
               <w:rPr>
@@ -364,7 +437,7 @@
                 <w:noProof/>
                 <w:webHidden/>
               </w:rPr>
-              <w:t>3</w:t>
+              <w:t>4</w:t>
             </w:r>
             <w:r>
               <w:rPr>
@@ -390,13 +463,13 @@
               <w14:ligatures w14:val="standardContextual"/>
             </w:rPr>
           </w:pPr>
-          <w:hyperlink w:anchor="_Toc226483304" w:history="1">
+          <w:hyperlink w:anchor="_Toc226487775" w:history="1">
             <w:r>
               <w:rPr>
                 <w:rStyle w:val="Hyperlink"/>
                 <w:noProof/>
               </w:rPr>
-              <w:t>Povzetek</w:t>
+              <w:t>2. Izbira orodij in programskih jezikov</w:t>
             </w:r>
             <w:r>
               <w:rPr>
@@ -417,7 +490,7 @@
                 <w:noProof/>
                 <w:webHidden/>
               </w:rPr>
-              <w:instrText xml:space="preserve"> PAGEREF _Toc226483304 \h </w:instrText>
+              <w:instrText xml:space="preserve"> PAGEREF _Toc226487775 \h </w:instrText>
             </w:r>
             <w:r>
               <w:rPr>
@@ -437,7 +510,7 @@
                 <w:noProof/>
                 <w:webHidden/>
               </w:rPr>
-              <w:t>3</w:t>
+              <w:t>4</w:t>
             </w:r>
             <w:r>
               <w:rPr>
@@ -463,13 +536,13 @@
               <w14:ligatures w14:val="standardContextual"/>
             </w:rPr>
           </w:pPr>
-          <w:hyperlink w:anchor="_Toc226483305" w:history="1">
+          <w:hyperlink w:anchor="_Toc226487776" w:history="1">
             <w:r>
               <w:rPr>
                 <w:rStyle w:val="Hyperlink"/>
                 <w:noProof/>
               </w:rPr>
-              <w:t>1. Uvod</w:t>
+              <w:t>3. O aplikaciji</w:t>
             </w:r>
             <w:r>
               <w:rPr>
@@ -490,7 +563,7 @@
                 <w:noProof/>
                 <w:webHidden/>
               </w:rPr>
-              <w:instrText xml:space="preserve"> PAGEREF _Toc226483305 \h </w:instrText>
+              <w:instrText xml:space="preserve"> PAGEREF _Toc226487776 \h </w:instrText>
             </w:r>
             <w:r>
               <w:rPr>
@@ -510,7 +583,7 @@
                 <w:noProof/>
                 <w:webHidden/>
               </w:rPr>
-              <w:t>4</w:t>
+              <w:t>5</w:t>
             </w:r>
             <w:r>
               <w:rPr>
@@ -522,169 +595,26 @@
           </w:hyperlink>
         </w:p>
         <w:p>
-          <w:pPr>
-            <w:pStyle w:val="TOC1"/>
-            <w:tabs>
-              <w:tab w:val="right" w:leader="dot" w:pos="9350"/>
-            </w:tabs>
+          <w:r>
             <w:rPr>
-              <w:rFonts w:asciiTheme="minorHAnsi" w:eastAsiaTheme="minorEastAsia" w:hAnsiTheme="minorHAnsi" w:cstheme="minorBidi"/>
+              <w:b/>
+              <w:bCs/>
               <w:noProof/>
-              <w:color w:val="auto"/>
-              <w:kern w:val="2"/>
-              <w:lang w:val="en-SI" w:eastAsia="en-SI"/>
-              <w14:ligatures w14:val="standardContextual"/>
             </w:rPr>
-          </w:pPr>
-          <w:hyperlink w:anchor="_Toc226483306" w:history="1">
-            <w:r>
-              <w:rPr>
-                <w:rStyle w:val="Hyperlink"/>
-                <w:noProof/>
-              </w:rPr>
-              <w:t>2. Izbira orodij in programskih jezikov</w:t>
-            </w:r>
-            <w:r>
-              <w:rPr>
-                <w:noProof/>
-                <w:webHidden/>
-              </w:rPr>
-              <w:tab/>
-            </w:r>
-            <w:r>
-              <w:rPr>
-                <w:noProof/>
-                <w:webHidden/>
-              </w:rPr>
-              <w:fldChar w:fldCharType="begin"/>
-            </w:r>
-            <w:r>
-              <w:rPr>
-                <w:noProof/>
-                <w:webHidden/>
-              </w:rPr>
-              <w:instrText xml:space="preserve"> PAGEREF _Toc226483306 \h </w:instrText>
-            </w:r>
-            <w:r>
-              <w:rPr>
-                <w:noProof/>
-                <w:webHidden/>
-              </w:rPr>
-            </w:r>
-            <w:r>
-              <w:rPr>
-                <w:noProof/>
-                <w:webHidden/>
-              </w:rPr>
-              <w:fldChar w:fldCharType="separate"/>
-            </w:r>
-            <w:r>
-              <w:rPr>
-                <w:noProof/>
-                <w:webHidden/>
-              </w:rPr>
-              <w:t>4</w:t>
-            </w:r>
-            <w:r>
-              <w:rPr>
-                <w:noProof/>
-                <w:webHidden/>
-              </w:rPr>
-              <w:fldChar w:fldCharType="end"/>
-            </w:r>
-          </w:hyperlink>
-        </w:p>
-        <w:p>
-          <w:pPr>
-            <w:pStyle w:val="TOC1"/>
-            <w:tabs>
-              <w:tab w:val="right" w:leader="dot" w:pos="9350"/>
-            </w:tabs>
-            <w:rPr>
-              <w:rFonts w:asciiTheme="minorHAnsi" w:eastAsiaTheme="minorEastAsia" w:hAnsiTheme="minorHAnsi" w:cstheme="minorBidi"/>
-              <w:noProof/>
-              <w:color w:val="auto"/>
-              <w:kern w:val="2"/>
-              <w:lang w:val="en-SI" w:eastAsia="en-SI"/>
-              <w14:ligatures w14:val="standardContextual"/>
-            </w:rPr>
-          </w:pPr>
-          <w:hyperlink w:anchor="_Toc226483307" w:history="1">
-            <w:r>
-              <w:rPr>
-                <w:rStyle w:val="Hyperlink"/>
-                <w:noProof/>
-              </w:rPr>
-              <w:t>3. O aplikaciji</w:t>
-            </w:r>
-            <w:r>
-              <w:rPr>
-                <w:noProof/>
-                <w:webHidden/>
-              </w:rPr>
-              <w:tab/>
-            </w:r>
-            <w:r>
-              <w:rPr>
-                <w:noProof/>
-                <w:webHidden/>
-              </w:rPr>
-              <w:fldChar w:fldCharType="begin"/>
-            </w:r>
-            <w:r>
-              <w:rPr>
-                <w:noProof/>
-                <w:webHidden/>
-              </w:rPr>
-              <w:instrText xml:space="preserve"> PAGEREF _Toc226483307 \h </w:instrText>
-            </w:r>
-            <w:r>
-              <w:rPr>
-                <w:noProof/>
-                <w:webHidden/>
-              </w:rPr>
-            </w:r>
-            <w:r>
-              <w:rPr>
-                <w:noProof/>
-                <w:webHidden/>
-              </w:rPr>
-              <w:fldChar w:fldCharType="separate"/>
-            </w:r>
-            <w:r>
-              <w:rPr>
-                <w:noProof/>
-                <w:webHidden/>
-              </w:rPr>
-              <w:t>5</w:t>
-            </w:r>
-            <w:r>
-              <w:rPr>
-                <w:noProof/>
-                <w:webHidden/>
-              </w:rPr>
-              <w:fldChar w:fldCharType="end"/>
-            </w:r>
-          </w:hyperlink>
-        </w:p>
-        <w:p>
-          <w:pPr>
-            <w:pStyle w:val="TOC1"/>
-            <w:tabs>
-              <w:tab w:val="right" w:leader="dot" w:pos="9360"/>
-            </w:tabs>
-            <w:rPr>
-              <w:color w:val="467886"/>
-              <w:u w:val="single"/>
-            </w:rPr>
-          </w:pPr>
-          <w:r>
             <w:fldChar w:fldCharType="end"/>
           </w:r>
         </w:p>
       </w:sdtContent>
     </w:sdt>
     <w:p>
+      <w:pPr>
+        <w:pStyle w:val="TOC1"/>
+        <w:tabs>
+          <w:tab w:val="right" w:leader="dot" w:pos="9350"/>
+        </w:tabs>
+      </w:pPr>
+    </w:p>
+    <w:p>
       <w:r>
         <w:br w:type="page"/>
       </w:r>
@@ -693,46 +623,16 @@
       <w:pPr>
         <w:pStyle w:val="Heading1"/>
       </w:pPr>
-      <w:bookmarkStart w:id="2" w:name="_Toc226483303"/>
-      <w:r>
-        <w:lastRenderedPageBreak/>
-        <w:t>A</w:t>
-      </w:r>
-      <w:r>
-        <w:t>bstract</w:t>
-      </w:r>
-      <w:bookmarkEnd w:id="2"/>
-    </w:p>
-    <w:p/>
-    <w:p/>
-    <w:p>
-      <w:pPr>
-        <w:pStyle w:val="Heading1"/>
-      </w:pPr>
-      <w:bookmarkStart w:id="3" w:name="_Toc226483304"/>
-      <w:r>
-        <w:t>Povzetek</w:t>
-      </w:r>
-      <w:bookmarkEnd w:id="3"/>
-    </w:p>
-    <w:p/>
-    <w:p/>
-    <w:p/>
-    <w:p>
-      <w:r>
-        <w:br w:type="page"/>
-      </w:r>
-    </w:p>
-    <w:p>
-      <w:pPr>
-        <w:pStyle w:val="Heading1"/>
-      </w:pPr>
-      <w:bookmarkStart w:id="4" w:name="_Toc226483305"/>
+      <w:bookmarkStart w:id="10" w:name="_Toc226486566"/>
+      <w:bookmarkStart w:id="11" w:name="_Toc226486629"/>
+      <w:bookmarkStart w:id="12" w:name="_Toc226487774"/>
       <w:r>
         <w:lastRenderedPageBreak/>
         <w:t>1. Uvod</w:t>
       </w:r>
-      <w:bookmarkEnd w:id="4"/>
+      <w:bookmarkEnd w:id="10"/>
+      <w:bookmarkEnd w:id="11"/>
+      <w:bookmarkEnd w:id="12"/>
     </w:p>
     <w:p/>
     <w:p>
@@ -803,16 +703,13 @@
         <w:t xml:space="preserve">, ki se lahko izvozi in </w:t>
       </w:r>
       <w:r>
-        <w:t>nadaljnje</w:t>
-      </w:r>
-      <w:r>
-        <w:t xml:space="preserve"> </w:t>
+        <w:t xml:space="preserve">nadaljnje </w:t>
       </w:r>
       <w:r>
         <w:t xml:space="preserve">uporabi v razne namene. </w:t>
       </w:r>
       <w:r>
-        <w:t>Uporabnik lahko ustvarja teren z uporabo t. i. node graph sistema, aplikacija pa potem naredi še 3D elevacijski model kot vizualizacijo ustvarjenega.</w:t>
+        <w:t>Uporabnik lahko ustvarja teren z uporabo t. i. node graph sistema, aplikacija pa potem naredi še vizualizacijo ustvarjenega.</w:t>
       </w:r>
     </w:p>
     <w:p/>
@@ -820,11 +717,15 @@
       <w:pPr>
         <w:pStyle w:val="Heading1"/>
       </w:pPr>
-      <w:bookmarkStart w:id="5" w:name="_Toc226483306"/>
+      <w:bookmarkStart w:id="13" w:name="_Toc226486567"/>
+      <w:bookmarkStart w:id="14" w:name="_Toc226486630"/>
+      <w:bookmarkStart w:id="15" w:name="_Toc226487775"/>
       <w:r>
         <w:t>2. Izbira orodij in programskih jezikov</w:t>
       </w:r>
-      <w:bookmarkEnd w:id="5"/>
+      <w:bookmarkEnd w:id="13"/>
+      <w:bookmarkEnd w:id="14"/>
+      <w:bookmarkEnd w:id="15"/>
     </w:p>
     <w:p/>
     <w:p>
@@ -978,20 +879,253 @@
       <w:pPr>
         <w:pStyle w:val="Heading1"/>
       </w:pPr>
-      <w:bookmarkStart w:id="6" w:name="_Toc226483307"/>
+      <w:bookmarkStart w:id="16" w:name="_Toc226486568"/>
+      <w:bookmarkStart w:id="17" w:name="_Toc226486631"/>
+      <w:bookmarkStart w:id="18" w:name="_Toc226487776"/>
       <w:r>
         <w:lastRenderedPageBreak/>
         <w:t>3. O aplikaciji</w:t>
       </w:r>
-      <w:bookmarkEnd w:id="6"/>
+      <w:bookmarkEnd w:id="16"/>
+      <w:bookmarkEnd w:id="17"/>
+      <w:bookmarkEnd w:id="18"/>
     </w:p>
     <w:p/>
+    <w:p>
+      <w:r>
+        <w:t>Uporabniku je v aplikaciji omogočeno ustvarjanje terena v urejevalniku, v katerem uporabnik postavlja in povezuje med sabo vozlišča (node), objekte, ki nad vrednostmi terena izvedejo določene operacije. Vsak node ima drugačno funkcijo, od npr. generacije z matematičnim šumom do simulacije erozije ali pa izvoza terena.</w:t>
+      </w:r>
+      <w:r>
+        <w:t xml:space="preserve"> Uporabnik lahko izbere katerikoli node in aplikacija na tisti točki v procesu izvajanja operacij nad terenom naredi vizualizacijo </w:t>
+      </w:r>
+      <w:r>
+        <w:t xml:space="preserve">terena kot </w:t>
+      </w:r>
+      <w:r>
+        <w:t>3D elevacijski model.</w:t>
+      </w:r>
+    </w:p>
+    <w:p>
+      <w:r>
+        <w:t>Aplikacija</w:t>
+      </w:r>
+      <w:r>
+        <w:t xml:space="preserve"> </w:t>
+      </w:r>
+      <w:r>
+        <w:t xml:space="preserve">teren </w:t>
+      </w:r>
+      <w:r>
+        <w:t>obravnava kot mrežo vrednosti</w:t>
+      </w:r>
+      <w:r>
+        <w:t>, v kateri ima vsaka celica svojo višinsko vrednost.</w:t>
+      </w:r>
+      <w:r>
+        <w:t xml:space="preserve"> Če govorimo o tem konceptu kot</w:t>
+      </w:r>
+      <w:r>
+        <w:t xml:space="preserve"> črno-bela</w:t>
+      </w:r>
+      <w:r>
+        <w:t xml:space="preserve"> slika je to višinski zemljevid (angl. heightmap)</w:t>
+      </w:r>
+      <w:r>
+        <w:t>, katerih izvoz aplikacija tudi omogoča, saj so</w:t>
+      </w:r>
+      <w:r>
+        <w:t xml:space="preserve"> najbolj</w:t>
+      </w:r>
+      <w:r>
+        <w:t xml:space="preserve"> pogost način za uvažanje</w:t>
+      </w:r>
+      <w:r>
+        <w:t xml:space="preserve"> in digitalno shranjevanje</w:t>
+      </w:r>
+      <w:r>
+        <w:t xml:space="preserve"> terena</w:t>
+      </w:r>
+      <w:r>
+        <w:t>.</w:t>
+      </w:r>
+      <w:r>
+        <w:t xml:space="preserve"> </w:t>
+      </w:r>
+    </w:p>
+    <w:p>
+      <w:r>
+        <w:drawing>
+          <wp:inline distT="0" distB="0" distL="0" distR="0" wp14:anchorId="290F0989" wp14:editId="2AB47EC6">
+            <wp:extent cx="3340189" cy="2190750"/>
+            <wp:effectExtent l="0" t="0" r="0" b="0"/>
+            <wp:docPr id="1804570579" name="Picture 1"/>
+            <wp:cNvGraphicFramePr>
+              <a:graphicFrameLocks xmlns:a="http://schemas.openxmlformats.org/drawingml/2006/main" noChangeAspect="1"/>
+            </wp:cNvGraphicFramePr>
+            <a:graphic xmlns:a="http://schemas.openxmlformats.org/drawingml/2006/main">
+              <a:graphicData uri="http://schemas.openxmlformats.org/drawingml/2006/picture">
+                <pic:pic xmlns:pic="http://schemas.openxmlformats.org/drawingml/2006/picture">
+                  <pic:nvPicPr>
+                    <pic:cNvPr id="1804570579" name=""/>
+                    <pic:cNvPicPr/>
+                  </pic:nvPicPr>
+                  <pic:blipFill>
+                    <a:blip r:embed="rId9"/>
+                    <a:stretch>
+                      <a:fillRect/>
+                    </a:stretch>
+                  </pic:blipFill>
+                  <pic:spPr>
+                    <a:xfrm>
+                      <a:off x="0" y="0"/>
+                      <a:ext cx="3380997" cy="2217515"/>
+                    </a:xfrm>
+                    <a:prstGeom prst="rect">
+                      <a:avLst/>
+                    </a:prstGeom>
+                  </pic:spPr>
+                </pic:pic>
+              </a:graphicData>
+            </a:graphic>
+          </wp:inline>
+        </w:drawing>
+      </w:r>
+    </w:p>
+    <w:p>
+      <w:pPr>
+        <w:pStyle w:val="Caption"/>
+      </w:pPr>
+      <w:r>
+        <w:t xml:space="preserve">Slika </w:t>
+      </w:r>
+      <w:r>
+        <w:fldChar w:fldCharType="begin"/>
+      </w:r>
+      <w:r>
+        <w:instrText xml:space="preserve"> SEQ Slika \* ARABIC </w:instrText>
+      </w:r>
+      <w:r>
+        <w:fldChar w:fldCharType="separate"/>
+      </w:r>
+      <w:r>
+        <w:rPr>
+          <w:noProof/>
+        </w:rPr>
+        <w:t>1</w:t>
+      </w:r>
+      <w:r>
+        <w:fldChar w:fldCharType="end"/>
+      </w:r>
+      <w:r>
+        <w:t xml:space="preserve"> Zaslonska slika aplikacije</w:t>
+      </w:r>
+    </w:p>
+    <w:p>
+      <w:r>
+        <w:rPr>
+          <w:lang w:val="en-SI"/>
+        </w:rPr>
+        <w:drawing>
+          <wp:inline distT="0" distB="0" distL="0" distR="0" wp14:anchorId="3299D514" wp14:editId="7A542D04">
+            <wp:extent cx="2343150" cy="2343150"/>
+            <wp:effectExtent l="0" t="0" r="0" b="0"/>
+            <wp:docPr id="93073320" name="Picture 4"/>
+            <wp:cNvGraphicFramePr>
+              <a:graphicFrameLocks xmlns:a="http://schemas.openxmlformats.org/drawingml/2006/main" noChangeAspect="1"/>
+            </wp:cNvGraphicFramePr>
+            <a:graphic xmlns:a="http://schemas.openxmlformats.org/drawingml/2006/main">
+              <a:graphicData uri="http://schemas.openxmlformats.org/drawingml/2006/picture">
+                <pic:pic xmlns:pic="http://schemas.openxmlformats.org/drawingml/2006/picture">
+                  <pic:nvPicPr>
+                    <pic:cNvPr id="0" name="Picture 13"/>
+                    <pic:cNvPicPr>
+                      <a:picLocks noChangeAspect="1" noChangeArrowheads="1"/>
+                    </pic:cNvPicPr>
+                  </pic:nvPicPr>
+                  <pic:blipFill>
+                    <a:blip r:embed="rId10">
+                      <a:extLst>
+                        <a:ext uri="{28A0092B-C50C-407E-A947-70E740481C1C}">
+                          <a14:useLocalDpi xmlns:a14="http://schemas.microsoft.com/office/drawing/2010/main" val="0"/>
+                        </a:ext>
+                      </a:extLst>
+                    </a:blip>
+                    <a:srcRect/>
+                    <a:stretch>
+                      <a:fillRect/>
+                    </a:stretch>
+                  </pic:blipFill>
+                  <pic:spPr bwMode="auto">
+                    <a:xfrm>
+                      <a:off x="0" y="0"/>
+                      <a:ext cx="2343150" cy="2343150"/>
+                    </a:xfrm>
+                    <a:prstGeom prst="rect">
+                      <a:avLst/>
+                    </a:prstGeom>
+                    <a:noFill/>
+                    <a:ln>
+                      <a:noFill/>
+                    </a:ln>
+                  </pic:spPr>
+                </pic:pic>
+              </a:graphicData>
+            </a:graphic>
+          </wp:inline>
+        </w:drawing>
+      </w:r>
+    </w:p>
+    <w:p>
+      <w:pPr>
+        <w:pStyle w:val="Caption"/>
+        <w:rPr>
+          <w:lang w:val="en-SI"/>
+        </w:rPr>
+      </w:pPr>
+      <w:r>
+        <w:t xml:space="preserve">Slika </w:t>
+      </w:r>
+      <w:r>
+        <w:fldChar w:fldCharType="begin"/>
+      </w:r>
+      <w:r>
+        <w:instrText xml:space="preserve"> SEQ Slika \* ARABIC </w:instrText>
+      </w:r>
+      <w:r>
+        <w:fldChar w:fldCharType="separate"/>
+      </w:r>
+      <w:r>
+        <w:rPr>
+          <w:noProof/>
+        </w:rPr>
+        <w:t>2</w:t>
+      </w:r>
+      <w:r>
+        <w:fldChar w:fldCharType="end"/>
+      </w:r>
+      <w:r>
+        <w:t xml:space="preserve"> Podoba višinskega</w:t>
+      </w:r>
+      <w:r>
+        <w:rPr>
+          <w:noProof/>
+        </w:rPr>
+        <w:t xml:space="preserve"> zemljevida</w:t>
+      </w:r>
+    </w:p>
+    <w:p>
+      <w:pPr>
+        <w:rPr>
+          <w:lang w:val="en-SI"/>
+        </w:rPr>
+      </w:pPr>
+    </w:p>
     <w:p/>
     <w:sectPr>
-      <w:headerReference w:type="default" r:id="rId9"/>
-      <w:footerReference w:type="default" r:id="rId10"/>
-      <w:headerReference w:type="first" r:id="rId11"/>
-      <w:footerReference w:type="first" r:id="rId12"/>
+      <w:headerReference w:type="default" r:id="rId11"/>
+      <w:footerReference w:type="default" r:id="rId12"/>
+      <w:headerReference w:type="first" r:id="rId13"/>
+      <w:footerReference w:type="first" r:id="rId14"/>
       <w:pgSz w:w="12240" w:h="15840"/>
       <w:pgMar w:top="1440" w:right="1440" w:bottom="1440" w:left="1440" w:header="720" w:footer="720" w:gutter="0"/>
       <w:cols w:space="720"/>
@@ -2206,6 +2340,7 @@
     <w:name w:val="heading 1"/>
     <w:basedOn w:val="Normal"/>
     <w:next w:val="Normal"/>
+    <w:link w:val="Heading1Char"/>
     <w:uiPriority w:val="9"/>
     <w:qFormat/>
     <w:rsid w:val="00527B6B"/>
@@ -2261,7 +2396,6 @@
   <w:style w:type="character" w:default="1" w:styleId="DefaultParagraphFont">
     <w:name w:val="Default Paragraph Font"/>
     <w:uiPriority w:val="1"/>
-    <w:semiHidden/>
     <w:unhideWhenUsed/>
   </w:style>
   <w:style w:type="table" w:default="1" w:styleId="TableNormal">
@@ -2407,6 +2541,106 @@
       <w:spacing w:after="100"/>
       <w:ind w:left="240"/>
     </w:pPr>
+  </w:style>
+  <w:style w:type="paragraph" w:styleId="TOCHeading">
+    <w:name w:val="TOC Heading"/>
+    <w:basedOn w:val="Heading1"/>
+    <w:next w:val="Normal"/>
+    <w:uiPriority w:val="39"/>
+    <w:unhideWhenUsed/>
+    <w:qFormat/>
+    <w:rsid w:val="0073597F"/>
+    <w:pPr>
+      <w:spacing w:before="240" w:after="0" w:line="259" w:lineRule="auto"/>
+      <w:jc w:val="left"/>
+      <w:outlineLvl w:val="9"/>
+    </w:pPr>
+    <w:rPr>
+      <w:rFonts w:asciiTheme="majorHAnsi" w:eastAsiaTheme="majorEastAsia" w:hAnsiTheme="majorHAnsi" w:cstheme="majorBidi"/>
+      <w:color w:val="0F4761" w:themeColor="accent1" w:themeShade="BF"/>
+      <w:sz w:val="32"/>
+      <w:szCs w:val="32"/>
+      <w:lang w:val="en-US" w:eastAsia="en-US"/>
+    </w:rPr>
+  </w:style>
+  <w:style w:type="paragraph" w:styleId="TOC3">
+    <w:name w:val="toc 3"/>
+    <w:basedOn w:val="Normal"/>
+    <w:next w:val="Normal"/>
+    <w:autoRedefine/>
+    <w:uiPriority w:val="39"/>
+    <w:unhideWhenUsed/>
+    <w:rsid w:val="0073597F"/>
+    <w:pPr>
+      <w:spacing w:after="100" w:line="259" w:lineRule="auto"/>
+      <w:ind w:left="440"/>
+      <w:jc w:val="left"/>
+    </w:pPr>
+    <w:rPr>
+      <w:rFonts w:asciiTheme="minorHAnsi" w:eastAsiaTheme="minorEastAsia" w:hAnsiTheme="minorHAnsi" w:cs="Times New Roman"/>
+      <w:color w:val="auto"/>
+      <w:sz w:val="22"/>
+      <w:szCs w:val="22"/>
+      <w:lang w:val="en-US" w:eastAsia="en-US"/>
+    </w:rPr>
+  </w:style>
+  <w:style w:type="paragraph" w:customStyle="1" w:styleId="SummaryHeading">
+    <w:name w:val="Summary Heading"/>
+    <w:basedOn w:val="Normal"/>
+    <w:next w:val="Normal"/>
+    <w:link w:val="SummaryHeadingChar"/>
+    <w:qFormat/>
+    <w:rsid w:val="001727DA"/>
+    <w:rPr>
+      <w:sz w:val="48"/>
+      <w:szCs w:val="48"/>
+    </w:rPr>
+  </w:style>
+  <w:style w:type="character" w:customStyle="1" w:styleId="Heading1Char">
+    <w:name w:val="Heading 1 Char"/>
+    <w:basedOn w:val="DefaultParagraphFont"/>
+    <w:link w:val="Heading1"/>
+    <w:uiPriority w:val="9"/>
+    <w:rsid w:val="0073597F"/>
+    <w:rPr>
+      <w:rFonts w:ascii="Arial" w:hAnsi="Arial" w:cs="Arial"/>
+      <w:color w:val="000000" w:themeColor="text1"/>
+      <w:sz w:val="48"/>
+      <w:szCs w:val="48"/>
+      <w:lang w:val="sl"/>
+    </w:rPr>
+  </w:style>
+  <w:style w:type="character" w:customStyle="1" w:styleId="SummaryHeadingChar">
+    <w:name w:val="Summary Heading Char"/>
+    <w:basedOn w:val="Heading1Char"/>
+    <w:link w:val="SummaryHeading"/>
+    <w:rsid w:val="001727DA"/>
+    <w:rPr>
+      <w:rFonts w:ascii="Arial" w:eastAsia="Arial" w:hAnsi="Arial" w:cs="Arial"/>
+      <w:color w:val="000000" w:themeColor="text1"/>
+      <w:sz w:val="48"/>
+      <w:szCs w:val="48"/>
+      <w:lang w:val="sl"/>
+    </w:rPr>
+  </w:style>
+  <w:style w:type="paragraph" w:styleId="Caption">
+    <w:name w:val="caption"/>
+    <w:basedOn w:val="Normal"/>
+    <w:next w:val="Normal"/>
+    <w:uiPriority w:val="35"/>
+    <w:unhideWhenUsed/>
+    <w:qFormat/>
+    <w:rsid w:val="001D7B2D"/>
+    <w:pPr>
+      <w:spacing w:after="200" w:line="240" w:lineRule="auto"/>
+    </w:pPr>
+    <w:rPr>
+      <w:i/>
+      <w:iCs/>
+      <w:color w:val="0E2841" w:themeColor="text2"/>
+      <w:sz w:val="18"/>
+      <w:szCs w:val="18"/>
+    </w:rPr>
   </w:style>
 </w:styles>
 </file>

</xml_diff>

<commit_message>
Report - Urejevalnik in vizualizacija Konstrukcija modela
</commit_message>
<xml_diff>
--- a/Strokovno Porocilo.docx
+++ b/Strokovno Porocilo.docx
@@ -254,7 +254,7 @@
       <w:bookmarkStart w:id="6" w:name="_Toc1038483689"/>
       <w:bookmarkStart w:id="7" w:name="_Toc226486565"/>
       <w:bookmarkStart w:id="8" w:name="_Toc226486628"/>
-      <w:bookmarkStart w:id="9" w:name="_Toc226487773"/>
+      <w:bookmarkStart w:id="9" w:name="_Toc226573114"/>
       <w:r>
         <w:rPr>
           <w:rFonts w:eastAsia="Arial"/>
@@ -269,6 +269,13 @@
     </w:p>
     <w:sdt>
       <w:sdtPr>
+        <w:rPr>
+          <w:rFonts w:ascii="Arial" w:eastAsia="Arial" w:hAnsi="Arial" w:cs="Arial"/>
+          <w:color w:val="000000" w:themeColor="text1"/>
+          <w:sz w:val="24"/>
+          <w:szCs w:val="24"/>
+          <w:lang w:val="sl" w:eastAsia="ja-JP"/>
+        </w:rPr>
         <w:id w:val="1033764718"/>
         <w:docPartObj>
           <w:docPartGallery w:val="Table of Contents"/>
@@ -277,14 +284,9 @@
       </w:sdtPr>
       <w:sdtEndPr>
         <w:rPr>
-          <w:rFonts w:ascii="Arial" w:eastAsia="Arial" w:hAnsi="Arial" w:cs="Arial"/>
           <w:b/>
           <w:bCs/>
           <w:noProof/>
-          <w:color w:val="000000" w:themeColor="text1"/>
-          <w:sz w:val="24"/>
-          <w:szCs w:val="24"/>
-          <w:lang w:val="sl" w:eastAsia="ja-JP"/>
         </w:rPr>
       </w:sdtEndPr>
       <w:sdtContent>
@@ -317,7 +319,7 @@
           <w:r>
             <w:fldChar w:fldCharType="separate"/>
           </w:r>
-          <w:hyperlink w:anchor="_Toc226487773" w:history="1">
+          <w:hyperlink w:anchor="_Toc226573114" w:history="1">
             <w:r>
               <w:rPr>
                 <w:rStyle w:val="Hyperlink"/>
@@ -344,7 +346,7 @@
                 <w:noProof/>
                 <w:webHidden/>
               </w:rPr>
-              <w:instrText xml:space="preserve"> PAGEREF _Toc226487773 \h </w:instrText>
+              <w:instrText xml:space="preserve"> PAGEREF _Toc226573114 \h </w:instrText>
             </w:r>
             <w:r>
               <w:rPr>
@@ -390,7 +392,7 @@
               <w14:ligatures w14:val="standardContextual"/>
             </w:rPr>
           </w:pPr>
-          <w:hyperlink w:anchor="_Toc226487774" w:history="1">
+          <w:hyperlink w:anchor="_Toc226573115" w:history="1">
             <w:r>
               <w:rPr>
                 <w:rStyle w:val="Hyperlink"/>
@@ -417,7 +419,7 @@
                 <w:noProof/>
                 <w:webHidden/>
               </w:rPr>
-              <w:instrText xml:space="preserve"> PAGEREF _Toc226487774 \h </w:instrText>
+              <w:instrText xml:space="preserve"> PAGEREF _Toc226573115 \h </w:instrText>
             </w:r>
             <w:r>
               <w:rPr>
@@ -463,7 +465,7 @@
               <w14:ligatures w14:val="standardContextual"/>
             </w:rPr>
           </w:pPr>
-          <w:hyperlink w:anchor="_Toc226487775" w:history="1">
+          <w:hyperlink w:anchor="_Toc226573116" w:history="1">
             <w:r>
               <w:rPr>
                 <w:rStyle w:val="Hyperlink"/>
@@ -490,7 +492,7 @@
                 <w:noProof/>
                 <w:webHidden/>
               </w:rPr>
-              <w:instrText xml:space="preserve"> PAGEREF _Toc226487775 \h </w:instrText>
+              <w:instrText xml:space="preserve"> PAGEREF _Toc226573116 \h </w:instrText>
             </w:r>
             <w:r>
               <w:rPr>
@@ -536,7 +538,7 @@
               <w14:ligatures w14:val="standardContextual"/>
             </w:rPr>
           </w:pPr>
-          <w:hyperlink w:anchor="_Toc226487776" w:history="1">
+          <w:hyperlink w:anchor="_Toc226573117" w:history="1">
             <w:r>
               <w:rPr>
                 <w:rStyle w:val="Hyperlink"/>
@@ -563,7 +565,7 @@
                 <w:noProof/>
                 <w:webHidden/>
               </w:rPr>
-              <w:instrText xml:space="preserve"> PAGEREF _Toc226487776 \h </w:instrText>
+              <w:instrText xml:space="preserve"> PAGEREF _Toc226573117 \h </w:instrText>
             </w:r>
             <w:r>
               <w:rPr>
@@ -584,6 +586,153 @@
                 <w:webHidden/>
               </w:rPr>
               <w:t>5</w:t>
+            </w:r>
+            <w:r>
+              <w:rPr>
+                <w:noProof/>
+                <w:webHidden/>
+              </w:rPr>
+              <w:fldChar w:fldCharType="end"/>
+            </w:r>
+          </w:hyperlink>
+        </w:p>
+        <w:p>
+          <w:pPr>
+            <w:pStyle w:val="TOC1"/>
+            <w:tabs>
+              <w:tab w:val="right" w:leader="dot" w:pos="9350"/>
+            </w:tabs>
+            <w:rPr>
+              <w:rFonts w:asciiTheme="minorHAnsi" w:eastAsiaTheme="minorEastAsia" w:hAnsiTheme="minorHAnsi" w:cstheme="minorBidi"/>
+              <w:noProof/>
+              <w:color w:val="auto"/>
+              <w:kern w:val="2"/>
+              <w:lang w:val="en-SI" w:eastAsia="en-SI"/>
+              <w14:ligatures w14:val="standardContextual"/>
+            </w:rPr>
+          </w:pPr>
+          <w:hyperlink w:anchor="_Toc226573118" w:history="1">
+            <w:r>
+              <w:rPr>
+                <w:rStyle w:val="Hyperlink"/>
+                <w:noProof/>
+                <w:lang w:val="en-SI"/>
+              </w:rPr>
+              <w:t>4. Urejevalnik in vizualizacija</w:t>
+            </w:r>
+            <w:r>
+              <w:rPr>
+                <w:noProof/>
+                <w:webHidden/>
+              </w:rPr>
+              <w:tab/>
+            </w:r>
+            <w:r>
+              <w:rPr>
+                <w:noProof/>
+                <w:webHidden/>
+              </w:rPr>
+              <w:fldChar w:fldCharType="begin"/>
+            </w:r>
+            <w:r>
+              <w:rPr>
+                <w:noProof/>
+                <w:webHidden/>
+              </w:rPr>
+              <w:instrText xml:space="preserve"> PAGEREF _Toc226573118 \h </w:instrText>
+            </w:r>
+            <w:r>
+              <w:rPr>
+                <w:noProof/>
+                <w:webHidden/>
+              </w:rPr>
+            </w:r>
+            <w:r>
+              <w:rPr>
+                <w:noProof/>
+                <w:webHidden/>
+              </w:rPr>
+              <w:fldChar w:fldCharType="separate"/>
+            </w:r>
+            <w:r>
+              <w:rPr>
+                <w:noProof/>
+                <w:webHidden/>
+              </w:rPr>
+              <w:t>6</w:t>
+            </w:r>
+            <w:r>
+              <w:rPr>
+                <w:noProof/>
+                <w:webHidden/>
+              </w:rPr>
+              <w:fldChar w:fldCharType="end"/>
+            </w:r>
+          </w:hyperlink>
+        </w:p>
+        <w:p>
+          <w:pPr>
+            <w:pStyle w:val="TOC2"/>
+            <w:tabs>
+              <w:tab w:val="right" w:leader="dot" w:pos="9350"/>
+            </w:tabs>
+            <w:rPr>
+              <w:rFonts w:asciiTheme="minorHAnsi" w:eastAsiaTheme="minorEastAsia" w:hAnsiTheme="minorHAnsi" w:cstheme="minorBidi"/>
+              <w:noProof/>
+              <w:color w:val="auto"/>
+              <w:kern w:val="2"/>
+              <w:lang w:val="en-SI" w:eastAsia="en-SI"/>
+              <w14:ligatures w14:val="standardContextual"/>
+            </w:rPr>
+          </w:pPr>
+          <w:hyperlink w:anchor="_Toc226573119" w:history="1">
+            <w:r>
+              <w:rPr>
+                <w:rStyle w:val="Hyperlink"/>
+                <w:noProof/>
+              </w:rPr>
+              <w:t>4. 1. Konstrukcija modela</w:t>
+            </w:r>
+            <w:r>
+              <w:rPr>
+                <w:noProof/>
+                <w:webHidden/>
+              </w:rPr>
+              <w:tab/>
+            </w:r>
+            <w:r>
+              <w:rPr>
+                <w:noProof/>
+                <w:webHidden/>
+              </w:rPr>
+              <w:fldChar w:fldCharType="begin"/>
+            </w:r>
+            <w:r>
+              <w:rPr>
+                <w:noProof/>
+                <w:webHidden/>
+              </w:rPr>
+              <w:instrText xml:space="preserve"> PAGEREF _Toc226573119 \h </w:instrText>
+            </w:r>
+            <w:r>
+              <w:rPr>
+                <w:noProof/>
+                <w:webHidden/>
+              </w:rPr>
+            </w:r>
+            <w:r>
+              <w:rPr>
+                <w:noProof/>
+                <w:webHidden/>
+              </w:rPr>
+              <w:fldChar w:fldCharType="separate"/>
+            </w:r>
+            <w:r>
+              <w:rPr>
+                <w:noProof/>
+                <w:webHidden/>
+              </w:rPr>
+              <w:t>6</w:t>
             </w:r>
             <w:r>
               <w:rPr>
@@ -625,7 +774,7 @@
       </w:pPr>
       <w:bookmarkStart w:id="10" w:name="_Toc226486566"/>
       <w:bookmarkStart w:id="11" w:name="_Toc226486629"/>
-      <w:bookmarkStart w:id="12" w:name="_Toc226487774"/>
+      <w:bookmarkStart w:id="12" w:name="_Toc226573115"/>
       <w:r>
         <w:lastRenderedPageBreak/>
         <w:t>1. Uvod</w:t>
@@ -719,7 +868,7 @@
       </w:pPr>
       <w:bookmarkStart w:id="13" w:name="_Toc226486567"/>
       <w:bookmarkStart w:id="14" w:name="_Toc226486630"/>
-      <w:bookmarkStart w:id="15" w:name="_Toc226487775"/>
+      <w:bookmarkStart w:id="15" w:name="_Toc226573116"/>
       <w:r>
         <w:t>2. Izbira orodij in programskih jezikov</w:t>
       </w:r>
@@ -881,7 +1030,7 @@
       </w:pPr>
       <w:bookmarkStart w:id="16" w:name="_Toc226486568"/>
       <w:bookmarkStart w:id="17" w:name="_Toc226486631"/>
-      <w:bookmarkStart w:id="18" w:name="_Toc226487776"/>
+      <w:bookmarkStart w:id="18" w:name="_Toc226573117"/>
       <w:r>
         <w:lastRenderedPageBreak/>
         <w:t>3. O aplikaciji</w:t>
@@ -954,6 +1103,9 @@
     </w:p>
     <w:p>
       <w:r>
+        <w:rPr>
+          <w:noProof/>
+        </w:rPr>
         <w:drawing>
           <wp:inline distT="0" distB="0" distL="0" distR="0" wp14:anchorId="290F0989" wp14:editId="2AB47EC6">
             <wp:extent cx="3340189" cy="2190750"/>
@@ -1023,6 +1175,7 @@
     <w:p>
       <w:r>
         <w:rPr>
+          <w:noProof/>
           <w:lang w:val="en-SI"/>
         </w:rPr>
         <w:drawing>
@@ -1115,17 +1268,205 @@
     </w:p>
     <w:p>
       <w:pPr>
+        <w:pStyle w:val="Heading1"/>
         <w:rPr>
           <w:lang w:val="en-SI"/>
         </w:rPr>
       </w:pPr>
+      <w:bookmarkStart w:id="19" w:name="_Toc226573118"/>
+      <w:r>
+        <w:rPr>
+          <w:lang w:val="en-SI"/>
+        </w:rPr>
+        <w:lastRenderedPageBreak/>
+        <w:t xml:space="preserve">4. </w:t>
+      </w:r>
+      <w:proofErr w:type="spellStart"/>
+      <w:r>
+        <w:rPr>
+          <w:lang w:val="en-SI"/>
+        </w:rPr>
+        <w:t>Urejevalnik</w:t>
+      </w:r>
+      <w:proofErr w:type="spellEnd"/>
+      <w:r>
+        <w:rPr>
+          <w:lang w:val="en-SI"/>
+        </w:rPr>
+        <w:t xml:space="preserve"> in </w:t>
+      </w:r>
+      <w:proofErr w:type="spellStart"/>
+      <w:r>
+        <w:rPr>
+          <w:lang w:val="en-SI"/>
+        </w:rPr>
+        <w:t>vizualizacija</w:t>
+      </w:r>
+      <w:bookmarkEnd w:id="19"/>
+      <w:proofErr w:type="spellEnd"/>
+    </w:p>
+    <w:p/>
+    <w:p>
+      <w:r>
+        <w:t>Aplikacija je razdeljena na urejevalnik</w:t>
+      </w:r>
+      <w:r>
+        <w:t xml:space="preserve"> </w:t>
+      </w:r>
+      <w:r>
+        <w:t xml:space="preserve">in na okno za 3D vizualizacijo. </w:t>
+      </w:r>
+      <w:r>
+        <w:t>V tem poglavju je podrobneje opisano delovanje obeh.</w:t>
+      </w:r>
+    </w:p>
+    <w:p/>
+    <w:p>
+      <w:pPr>
+        <w:pStyle w:val="Heading2"/>
+      </w:pPr>
+      <w:bookmarkStart w:id="20" w:name="_Toc226573119"/>
+      <w:r>
+        <w:t>4. 1. Konstrukcija modela</w:t>
+      </w:r>
+      <w:bookmarkEnd w:id="20"/>
+    </w:p>
+    <w:p/>
+    <w:p>
+      <w:r>
+        <w:t>3D modeli so običajno sestavljeni iz trikotnikov, ki jih računalnik prikaže kot celoten model. Te so narejeni iz oglišč in povezav med njimi (index). Omenjena oglišča</w:t>
+      </w:r>
+      <w:r>
+        <w:t xml:space="preserve"> oziroma </w:t>
+      </w:r>
+      <w:r>
+        <w:t>stičišč</w:t>
+      </w:r>
+      <w:r>
+        <w:t>a</w:t>
+      </w:r>
+      <w:r>
+        <w:t xml:space="preserve"> (ang. vertex, množina vertices) so točke v prostoru, kjer se srečata dve ali več črt oziroma robov. Povezave med njimi (ang. index, množina indices) so trikotniki sestavljeni iz skupin treh oglišč, saj te ustvarijo trikotno ploskev.</w:t>
+      </w:r>
+    </w:p>
+    <w:p>
+      <w:r>
+        <w:t>Da programsko ustvarimo model terena, je potrebno definirati oglišča glede na koordinate trenutne točke v terenu. Ker je teren definiran kot mreža vrednosti lahko vsako polje v mreži deluje kot oglišče, in njegova vrednost kot višina tega oglišča. Te povežemo med sabo v skupine</w:t>
+      </w:r>
+      <w:r>
+        <w:t xml:space="preserve"> po 3.</w:t>
+      </w:r>
+      <w:r>
+        <w:t xml:space="preserve"> </w:t>
+      </w:r>
+      <w:r>
+        <w:t>V</w:t>
+      </w:r>
+      <w:r>
+        <w:t>eč trikotnikov skupaj ustvari 3D model.</w:t>
+      </w:r>
+    </w:p>
+    <w:p>
+      <w:pPr>
+        <w:keepNext/>
+      </w:pPr>
+      <w:r>
+        <w:rPr>
+          <w:noProof/>
+        </w:rPr>
+        <w:drawing>
+          <wp:inline distT="0" distB="0" distL="0" distR="0" wp14:anchorId="08BD6133" wp14:editId="73F6EA94">
+            <wp:extent cx="2581275" cy="2800350"/>
+            <wp:effectExtent l="0" t="0" r="9525" b="0"/>
+            <wp:docPr id="627502077" name="Picture 1" descr="Quad with vertex and index buffers"/>
+            <wp:cNvGraphicFramePr>
+              <a:graphicFrameLocks xmlns:a="http://schemas.openxmlformats.org/drawingml/2006/main" noChangeAspect="1"/>
+            </wp:cNvGraphicFramePr>
+            <a:graphic xmlns:a="http://schemas.openxmlformats.org/drawingml/2006/main">
+              <a:graphicData uri="http://schemas.openxmlformats.org/drawingml/2006/picture">
+                <pic:pic xmlns:pic="http://schemas.openxmlformats.org/drawingml/2006/picture">
+                  <pic:nvPicPr>
+                    <pic:cNvPr id="0" name="Picture 1" descr="Quad with vertex and index buffers"/>
+                    <pic:cNvPicPr>
+                      <a:picLocks noChangeAspect="1" noChangeArrowheads="1"/>
+                    </pic:cNvPicPr>
+                  </pic:nvPicPr>
+                  <pic:blipFill>
+                    <a:blip r:embed="rId11">
+                      <a:extLst>
+                        <a:ext uri="{28A0092B-C50C-407E-A947-70E740481C1C}">
+                          <a14:useLocalDpi xmlns:a14="http://schemas.microsoft.com/office/drawing/2010/main" val="0"/>
+                        </a:ext>
+                      </a:extLst>
+                    </a:blip>
+                    <a:srcRect/>
+                    <a:stretch>
+                      <a:fillRect/>
+                    </a:stretch>
+                  </pic:blipFill>
+                  <pic:spPr bwMode="auto">
+                    <a:xfrm>
+                      <a:off x="0" y="0"/>
+                      <a:ext cx="2581275" cy="2800350"/>
+                    </a:xfrm>
+                    <a:prstGeom prst="rect">
+                      <a:avLst/>
+                    </a:prstGeom>
+                    <a:noFill/>
+                    <a:ln>
+                      <a:noFill/>
+                    </a:ln>
+                  </pic:spPr>
+                </pic:pic>
+              </a:graphicData>
+            </a:graphic>
+          </wp:inline>
+        </w:drawing>
+      </w:r>
+    </w:p>
+    <w:p>
+      <w:pPr>
+        <w:pStyle w:val="Caption"/>
+      </w:pPr>
+      <w:r>
+        <w:t xml:space="preserve">Slika </w:t>
+      </w:r>
+      <w:r>
+        <w:fldChar w:fldCharType="begin"/>
+      </w:r>
+      <w:r>
+        <w:instrText xml:space="preserve"> SEQ Slika \* ARABIC </w:instrText>
+      </w:r>
+      <w:r>
+        <w:fldChar w:fldCharType="separate"/>
+      </w:r>
+      <w:r>
+        <w:rPr>
+          <w:noProof/>
+        </w:rPr>
+        <w:t>3</w:t>
+      </w:r>
+      <w:r>
+        <w:fldChar w:fldCharType="end"/>
+      </w:r>
+      <w:r>
+        <w:t xml:space="preserve"> Primer sestavljanja modela</w:t>
+      </w:r>
+    </w:p>
+    <w:p>
+      <w:pPr>
+        <w:jc w:val="left"/>
+      </w:pPr>
+      <w:r>
+        <w:br w:type="page"/>
+      </w:r>
     </w:p>
     <w:p/>
     <w:sectPr>
-      <w:headerReference w:type="default" r:id="rId11"/>
-      <w:footerReference w:type="default" r:id="rId12"/>
-      <w:headerReference w:type="first" r:id="rId13"/>
-      <w:footerReference w:type="first" r:id="rId14"/>
+      <w:headerReference w:type="default" r:id="rId12"/>
+      <w:footerReference w:type="default" r:id="rId13"/>
+      <w:headerReference w:type="first" r:id="rId14"/>
+      <w:footerReference w:type="first" r:id="rId15"/>
       <w:pgSz w:w="12240" w:h="15840"/>
       <w:pgMar w:top="1440" w:right="1440" w:bottom="1440" w:left="1440" w:header="720" w:footer="720" w:gutter="0"/>
       <w:cols w:space="720"/>
@@ -2396,6 +2737,7 @@
   <w:style w:type="character" w:default="1" w:styleId="DefaultParagraphFont">
     <w:name w:val="Default Paragraph Font"/>
     <w:uiPriority w:val="1"/>
+    <w:semiHidden/>
     <w:unhideWhenUsed/>
   </w:style>
   <w:style w:type="table" w:default="1" w:styleId="TableNormal">

</xml_diff>

<commit_message>
Report - 5. 1.
</commit_message>
<xml_diff>
--- a/Strokovno Porocilo.docx
+++ b/Strokovno Porocilo.docx
@@ -254,7 +254,7 @@
       <w:bookmarkStart w:id="6" w:name="_Toc1038483689"/>
       <w:bookmarkStart w:id="7" w:name="_Toc226486565"/>
       <w:bookmarkStart w:id="8" w:name="_Toc226486628"/>
-      <w:bookmarkStart w:id="9" w:name="_Toc226655208"/>
+      <w:bookmarkStart w:id="9" w:name="_Toc226744158"/>
       <w:r>
         <w:rPr>
           <w:rFonts w:eastAsia="Arial"/>
@@ -319,7 +319,7 @@
           <w:r>
             <w:fldChar w:fldCharType="separate"/>
           </w:r>
-          <w:hyperlink w:anchor="_Toc226655208" w:history="1">
+          <w:hyperlink w:anchor="_Toc226744158" w:history="1">
             <w:r>
               <w:rPr>
                 <w:rStyle w:val="Hyperlink"/>
@@ -346,7 +346,7 @@
                 <w:noProof/>
                 <w:webHidden/>
               </w:rPr>
-              <w:instrText xml:space="preserve"> PAGEREF _Toc226655208 \h </w:instrText>
+              <w:instrText xml:space="preserve"> PAGEREF _Toc226744158 \h </w:instrText>
             </w:r>
             <w:r>
               <w:rPr>
@@ -392,7 +392,7 @@
               <w14:ligatures w14:val="standardContextual"/>
             </w:rPr>
           </w:pPr>
-          <w:hyperlink w:anchor="_Toc226655209" w:history="1">
+          <w:hyperlink w:anchor="_Toc226744159" w:history="1">
             <w:r>
               <w:rPr>
                 <w:rStyle w:val="Hyperlink"/>
@@ -419,7 +419,7 @@
                 <w:noProof/>
                 <w:webHidden/>
               </w:rPr>
-              <w:instrText xml:space="preserve"> PAGEREF _Toc226655209 \h </w:instrText>
+              <w:instrText xml:space="preserve"> PAGEREF _Toc226744159 \h </w:instrText>
             </w:r>
             <w:r>
               <w:rPr>
@@ -465,7 +465,7 @@
               <w14:ligatures w14:val="standardContextual"/>
             </w:rPr>
           </w:pPr>
-          <w:hyperlink w:anchor="_Toc226655210" w:history="1">
+          <w:hyperlink w:anchor="_Toc226744160" w:history="1">
             <w:r>
               <w:rPr>
                 <w:rStyle w:val="Hyperlink"/>
@@ -492,7 +492,7 @@
                 <w:noProof/>
                 <w:webHidden/>
               </w:rPr>
-              <w:instrText xml:space="preserve"> PAGEREF _Toc226655210 \h </w:instrText>
+              <w:instrText xml:space="preserve"> PAGEREF _Toc226744160 \h </w:instrText>
             </w:r>
             <w:r>
               <w:rPr>
@@ -538,7 +538,7 @@
               <w14:ligatures w14:val="standardContextual"/>
             </w:rPr>
           </w:pPr>
-          <w:hyperlink w:anchor="_Toc226655211" w:history="1">
+          <w:hyperlink w:anchor="_Toc226744161" w:history="1">
             <w:r>
               <w:rPr>
                 <w:rStyle w:val="Hyperlink"/>
@@ -565,7 +565,7 @@
                 <w:noProof/>
                 <w:webHidden/>
               </w:rPr>
-              <w:instrText xml:space="preserve"> PAGEREF _Toc226655211 \h </w:instrText>
+              <w:instrText xml:space="preserve"> PAGEREF _Toc226744161 \h </w:instrText>
             </w:r>
             <w:r>
               <w:rPr>
@@ -611,7 +611,7 @@
               <w14:ligatures w14:val="standardContextual"/>
             </w:rPr>
           </w:pPr>
-          <w:hyperlink w:anchor="_Toc226655212" w:history="1">
+          <w:hyperlink w:anchor="_Toc226744162" w:history="1">
             <w:r>
               <w:rPr>
                 <w:rStyle w:val="Hyperlink"/>
@@ -639,7 +639,7 @@
                 <w:noProof/>
                 <w:webHidden/>
               </w:rPr>
-              <w:instrText xml:space="preserve"> PAGEREF _Toc226655212 \h </w:instrText>
+              <w:instrText xml:space="preserve"> PAGEREF _Toc226744162 \h </w:instrText>
             </w:r>
             <w:r>
               <w:rPr>
@@ -685,7 +685,7 @@
               <w14:ligatures w14:val="standardContextual"/>
             </w:rPr>
           </w:pPr>
-          <w:hyperlink w:anchor="_Toc226655213" w:history="1">
+          <w:hyperlink w:anchor="_Toc226744163" w:history="1">
             <w:r>
               <w:rPr>
                 <w:rStyle w:val="Hyperlink"/>
@@ -712,7 +712,7 @@
                 <w:noProof/>
                 <w:webHidden/>
               </w:rPr>
-              <w:instrText xml:space="preserve"> PAGEREF _Toc226655213 \h </w:instrText>
+              <w:instrText xml:space="preserve"> PAGEREF _Toc226744163 \h </w:instrText>
             </w:r>
             <w:r>
               <w:rPr>
@@ -758,7 +758,7 @@
               <w14:ligatures w14:val="standardContextual"/>
             </w:rPr>
           </w:pPr>
-          <w:hyperlink w:anchor="_Toc226655214" w:history="1">
+          <w:hyperlink w:anchor="_Toc226744164" w:history="1">
             <w:r>
               <w:rPr>
                 <w:rStyle w:val="Hyperlink"/>
@@ -785,7 +785,7 @@
                 <w:noProof/>
                 <w:webHidden/>
               </w:rPr>
-              <w:instrText xml:space="preserve"> PAGEREF _Toc226655214 \h </w:instrText>
+              <w:instrText xml:space="preserve"> PAGEREF _Toc226744164 \h </w:instrText>
             </w:r>
             <w:r>
               <w:rPr>
@@ -828,7 +828,7 @@
               <w14:ligatures w14:val="standardContextual"/>
             </w:rPr>
           </w:pPr>
-          <w:hyperlink w:anchor="_Toc226655215" w:history="1">
+          <w:hyperlink w:anchor="_Toc226744165" w:history="1">
             <w:r>
               <w:rPr>
                 <w:rStyle w:val="Hyperlink"/>
@@ -851,7 +851,7 @@
               <w:rPr>
                 <w:webHidden/>
               </w:rPr>
-              <w:instrText xml:space="preserve"> PAGEREF _Toc226655215 \h </w:instrText>
+              <w:instrText xml:space="preserve"> PAGEREF _Toc226744165 \h </w:instrText>
             </w:r>
             <w:r>
               <w:rPr>
@@ -890,7 +890,7 @@
               <w14:ligatures w14:val="standardContextual"/>
             </w:rPr>
           </w:pPr>
-          <w:hyperlink w:anchor="_Toc226655216" w:history="1">
+          <w:hyperlink w:anchor="_Toc226744166" w:history="1">
             <w:r>
               <w:rPr>
                 <w:rStyle w:val="Hyperlink"/>
@@ -913,7 +913,7 @@
               <w:rPr>
                 <w:webHidden/>
               </w:rPr>
-              <w:instrText xml:space="preserve"> PAGEREF _Toc226655216 \h </w:instrText>
+              <w:instrText xml:space="preserve"> PAGEREF _Toc226744166 \h </w:instrText>
             </w:r>
             <w:r>
               <w:rPr>
@@ -955,7 +955,7 @@
               <w14:ligatures w14:val="standardContextual"/>
             </w:rPr>
           </w:pPr>
-          <w:hyperlink w:anchor="_Toc226655217" w:history="1">
+          <w:hyperlink w:anchor="_Toc226744167" w:history="1">
             <w:r>
               <w:rPr>
                 <w:rStyle w:val="Hyperlink"/>
@@ -982,7 +982,7 @@
                 <w:noProof/>
                 <w:webHidden/>
               </w:rPr>
-              <w:instrText xml:space="preserve"> PAGEREF _Toc226655217 \h </w:instrText>
+              <w:instrText xml:space="preserve"> PAGEREF _Toc226744167 \h </w:instrText>
             </w:r>
             <w:r>
               <w:rPr>
@@ -1028,7 +1028,7 @@
               <w14:ligatures w14:val="standardContextual"/>
             </w:rPr>
           </w:pPr>
-          <w:hyperlink w:anchor="_Toc226655218" w:history="1">
+          <w:hyperlink w:anchor="_Toc226744168" w:history="1">
             <w:r>
               <w:rPr>
                 <w:rStyle w:val="Hyperlink"/>
@@ -1055,7 +1055,7 @@
                 <w:noProof/>
                 <w:webHidden/>
               </w:rPr>
-              <w:instrText xml:space="preserve"> PAGEREF _Toc226655218 \h </w:instrText>
+              <w:instrText xml:space="preserve"> PAGEREF _Toc226744168 \h </w:instrText>
             </w:r>
             <w:r>
               <w:rPr>
@@ -1117,7 +1117,7 @@
       </w:pPr>
       <w:bookmarkStart w:id="10" w:name="_Toc226486566"/>
       <w:bookmarkStart w:id="11" w:name="_Toc226486629"/>
-      <w:bookmarkStart w:id="12" w:name="_Toc226655209"/>
+      <w:bookmarkStart w:id="12" w:name="_Toc226744159"/>
       <w:r>
         <w:lastRenderedPageBreak/>
         <w:t>1. Uvod</w:t>
@@ -1211,7 +1211,7 @@
       </w:pPr>
       <w:bookmarkStart w:id="13" w:name="_Toc226486567"/>
       <w:bookmarkStart w:id="14" w:name="_Toc226486630"/>
-      <w:bookmarkStart w:id="15" w:name="_Toc226655210"/>
+      <w:bookmarkStart w:id="15" w:name="_Toc226744160"/>
       <w:r>
         <w:t>2. Izbira orodij in programskih jezikov</w:t>
       </w:r>
@@ -1373,7 +1373,7 @@
       </w:pPr>
       <w:bookmarkStart w:id="16" w:name="_Toc226486568"/>
       <w:bookmarkStart w:id="17" w:name="_Toc226486631"/>
-      <w:bookmarkStart w:id="18" w:name="_Toc226655211"/>
+      <w:bookmarkStart w:id="18" w:name="_Toc226744161"/>
       <w:r>
         <w:lastRenderedPageBreak/>
         <w:t>3. O aplikaciji</w:t>
@@ -1616,7 +1616,7 @@
           <w:lang w:val="en-SI"/>
         </w:rPr>
       </w:pPr>
-      <w:bookmarkStart w:id="19" w:name="_Toc226655212"/>
+      <w:bookmarkStart w:id="19" w:name="_Toc226744162"/>
       <w:r>
         <w:rPr>
           <w:lang w:val="en-SI"/>
@@ -1706,7 +1706,7 @@
       <w:pPr>
         <w:pStyle w:val="Heading2"/>
       </w:pPr>
-      <w:bookmarkStart w:id="20" w:name="_Toc226655213"/>
+      <w:bookmarkStart w:id="20" w:name="_Toc226744163"/>
       <w:r>
         <w:t>4. 1. Konstrukcija modela</w:t>
       </w:r>
@@ -1868,6 +1868,9 @@
         <w:keepNext/>
       </w:pPr>
       <w:r>
+        <w:rPr>
+          <w:noProof/>
+        </w:rPr>
         <w:drawing>
           <wp:inline distT="0" distB="0" distL="0" distR="0" wp14:anchorId="184214FE" wp14:editId="3A2C0FD8">
             <wp:extent cx="2705478" cy="400106"/>
@@ -1944,6 +1947,9 @@
         <w:keepNext/>
       </w:pPr>
       <w:r>
+        <w:rPr>
+          <w:noProof/>
+        </w:rPr>
         <w:drawing>
           <wp:inline distT="0" distB="0" distL="0" distR="0" wp14:anchorId="4179C6B4" wp14:editId="6B7B5F98">
             <wp:extent cx="5741087" cy="3762375"/>
@@ -2027,7 +2033,7 @@
       <w:pPr>
         <w:pStyle w:val="Heading2"/>
       </w:pPr>
-      <w:bookmarkStart w:id="21" w:name="_Toc226655214"/>
+      <w:bookmarkStart w:id="21" w:name="_Toc226744164"/>
       <w:r>
         <w:lastRenderedPageBreak/>
         <w:t xml:space="preserve">4. 2. </w:t>
@@ -2042,7 +2048,7 @@
       <w:pPr>
         <w:pStyle w:val="Heading3"/>
       </w:pPr>
-      <w:bookmarkStart w:id="22" w:name="_Toc226655215"/>
+      <w:bookmarkStart w:id="22" w:name="_Toc226744165"/>
       <w:r>
         <w:t>4. 2. 1. Kamera</w:t>
       </w:r>
@@ -2200,6 +2206,9 @@
         </mc:AlternateContent>
       </w:r>
       <w:r>
+        <w:rPr>
+          <w:noProof/>
+        </w:rPr>
         <w:drawing>
           <wp:anchor distT="0" distB="0" distL="114300" distR="114300" simplePos="0" relativeHeight="251658240" behindDoc="1" locked="0" layoutInCell="1" allowOverlap="1" wp14:anchorId="1F6AD020" wp14:editId="2C1934D2">
             <wp:simplePos x="0" y="0"/>
@@ -2298,6 +2307,9 @@
         <w:keepNext/>
       </w:pPr>
       <w:r>
+        <w:rPr>
+          <w:noProof/>
+        </w:rPr>
         <w:drawing>
           <wp:inline distT="0" distB="0" distL="0" distR="0" wp14:anchorId="264D7695" wp14:editId="3EE25878">
             <wp:extent cx="5391150" cy="2521054"/>
@@ -2397,7 +2409,7 @@
       <w:pPr>
         <w:pStyle w:val="Heading3"/>
       </w:pPr>
-      <w:bookmarkStart w:id="23" w:name="_Toc226655216"/>
+      <w:bookmarkStart w:id="23" w:name="_Toc226744166"/>
       <w:r>
         <w:t xml:space="preserve">4. 2. 2. </w:t>
       </w:r>
@@ -2431,6 +2443,9 @@
         <w:jc w:val="left"/>
       </w:pPr>
       <w:r>
+        <w:rPr>
+          <w:noProof/>
+        </w:rPr>
         <w:drawing>
           <wp:inline distT="0" distB="0" distL="0" distR="0" wp14:anchorId="59319894" wp14:editId="2772B04E">
             <wp:extent cx="3463346" cy="2733675"/>
@@ -2519,7 +2534,7 @@
       <w:pPr>
         <w:pStyle w:val="Heading2"/>
       </w:pPr>
-      <w:bookmarkStart w:id="24" w:name="_Toc226655217"/>
+      <w:bookmarkStart w:id="24" w:name="_Toc226744167"/>
       <w:r>
         <w:lastRenderedPageBreak/>
         <w:t>4. 3. Urejevalnik</w:t>
@@ -2549,6 +2564,9 @@
         <w:keepNext/>
       </w:pPr>
       <w:r>
+        <w:rPr>
+          <w:noProof/>
+        </w:rPr>
         <w:drawing>
           <wp:inline distT="0" distB="0" distL="0" distR="0" wp14:anchorId="4A75083D" wp14:editId="21025D59">
             <wp:extent cx="5010150" cy="3336353"/>
@@ -2648,7 +2666,7 @@
       <w:pPr>
         <w:pStyle w:val="Heading1"/>
       </w:pPr>
-      <w:bookmarkStart w:id="25" w:name="_Toc226655218"/>
+      <w:bookmarkStart w:id="25" w:name="_Toc226744168"/>
       <w:r>
         <w:lastRenderedPageBreak/>
         <w:t xml:space="preserve">5. </w:t>
@@ -2659,11 +2677,381 @@
       <w:bookmarkEnd w:id="25"/>
     </w:p>
     <w:p/>
+    <w:p>
+      <w:pPr>
+        <w:pStyle w:val="Heading2"/>
+      </w:pPr>
+      <w:r>
+        <w:t>5. 1.  Vozlišče (node)</w:t>
+      </w:r>
+    </w:p>
+    <w:p/>
+    <w:p>
+      <w:r>
+        <w:t>V aplikaciji je vozlišče (ali node) objekt v urejevalniku, ki ga lahko povežemo z drugimi. Vsako vozlišče generira svojo mrežo vrednosti ali pa nad tisto, ki jo dobi na svoj vhod, izvede določene operacije ali simulacije.</w:t>
+      </w:r>
+      <w:r>
+        <w:t xml:space="preserve"> </w:t>
+      </w:r>
+      <w:r>
+        <w:t>Ko skupaj povežemo več vozlišč dobimo graf, pri katerem je zadnje najbolj desno vozlišče konec grafa, kjer se izvede zadnja operacija nad terenom.</w:t>
+      </w:r>
+      <w:r>
+        <w:t xml:space="preserve"> Z povezovanjem in nastavljanjem vozlišč uporabnik ustvarja teren.</w:t>
+      </w:r>
+    </w:p>
+    <w:p>
+      <w:r>
+        <w:t>Vsaka vrsta vozlišča je svoj razred, ki deduje iz razreda EditorNode</w:t>
+      </w:r>
+      <w:r>
+        <w:t>, ki sem ga napisal kot podlago za vozlišča. Vsak izpeljan</w:t>
+      </w:r>
+      <w:r>
+        <w:t>i</w:t>
+      </w:r>
+      <w:r>
+        <w:t xml:space="preserve"> razred vsebuje enega ali več izhodov in vhodov, instanco razreda, ki </w:t>
+      </w:r>
+      <w:r>
+        <w:t>določa</w:t>
+      </w:r>
+      <w:r>
+        <w:t xml:space="preserve"> funkcionalnost vozlišča, in </w:t>
+      </w:r>
+      <w:r>
+        <w:t xml:space="preserve">nekaj grafičnih komponent. </w:t>
+      </w:r>
+      <w:r>
+        <w:t xml:space="preserve">Ko se v urejevalniku naredi nova instanca vozlišča se ta čez skripto urejevalnika registrira. V tabelo, ki vsebuje identifikatorje vozlišč se shrani identifikator novega vozlišča, da ga lahko skripte dosežejo pozneje. </w:t>
+      </w:r>
+    </w:p>
+    <w:p>
+      <w:pPr>
+        <w:keepNext/>
+      </w:pPr>
+      <w:r>
+        <w:rPr>
+          <w:noProof/>
+        </w:rPr>
+        <w:drawing>
+          <wp:inline distT="0" distB="0" distL="0" distR="0" wp14:anchorId="6D085B74" wp14:editId="726DDD38">
+            <wp:extent cx="2803585" cy="2261603"/>
+            <wp:effectExtent l="0" t="0" r="0" b="5715"/>
+            <wp:docPr id="1732348590" name="Picture 1"/>
+            <wp:cNvGraphicFramePr>
+              <a:graphicFrameLocks xmlns:a="http://schemas.openxmlformats.org/drawingml/2006/main" noChangeAspect="1"/>
+            </wp:cNvGraphicFramePr>
+            <a:graphic xmlns:a="http://schemas.openxmlformats.org/drawingml/2006/main">
+              <a:graphicData uri="http://schemas.openxmlformats.org/drawingml/2006/picture">
+                <pic:pic xmlns:pic="http://schemas.openxmlformats.org/drawingml/2006/picture">
+                  <pic:nvPicPr>
+                    <pic:cNvPr id="1732348590" name=""/>
+                    <pic:cNvPicPr/>
+                  </pic:nvPicPr>
+                  <pic:blipFill>
+                    <a:blip r:embed="rId18"/>
+                    <a:stretch>
+                      <a:fillRect/>
+                    </a:stretch>
+                  </pic:blipFill>
+                  <pic:spPr>
+                    <a:xfrm>
+                      <a:off x="0" y="0"/>
+                      <a:ext cx="2811053" cy="2267627"/>
+                    </a:xfrm>
+                    <a:prstGeom prst="rect">
+                      <a:avLst/>
+                    </a:prstGeom>
+                  </pic:spPr>
+                </pic:pic>
+              </a:graphicData>
+            </a:graphic>
+          </wp:inline>
+        </w:drawing>
+      </w:r>
+    </w:p>
+    <w:p>
+      <w:pPr>
+        <w:pStyle w:val="Caption"/>
+      </w:pPr>
+      <w:r>
+        <w:t xml:space="preserve">Slika </w:t>
+      </w:r>
+      <w:r>
+        <w:fldChar w:fldCharType="begin"/>
+      </w:r>
+      <w:r>
+        <w:instrText xml:space="preserve"> SEQ Slika \* ARABIC </w:instrText>
+      </w:r>
+      <w:r>
+        <w:fldChar w:fldCharType="separate"/>
+      </w:r>
+      <w:r>
+        <w:rPr>
+          <w:noProof/>
+        </w:rPr>
+        <w:t>10</w:t>
+      </w:r>
+      <w:r>
+        <w:fldChar w:fldCharType="end"/>
+      </w:r>
+      <w:r>
+        <w:t xml:space="preserve"> Odsek registracije vozlišč</w:t>
+      </w:r>
+    </w:p>
+    <w:p>
+      <w:r>
+        <w:t>Ko se vozlišče registrira se inicializira tudi nekaj signalov vozlišča, ki so uporabljeni za obeščanje drugih skript</w:t>
+      </w:r>
+      <w:r>
+        <w:t xml:space="preserve"> o dogajanju z instanco vozlišča</w:t>
+      </w:r>
+      <w:r>
+        <w:t xml:space="preserve">. </w:t>
+      </w:r>
+    </w:p>
+    <w:p>
+      <w:pPr>
+        <w:keepNext/>
+      </w:pPr>
+      <w:r>
+        <w:rPr>
+          <w:noProof/>
+        </w:rPr>
+        <w:lastRenderedPageBreak/>
+        <w:drawing>
+          <wp:inline distT="0" distB="0" distL="0" distR="0" wp14:anchorId="11395773" wp14:editId="58991C7B">
+            <wp:extent cx="2977286" cy="925948"/>
+            <wp:effectExtent l="0" t="0" r="0" b="7620"/>
+            <wp:docPr id="668256031" name="Picture 1"/>
+            <wp:cNvGraphicFramePr>
+              <a:graphicFrameLocks xmlns:a="http://schemas.openxmlformats.org/drawingml/2006/main" noChangeAspect="1"/>
+            </wp:cNvGraphicFramePr>
+            <a:graphic xmlns:a="http://schemas.openxmlformats.org/drawingml/2006/main">
+              <a:graphicData uri="http://schemas.openxmlformats.org/drawingml/2006/picture">
+                <pic:pic xmlns:pic="http://schemas.openxmlformats.org/drawingml/2006/picture">
+                  <pic:nvPicPr>
+                    <pic:cNvPr id="668256031" name=""/>
+                    <pic:cNvPicPr/>
+                  </pic:nvPicPr>
+                  <pic:blipFill>
+                    <a:blip r:embed="rId19"/>
+                    <a:stretch>
+                      <a:fillRect/>
+                    </a:stretch>
+                  </pic:blipFill>
+                  <pic:spPr>
+                    <a:xfrm>
+                      <a:off x="0" y="0"/>
+                      <a:ext cx="3057129" cy="950779"/>
+                    </a:xfrm>
+                    <a:prstGeom prst="rect">
+                      <a:avLst/>
+                    </a:prstGeom>
+                  </pic:spPr>
+                </pic:pic>
+              </a:graphicData>
+            </a:graphic>
+          </wp:inline>
+        </w:drawing>
+      </w:r>
+    </w:p>
+    <w:p>
+      <w:pPr>
+        <w:pStyle w:val="Caption"/>
+      </w:pPr>
+      <w:r>
+        <w:t xml:space="preserve">Slika </w:t>
+      </w:r>
+      <w:r>
+        <w:fldChar w:fldCharType="begin"/>
+      </w:r>
+      <w:r>
+        <w:instrText xml:space="preserve"> SEQ Slika \* ARABIC </w:instrText>
+      </w:r>
+      <w:r>
+        <w:fldChar w:fldCharType="separate"/>
+      </w:r>
+      <w:r>
+        <w:rPr>
+          <w:noProof/>
+        </w:rPr>
+        <w:t>11</w:t>
+      </w:r>
+      <w:r>
+        <w:fldChar w:fldCharType="end"/>
+      </w:r>
+      <w:r>
+        <w:t xml:space="preserve"> Inicializacija po registraciji</w:t>
+      </w:r>
+    </w:p>
+    <w:p>
+      <w:r>
+        <w:t xml:space="preserve">Vozlišča se da tudi izbrati s klikom na njih. Ko je vozlišče izbrano </w:t>
+      </w:r>
+      <w:r>
+        <w:t>ta obvesti korensko skripto urejevalnika, ta</w:t>
+      </w:r>
+      <w:r>
+        <w:t xml:space="preserve"> posodobi svoj zapis trenutnega izbranega vozlišča</w:t>
+      </w:r>
+      <w:r>
+        <w:t xml:space="preserve">, </w:t>
+      </w:r>
+      <w:r>
+        <w:t>ga premakne</w:t>
+      </w:r>
+      <w:r>
+        <w:t xml:space="preserve"> vrh vrstnega reda prikazovanja in prikaže</w:t>
+      </w:r>
+      <w:r>
+        <w:t xml:space="preserve"> pravilen</w:t>
+      </w:r>
+      <w:r>
+        <w:t xml:space="preserve"> inšpektor</w:t>
+      </w:r>
+      <w:r>
+        <w:t xml:space="preserve"> </w:t>
+      </w:r>
+      <w:r>
+        <w:t>(več o poglavju o inšpektorju).</w:t>
+      </w:r>
+      <w:r>
+        <w:t xml:space="preserve"> Po izbiri aktivnega vozlišča se prikaže tudi grafični element, ki nakazuje izbrano vozlišče.</w:t>
+      </w:r>
+    </w:p>
+    <w:p>
+      <w:pPr>
+        <w:keepNext/>
+      </w:pPr>
+      <w:r>
+        <w:rPr>
+          <w:noProof/>
+        </w:rPr>
+        <w:drawing>
+          <wp:inline distT="0" distB="0" distL="0" distR="0" wp14:anchorId="7D9B044A" wp14:editId="008ADB28">
+            <wp:extent cx="2961564" cy="2410700"/>
+            <wp:effectExtent l="0" t="0" r="0" b="8890"/>
+            <wp:docPr id="52233941" name="Picture 1"/>
+            <wp:cNvGraphicFramePr>
+              <a:graphicFrameLocks xmlns:a="http://schemas.openxmlformats.org/drawingml/2006/main" noChangeAspect="1"/>
+            </wp:cNvGraphicFramePr>
+            <a:graphic xmlns:a="http://schemas.openxmlformats.org/drawingml/2006/main">
+              <a:graphicData uri="http://schemas.openxmlformats.org/drawingml/2006/picture">
+                <pic:pic xmlns:pic="http://schemas.openxmlformats.org/drawingml/2006/picture">
+                  <pic:nvPicPr>
+                    <pic:cNvPr id="52233941" name=""/>
+                    <pic:cNvPicPr/>
+                  </pic:nvPicPr>
+                  <pic:blipFill>
+                    <a:blip r:embed="rId20"/>
+                    <a:stretch>
+                      <a:fillRect/>
+                    </a:stretch>
+                  </pic:blipFill>
+                  <pic:spPr>
+                    <a:xfrm>
+                      <a:off x="0" y="0"/>
+                      <a:ext cx="2970201" cy="2417730"/>
+                    </a:xfrm>
+                    <a:prstGeom prst="rect">
+                      <a:avLst/>
+                    </a:prstGeom>
+                  </pic:spPr>
+                </pic:pic>
+              </a:graphicData>
+            </a:graphic>
+          </wp:inline>
+        </w:drawing>
+      </w:r>
+    </w:p>
+    <w:p>
+      <w:pPr>
+        <w:pStyle w:val="Caption"/>
+      </w:pPr>
+      <w:r>
+        <w:t xml:space="preserve">Slika </w:t>
+      </w:r>
+      <w:r>
+        <w:fldChar w:fldCharType="begin"/>
+      </w:r>
+      <w:r>
+        <w:instrText xml:space="preserve"> SEQ Slika \* ARABIC </w:instrText>
+      </w:r>
+      <w:r>
+        <w:fldChar w:fldCharType="separate"/>
+      </w:r>
+      <w:r>
+        <w:rPr>
+          <w:noProof/>
+        </w:rPr>
+        <w:t>12</w:t>
+      </w:r>
+      <w:r>
+        <w:fldChar w:fldCharType="end"/>
+      </w:r>
+      <w:r>
+        <w:t xml:space="preserve"> Izbira aktivnega vozlišča na strani </w:t>
+      </w:r>
+      <w:r>
+        <w:rPr>
+          <w:noProof/>
+        </w:rPr>
+        <w:t>instance vozlišča</w:t>
+      </w:r>
+    </w:p>
+    <w:p>
+      <w:pPr>
+        <w:pStyle w:val="Heading2"/>
+      </w:pPr>
+      <w:r>
+        <w:t xml:space="preserve">5. 2. </w:t>
+      </w:r>
+      <w:r>
+        <w:t>Povezovanje</w:t>
+      </w:r>
+    </w:p>
+    <w:p/>
+    <w:p>
+      <w:r>
+        <w:t>Vsako vozlišče vsebuje vsaj en izhod ali vhod. Te predstavljajo konektorji, objekti, ki so uporabljeni pri povezovanju vozlišč.</w:t>
+      </w:r>
+      <w:r>
+        <w:t xml:space="preserve"> Med sabo se lahko povežejo samo konektorji nasprotne vrste (vhod - izhod), in enake kategorije. Kategorija </w:t>
+      </w:r>
+      <w:r>
+        <w:t>označuje vrsto spremenljivk v vsakem polju izhodne tabele na izhodu, npr. decimalna vrednost ali dvodimenzionalni vektor. Vsak konektor ima zato dve spremenljivki naštetega tipa (enum), ki določata vrsto in kategorijo konektorja.</w:t>
+      </w:r>
+      <w:r>
+        <w:t xml:space="preserve"> Vozlišča shranjujejo vse svoje konektorje v tabeli, in </w:t>
+      </w:r>
+      <w:r>
+        <w:t>ko potrebujejo referenco na konektor čez njo iterirajo in preverjajo identifikator konektorja.</w:t>
+      </w:r>
+    </w:p>
+    <w:p>
+      <w:pPr>
+        <w:jc w:val="left"/>
+      </w:pPr>
+      <w:r>
+        <w:br w:type="page"/>
+      </w:r>
+    </w:p>
+    <w:p>
+      <w:r>
+        <w:lastRenderedPageBreak/>
+        <w:t>Vozlišča imajo funkcije, ki vrnejo svoj identifikator ali referenco do konektorja glede na dobljeni identifikator konektorja. Čez konektorje je možno pridobiti tudi identifikator konektorja samega ali vozlišča, kateremu pripada.</w:t>
+      </w:r>
+    </w:p>
+    <w:p/>
+    <w:p/>
+    <w:p/>
     <w:sectPr>
-      <w:headerReference w:type="default" r:id="rId18"/>
-      <w:footerReference w:type="default" r:id="rId19"/>
-      <w:headerReference w:type="first" r:id="rId20"/>
-      <w:footerReference w:type="first" r:id="rId21"/>
+      <w:headerReference w:type="default" r:id="rId21"/>
+      <w:footerReference w:type="default" r:id="rId22"/>
+      <w:headerReference w:type="first" r:id="rId23"/>
+      <w:footerReference w:type="first" r:id="rId24"/>
       <w:pgSz w:w="12240" w:h="15840"/>
       <w:pgMar w:top="1440" w:right="1440" w:bottom="1440" w:left="1440" w:header="720" w:footer="720" w:gutter="0"/>
       <w:cols w:space="720"/>
@@ -4185,6 +4573,18 @@
       <w:szCs w:val="18"/>
     </w:rPr>
   </w:style>
+  <w:style w:type="character" w:styleId="UnresolvedMention">
+    <w:name w:val="Unresolved Mention"/>
+    <w:basedOn w:val="DefaultParagraphFont"/>
+    <w:uiPriority w:val="99"/>
+    <w:semiHidden/>
+    <w:unhideWhenUsed/>
+    <w:rsid w:val="00A95621"/>
+    <w:rPr>
+      <w:color w:val="605E5C"/>
+      <w:shd w:val="clear" w:color="auto" w:fill="E1DFDD"/>
+    </w:rPr>
+  </w:style>
 </w:styles>
 </file>
 

</xml_diff>

<commit_message>
Report - Teraces and other func.
</commit_message>
<xml_diff>
--- a/Strokovno Porocilo.docx
+++ b/Strokovno Porocilo.docx
@@ -261,7 +261,7 @@
       <w:bookmarkStart w:id="7" w:name="_Toc226486565"/>
       <w:bookmarkStart w:id="8" w:name="_Toc226486628"/>
       <w:bookmarkStart w:id="9" w:name="_Toc227079926"/>
-      <w:bookmarkStart w:id="10" w:name="_Toc227080011"/>
+      <w:bookmarkStart w:id="10" w:name="_Toc227092692"/>
       <w:r>
         <w:rPr>
           <w:rFonts w:eastAsia="Arial"/>
@@ -315,7 +315,7 @@
           <w:r>
             <w:fldChar w:fldCharType="separate"/>
           </w:r>
-          <w:hyperlink w:anchor="_Toc227080011" w:history="1">
+          <w:hyperlink w:anchor="_Toc227092692" w:history="1">
             <w:r>
               <w:rPr>
                 <w:rStyle w:val="Hyperlink"/>
@@ -342,7 +342,7 @@
                 <w:noProof/>
                 <w:webHidden/>
               </w:rPr>
-              <w:instrText xml:space="preserve"> PAGEREF _Toc227080011 \h </w:instrText>
+              <w:instrText xml:space="preserve"> PAGEREF _Toc227092692 \h </w:instrText>
             </w:r>
             <w:r>
               <w:rPr>
@@ -388,7 +388,7 @@
               <w14:ligatures w14:val="standardContextual"/>
             </w:rPr>
           </w:pPr>
-          <w:hyperlink w:anchor="_Toc227080012" w:history="1">
+          <w:hyperlink w:anchor="_Toc227092693" w:history="1">
             <w:r>
               <w:rPr>
                 <w:rStyle w:val="Hyperlink"/>
@@ -415,7 +415,7 @@
                 <w:noProof/>
                 <w:webHidden/>
               </w:rPr>
-              <w:instrText xml:space="preserve"> PAGEREF _Toc227080012 \h </w:instrText>
+              <w:instrText xml:space="preserve"> PAGEREF _Toc227092693 \h </w:instrText>
             </w:r>
             <w:r>
               <w:rPr>
@@ -461,7 +461,7 @@
               <w14:ligatures w14:val="standardContextual"/>
             </w:rPr>
           </w:pPr>
-          <w:hyperlink w:anchor="_Toc227080013" w:history="1">
+          <w:hyperlink w:anchor="_Toc227092694" w:history="1">
             <w:r>
               <w:rPr>
                 <w:rStyle w:val="Hyperlink"/>
@@ -488,7 +488,7 @@
                 <w:noProof/>
                 <w:webHidden/>
               </w:rPr>
-              <w:instrText xml:space="preserve"> PAGEREF _Toc227080013 \h </w:instrText>
+              <w:instrText xml:space="preserve"> PAGEREF _Toc227092694 \h </w:instrText>
             </w:r>
             <w:r>
               <w:rPr>
@@ -534,7 +534,7 @@
               <w14:ligatures w14:val="standardContextual"/>
             </w:rPr>
           </w:pPr>
-          <w:hyperlink w:anchor="_Toc227080014" w:history="1">
+          <w:hyperlink w:anchor="_Toc227092695" w:history="1">
             <w:r>
               <w:rPr>
                 <w:rStyle w:val="Hyperlink"/>
@@ -561,7 +561,7 @@
                 <w:noProof/>
                 <w:webHidden/>
               </w:rPr>
-              <w:instrText xml:space="preserve"> PAGEREF _Toc227080014 \h </w:instrText>
+              <w:instrText xml:space="preserve"> PAGEREF _Toc227092695 \h </w:instrText>
             </w:r>
             <w:r>
               <w:rPr>
@@ -607,7 +607,7 @@
               <w14:ligatures w14:val="standardContextual"/>
             </w:rPr>
           </w:pPr>
-          <w:hyperlink w:anchor="_Toc227080015" w:history="1">
+          <w:hyperlink w:anchor="_Toc227092696" w:history="1">
             <w:r>
               <w:rPr>
                 <w:rStyle w:val="Hyperlink"/>
@@ -634,7 +634,7 @@
                 <w:noProof/>
                 <w:webHidden/>
               </w:rPr>
-              <w:instrText xml:space="preserve"> PAGEREF _Toc227080015 \h </w:instrText>
+              <w:instrText xml:space="preserve"> PAGEREF _Toc227092696 \h </w:instrText>
             </w:r>
             <w:r>
               <w:rPr>
@@ -680,7 +680,7 @@
               <w14:ligatures w14:val="standardContextual"/>
             </w:rPr>
           </w:pPr>
-          <w:hyperlink w:anchor="_Toc227080016" w:history="1">
+          <w:hyperlink w:anchor="_Toc227092697" w:history="1">
             <w:r>
               <w:rPr>
                 <w:rStyle w:val="Hyperlink"/>
@@ -707,7 +707,7 @@
                 <w:noProof/>
                 <w:webHidden/>
               </w:rPr>
-              <w:instrText xml:space="preserve"> PAGEREF _Toc227080016 \h </w:instrText>
+              <w:instrText xml:space="preserve"> PAGEREF _Toc227092697 \h </w:instrText>
             </w:r>
             <w:r>
               <w:rPr>
@@ -753,7 +753,7 @@
               <w14:ligatures w14:val="standardContextual"/>
             </w:rPr>
           </w:pPr>
-          <w:hyperlink w:anchor="_Toc227080017" w:history="1">
+          <w:hyperlink w:anchor="_Toc227092698" w:history="1">
             <w:r>
               <w:rPr>
                 <w:rStyle w:val="Hyperlink"/>
@@ -780,7 +780,7 @@
                 <w:noProof/>
                 <w:webHidden/>
               </w:rPr>
-              <w:instrText xml:space="preserve"> PAGEREF _Toc227080017 \h </w:instrText>
+              <w:instrText xml:space="preserve"> PAGEREF _Toc227092698 \h </w:instrText>
             </w:r>
             <w:r>
               <w:rPr>
@@ -826,7 +826,7 @@
               <w14:ligatures w14:val="standardContextual"/>
             </w:rPr>
           </w:pPr>
-          <w:hyperlink w:anchor="_Toc227080018" w:history="1">
+          <w:hyperlink w:anchor="_Toc227092699" w:history="1">
             <w:r>
               <w:rPr>
                 <w:rStyle w:val="Hyperlink"/>
@@ -853,7 +853,7 @@
                 <w:noProof/>
                 <w:webHidden/>
               </w:rPr>
-              <w:instrText xml:space="preserve"> PAGEREF _Toc227080018 \h </w:instrText>
+              <w:instrText xml:space="preserve"> PAGEREF _Toc227092699 \h </w:instrText>
             </w:r>
             <w:r>
               <w:rPr>
@@ -896,7 +896,7 @@
               <w14:ligatures w14:val="standardContextual"/>
             </w:rPr>
           </w:pPr>
-          <w:hyperlink w:anchor="_Toc227080019" w:history="1">
+          <w:hyperlink w:anchor="_Toc227092700" w:history="1">
             <w:r>
               <w:rPr>
                 <w:rStyle w:val="Hyperlink"/>
@@ -919,7 +919,7 @@
               <w:rPr>
                 <w:webHidden/>
               </w:rPr>
-              <w:instrText xml:space="preserve"> PAGEREF _Toc227080019 \h </w:instrText>
+              <w:instrText xml:space="preserve"> PAGEREF _Toc227092700 \h </w:instrText>
             </w:r>
             <w:r>
               <w:rPr>
@@ -958,7 +958,7 @@
               <w14:ligatures w14:val="standardContextual"/>
             </w:rPr>
           </w:pPr>
-          <w:hyperlink w:anchor="_Toc227080020" w:history="1">
+          <w:hyperlink w:anchor="_Toc227092701" w:history="1">
             <w:r>
               <w:rPr>
                 <w:rStyle w:val="Hyperlink"/>
@@ -981,7 +981,7 @@
               <w:rPr>
                 <w:webHidden/>
               </w:rPr>
-              <w:instrText xml:space="preserve"> PAGEREF _Toc227080020 \h </w:instrText>
+              <w:instrText xml:space="preserve"> PAGEREF _Toc227092701 \h </w:instrText>
             </w:r>
             <w:r>
               <w:rPr>
@@ -1023,7 +1023,7 @@
               <w14:ligatures w14:val="standardContextual"/>
             </w:rPr>
           </w:pPr>
-          <w:hyperlink w:anchor="_Toc227080021" w:history="1">
+          <w:hyperlink w:anchor="_Toc227092702" w:history="1">
             <w:r>
               <w:rPr>
                 <w:rStyle w:val="Hyperlink"/>
@@ -1050,7 +1050,7 @@
                 <w:noProof/>
                 <w:webHidden/>
               </w:rPr>
-              <w:instrText xml:space="preserve"> PAGEREF _Toc227080021 \h </w:instrText>
+              <w:instrText xml:space="preserve"> PAGEREF _Toc227092702 \h </w:instrText>
             </w:r>
             <w:r>
               <w:rPr>
@@ -1096,7 +1096,7 @@
               <w14:ligatures w14:val="standardContextual"/>
             </w:rPr>
           </w:pPr>
-          <w:hyperlink w:anchor="_Toc227080022" w:history="1">
+          <w:hyperlink w:anchor="_Toc227092703" w:history="1">
             <w:r>
               <w:rPr>
                 <w:rStyle w:val="Hyperlink"/>
@@ -1123,7 +1123,7 @@
                 <w:noProof/>
                 <w:webHidden/>
               </w:rPr>
-              <w:instrText xml:space="preserve"> PAGEREF _Toc227080022 \h </w:instrText>
+              <w:instrText xml:space="preserve"> PAGEREF _Toc227092703 \h </w:instrText>
             </w:r>
             <w:r>
               <w:rPr>
@@ -1169,7 +1169,7 @@
               <w14:ligatures w14:val="standardContextual"/>
             </w:rPr>
           </w:pPr>
-          <w:hyperlink w:anchor="_Toc227080023" w:history="1">
+          <w:hyperlink w:anchor="_Toc227092704" w:history="1">
             <w:r>
               <w:rPr>
                 <w:rStyle w:val="Hyperlink"/>
@@ -1196,7 +1196,7 @@
                 <w:noProof/>
                 <w:webHidden/>
               </w:rPr>
-              <w:instrText xml:space="preserve"> PAGEREF _Toc227080023 \h </w:instrText>
+              <w:instrText xml:space="preserve"> PAGEREF _Toc227092704 \h </w:instrText>
             </w:r>
             <w:r>
               <w:rPr>
@@ -1242,7 +1242,7 @@
               <w14:ligatures w14:val="standardContextual"/>
             </w:rPr>
           </w:pPr>
-          <w:hyperlink w:anchor="_Toc227080024" w:history="1">
+          <w:hyperlink w:anchor="_Toc227092705" w:history="1">
             <w:r>
               <w:rPr>
                 <w:rStyle w:val="Hyperlink"/>
@@ -1269,7 +1269,7 @@
                 <w:noProof/>
                 <w:webHidden/>
               </w:rPr>
-              <w:instrText xml:space="preserve"> PAGEREF _Toc227080024 \h </w:instrText>
+              <w:instrText xml:space="preserve"> PAGEREF _Toc227092705 \h </w:instrText>
             </w:r>
             <w:r>
               <w:rPr>
@@ -1315,7 +1315,7 @@
               <w14:ligatures w14:val="standardContextual"/>
             </w:rPr>
           </w:pPr>
-          <w:hyperlink w:anchor="_Toc227080025" w:history="1">
+          <w:hyperlink w:anchor="_Toc227092706" w:history="1">
             <w:r>
               <w:rPr>
                 <w:rStyle w:val="Hyperlink"/>
@@ -1342,7 +1342,7 @@
                 <w:noProof/>
                 <w:webHidden/>
               </w:rPr>
-              <w:instrText xml:space="preserve"> PAGEREF _Toc227080025 \h </w:instrText>
+              <w:instrText xml:space="preserve"> PAGEREF _Toc227092706 \h </w:instrText>
             </w:r>
             <w:r>
               <w:rPr>
@@ -1388,7 +1388,7 @@
               <w14:ligatures w14:val="standardContextual"/>
             </w:rPr>
           </w:pPr>
-          <w:hyperlink w:anchor="_Toc227080026" w:history="1">
+          <w:hyperlink w:anchor="_Toc227092707" w:history="1">
             <w:r>
               <w:rPr>
                 <w:rStyle w:val="Hyperlink"/>
@@ -1415,7 +1415,7 @@
                 <w:noProof/>
                 <w:webHidden/>
               </w:rPr>
-              <w:instrText xml:space="preserve"> PAGEREF _Toc227080026 \h </w:instrText>
+              <w:instrText xml:space="preserve"> PAGEREF _Toc227092707 \h </w:instrText>
             </w:r>
             <w:r>
               <w:rPr>
@@ -1461,7 +1461,7 @@
               <w14:ligatures w14:val="standardContextual"/>
             </w:rPr>
           </w:pPr>
-          <w:hyperlink w:anchor="_Toc227080027" w:history="1">
+          <w:hyperlink w:anchor="_Toc227092708" w:history="1">
             <w:r>
               <w:rPr>
                 <w:rStyle w:val="Hyperlink"/>
@@ -1488,7 +1488,7 @@
                 <w:noProof/>
                 <w:webHidden/>
               </w:rPr>
-              <w:instrText xml:space="preserve"> PAGEREF _Toc227080027 \h </w:instrText>
+              <w:instrText xml:space="preserve"> PAGEREF _Toc227092708 \h </w:instrText>
             </w:r>
             <w:r>
               <w:rPr>
@@ -1534,7 +1534,7 @@
               <w14:ligatures w14:val="standardContextual"/>
             </w:rPr>
           </w:pPr>
-          <w:hyperlink w:anchor="_Toc227080028" w:history="1">
+          <w:hyperlink w:anchor="_Toc227092709" w:history="1">
             <w:r>
               <w:rPr>
                 <w:rStyle w:val="Hyperlink"/>
@@ -1561,7 +1561,7 @@
                 <w:noProof/>
                 <w:webHidden/>
               </w:rPr>
-              <w:instrText xml:space="preserve"> PAGEREF _Toc227080028 \h </w:instrText>
+              <w:instrText xml:space="preserve"> PAGEREF _Toc227092709 \h </w:instrText>
             </w:r>
             <w:r>
               <w:rPr>
@@ -1607,7 +1607,7 @@
               <w14:ligatures w14:val="standardContextual"/>
             </w:rPr>
           </w:pPr>
-          <w:hyperlink w:anchor="_Toc227080029" w:history="1">
+          <w:hyperlink w:anchor="_Toc227092710" w:history="1">
             <w:r>
               <w:rPr>
                 <w:rStyle w:val="Hyperlink"/>
@@ -1634,7 +1634,7 @@
                 <w:noProof/>
                 <w:webHidden/>
               </w:rPr>
-              <w:instrText xml:space="preserve"> PAGEREF _Toc227080029 \h </w:instrText>
+              <w:instrText xml:space="preserve"> PAGEREF _Toc227092710 \h </w:instrText>
             </w:r>
             <w:r>
               <w:rPr>
@@ -1680,7 +1680,7 @@
               <w14:ligatures w14:val="standardContextual"/>
             </w:rPr>
           </w:pPr>
-          <w:hyperlink w:anchor="_Toc227080030" w:history="1">
+          <w:hyperlink w:anchor="_Toc227092711" w:history="1">
             <w:r>
               <w:rPr>
                 <w:rStyle w:val="Hyperlink"/>
@@ -1707,7 +1707,7 @@
                 <w:noProof/>
                 <w:webHidden/>
               </w:rPr>
-              <w:instrText xml:space="preserve"> PAGEREF _Toc227080030 \h </w:instrText>
+              <w:instrText xml:space="preserve"> PAGEREF _Toc227092711 \h </w:instrText>
             </w:r>
             <w:r>
               <w:rPr>
@@ -1753,7 +1753,7 @@
               <w14:ligatures w14:val="standardContextual"/>
             </w:rPr>
           </w:pPr>
-          <w:hyperlink w:anchor="_Toc227080031" w:history="1">
+          <w:hyperlink w:anchor="_Toc227092712" w:history="1">
             <w:r>
               <w:rPr>
                 <w:rStyle w:val="Hyperlink"/>
@@ -1780,7 +1780,7 @@
                 <w:noProof/>
                 <w:webHidden/>
               </w:rPr>
-              <w:instrText xml:space="preserve"> PAGEREF _Toc227080031 \h </w:instrText>
+              <w:instrText xml:space="preserve"> PAGEREF _Toc227092712 \h </w:instrText>
             </w:r>
             <w:r>
               <w:rPr>
@@ -1826,7 +1826,7 @@
               <w14:ligatures w14:val="standardContextual"/>
             </w:rPr>
           </w:pPr>
-          <w:hyperlink w:anchor="_Toc227080032" w:history="1">
+          <w:hyperlink w:anchor="_Toc227092713" w:history="1">
             <w:r>
               <w:rPr>
                 <w:rStyle w:val="Hyperlink"/>
@@ -1853,7 +1853,7 @@
                 <w:noProof/>
                 <w:webHidden/>
               </w:rPr>
-              <w:instrText xml:space="preserve"> PAGEREF _Toc227080032 \h </w:instrText>
+              <w:instrText xml:space="preserve"> PAGEREF _Toc227092713 \h </w:instrText>
             </w:r>
             <w:r>
               <w:rPr>
@@ -1899,7 +1899,7 @@
               <w14:ligatures w14:val="standardContextual"/>
             </w:rPr>
           </w:pPr>
-          <w:hyperlink w:anchor="_Toc227080033" w:history="1">
+          <w:hyperlink w:anchor="_Toc227092714" w:history="1">
             <w:r>
               <w:rPr>
                 <w:rStyle w:val="Hyperlink"/>
@@ -1926,7 +1926,7 @@
                 <w:noProof/>
                 <w:webHidden/>
               </w:rPr>
-              <w:instrText xml:space="preserve"> PAGEREF _Toc227080033 \h </w:instrText>
+              <w:instrText xml:space="preserve"> PAGEREF _Toc227092714 \h </w:instrText>
             </w:r>
             <w:r>
               <w:rPr>
@@ -1972,7 +1972,7 @@
               <w14:ligatures w14:val="standardContextual"/>
             </w:rPr>
           </w:pPr>
-          <w:hyperlink w:anchor="_Toc227080034" w:history="1">
+          <w:hyperlink w:anchor="_Toc227092715" w:history="1">
             <w:r>
               <w:rPr>
                 <w:rStyle w:val="Hyperlink"/>
@@ -1999,7 +1999,7 @@
                 <w:noProof/>
                 <w:webHidden/>
               </w:rPr>
-              <w:instrText xml:space="preserve"> PAGEREF _Toc227080034 \h </w:instrText>
+              <w:instrText xml:space="preserve"> PAGEREF _Toc227092715 \h </w:instrText>
             </w:r>
             <w:r>
               <w:rPr>
@@ -2019,7 +2019,7 @@
                 <w:noProof/>
                 <w:webHidden/>
               </w:rPr>
-              <w:t>23</w:t>
+              <w:t>24</w:t>
             </w:r>
             <w:r>
               <w:rPr>
@@ -2045,7 +2045,7 @@
               <w14:ligatures w14:val="standardContextual"/>
             </w:rPr>
           </w:pPr>
-          <w:hyperlink w:anchor="_Toc227080035" w:history="1">
+          <w:hyperlink w:anchor="_Toc227092716" w:history="1">
             <w:r>
               <w:rPr>
                 <w:rStyle w:val="Hyperlink"/>
@@ -2072,7 +2072,7 @@
                 <w:noProof/>
                 <w:webHidden/>
               </w:rPr>
-              <w:instrText xml:space="preserve"> PAGEREF _Toc227080035 \h </w:instrText>
+              <w:instrText xml:space="preserve"> PAGEREF _Toc227092716 \h </w:instrText>
             </w:r>
             <w:r>
               <w:rPr>
@@ -2092,7 +2092,7 @@
                 <w:noProof/>
                 <w:webHidden/>
               </w:rPr>
-              <w:t>23</w:t>
+              <w:t>24</w:t>
             </w:r>
             <w:r>
               <w:rPr>
@@ -2118,7 +2118,7 @@
               <w14:ligatures w14:val="standardContextual"/>
             </w:rPr>
           </w:pPr>
-          <w:hyperlink w:anchor="_Toc227080036" w:history="1">
+          <w:hyperlink w:anchor="_Toc227092717" w:history="1">
             <w:r>
               <w:rPr>
                 <w:rStyle w:val="Hyperlink"/>
@@ -2145,7 +2145,7 @@
                 <w:noProof/>
                 <w:webHidden/>
               </w:rPr>
-              <w:instrText xml:space="preserve"> PAGEREF _Toc227080036 \h </w:instrText>
+              <w:instrText xml:space="preserve"> PAGEREF _Toc227092717 \h </w:instrText>
             </w:r>
             <w:r>
               <w:rPr>
@@ -2165,7 +2165,7 @@
                 <w:noProof/>
                 <w:webHidden/>
               </w:rPr>
-              <w:t>23</w:t>
+              <w:t>24</w:t>
             </w:r>
             <w:r>
               <w:rPr>
@@ -2191,7 +2191,7 @@
               <w14:ligatures w14:val="standardContextual"/>
             </w:rPr>
           </w:pPr>
-          <w:hyperlink w:anchor="_Toc227080037" w:history="1">
+          <w:hyperlink w:anchor="_Toc227092718" w:history="1">
             <w:r>
               <w:rPr>
                 <w:rStyle w:val="Hyperlink"/>
@@ -2218,7 +2218,7 @@
                 <w:noProof/>
                 <w:webHidden/>
               </w:rPr>
-              <w:instrText xml:space="preserve"> PAGEREF _Toc227080037 \h </w:instrText>
+              <w:instrText xml:space="preserve"> PAGEREF _Toc227092718 \h </w:instrText>
             </w:r>
             <w:r>
               <w:rPr>
@@ -2238,7 +2238,7 @@
                 <w:noProof/>
                 <w:webHidden/>
               </w:rPr>
-              <w:t>24</w:t>
+              <w:t>25</w:t>
             </w:r>
             <w:r>
               <w:rPr>
@@ -2272,7 +2272,7 @@
       </w:pPr>
       <w:bookmarkStart w:id="11" w:name="_Toc226486566"/>
       <w:bookmarkStart w:id="12" w:name="_Toc226486629"/>
-      <w:bookmarkStart w:id="13" w:name="_Toc227080012"/>
+      <w:bookmarkStart w:id="13" w:name="_Toc227092693"/>
       <w:r>
         <w:lastRenderedPageBreak/>
         <w:t>1. Uvod</w:t>
@@ -2376,7 +2376,7 @@
       </w:pPr>
       <w:bookmarkStart w:id="14" w:name="_Toc226486567"/>
       <w:bookmarkStart w:id="15" w:name="_Toc226486630"/>
-      <w:bookmarkStart w:id="16" w:name="_Toc227080013"/>
+      <w:bookmarkStart w:id="16" w:name="_Toc227092694"/>
       <w:r>
         <w:t>2. Izbira orodij in programskih jezikov</w:t>
       </w:r>
@@ -2586,7 +2586,7 @@
       </w:pPr>
       <w:bookmarkStart w:id="20" w:name="_Toc226486568"/>
       <w:bookmarkStart w:id="21" w:name="_Toc226486631"/>
-      <w:bookmarkStart w:id="22" w:name="_Toc227080014"/>
+      <w:bookmarkStart w:id="22" w:name="_Toc227092695"/>
       <w:r>
         <w:lastRenderedPageBreak/>
         <w:t>3. O aplikaciji</w:t>
@@ -2828,7 +2828,7 @@
       <w:pPr>
         <w:pStyle w:val="Heading1"/>
       </w:pPr>
-      <w:bookmarkStart w:id="23" w:name="_Toc227080015"/>
+      <w:bookmarkStart w:id="23" w:name="_Toc227092696"/>
       <w:r>
         <w:lastRenderedPageBreak/>
         <w:t xml:space="preserve">4. </w:t>
@@ -2917,7 +2917,7 @@
       <w:pPr>
         <w:pStyle w:val="Heading2"/>
       </w:pPr>
-      <w:bookmarkStart w:id="25" w:name="_Toc227080016"/>
+      <w:bookmarkStart w:id="25" w:name="_Toc227092697"/>
       <w:r>
         <w:t>4. 1. Konstrukcija modela</w:t>
       </w:r>
@@ -3137,7 +3137,7 @@
       <w:pPr>
         <w:pStyle w:val="Heading2"/>
       </w:pPr>
-      <w:bookmarkStart w:id="28" w:name="_Toc227080017"/>
+      <w:bookmarkStart w:id="28" w:name="_Toc227092698"/>
       <w:r>
         <w:lastRenderedPageBreak/>
         <w:t xml:space="preserve">4. 2. </w:t>
@@ -3382,7 +3382,7 @@
       <w:pPr>
         <w:pStyle w:val="Heading2"/>
       </w:pPr>
-      <w:bookmarkStart w:id="31" w:name="_Toc227080018"/>
+      <w:bookmarkStart w:id="31" w:name="_Toc227092699"/>
       <w:r>
         <w:lastRenderedPageBreak/>
         <w:t xml:space="preserve">4. 2. </w:t>
@@ -3439,7 +3439,7 @@
       <w:pPr>
         <w:pStyle w:val="Heading3"/>
       </w:pPr>
-      <w:bookmarkStart w:id="32" w:name="_Toc227080019"/>
+      <w:bookmarkStart w:id="32" w:name="_Toc227092700"/>
       <w:r>
         <w:t>4. 2. 1. Kamera</w:t>
       </w:r>
@@ -3905,7 +3905,7 @@
       <w:pPr>
         <w:pStyle w:val="Heading3"/>
       </w:pPr>
-      <w:bookmarkStart w:id="35" w:name="_Toc227080020"/>
+      <w:bookmarkStart w:id="35" w:name="_Toc227092701"/>
       <w:r>
         <w:t xml:space="preserve">4. 2. 2. </w:t>
       </w:r>
@@ -4045,7 +4045,7 @@
       <w:pPr>
         <w:pStyle w:val="Heading2"/>
       </w:pPr>
-      <w:bookmarkStart w:id="36" w:name="_Toc227080021"/>
+      <w:bookmarkStart w:id="36" w:name="_Toc227092702"/>
       <w:r>
         <w:lastRenderedPageBreak/>
         <w:t>4. 3. Urejevalnik</w:t>
@@ -4197,7 +4197,7 @@
       <w:pPr>
         <w:pStyle w:val="Heading1"/>
       </w:pPr>
-      <w:bookmarkStart w:id="37" w:name="_Toc227080022"/>
+      <w:bookmarkStart w:id="37" w:name="_Toc227092703"/>
       <w:r>
         <w:lastRenderedPageBreak/>
         <w:t xml:space="preserve">5. </w:t>
@@ -4242,7 +4242,7 @@
       <w:pPr>
         <w:pStyle w:val="Heading2"/>
       </w:pPr>
-      <w:bookmarkStart w:id="38" w:name="_Toc227080023"/>
+      <w:bookmarkStart w:id="38" w:name="_Toc227092704"/>
       <w:r>
         <w:t>5. 1.  Vozlišče (node)</w:t>
       </w:r>
@@ -4665,7 +4665,7 @@
       <w:pPr>
         <w:pStyle w:val="Heading2"/>
       </w:pPr>
-      <w:bookmarkStart w:id="41" w:name="_Toc227080024"/>
+      <w:bookmarkStart w:id="41" w:name="_Toc227092705"/>
       <w:r>
         <w:t xml:space="preserve">5. 2. </w:t>
       </w:r>
@@ -5484,7 +5484,7 @@
       <w:pPr>
         <w:pStyle w:val="Heading1"/>
       </w:pPr>
-      <w:bookmarkStart w:id="48" w:name="_Toc227080025"/>
+      <w:bookmarkStart w:id="48" w:name="_Toc227092706"/>
       <w:r>
         <w:lastRenderedPageBreak/>
         <w:t>6. Inšpektor vozlišč</w:t>
@@ -5713,7 +5713,7 @@
       <w:pPr>
         <w:pStyle w:val="Heading1"/>
       </w:pPr>
-      <w:bookmarkStart w:id="50" w:name="_Toc227080026"/>
+      <w:bookmarkStart w:id="50" w:name="_Toc227092707"/>
       <w:r>
         <w:lastRenderedPageBreak/>
         <w:t xml:space="preserve">7. </w:t>
@@ -6234,7 +6234,7 @@
       <w:pPr>
         <w:pStyle w:val="Heading1"/>
       </w:pPr>
-      <w:bookmarkStart w:id="53" w:name="_Toc227080027"/>
+      <w:bookmarkStart w:id="53" w:name="_Toc227092708"/>
       <w:r>
         <w:lastRenderedPageBreak/>
         <w:t xml:space="preserve">8. Generacija terena in vrste </w:t>
@@ -6276,7 +6276,7 @@
       <w:pPr>
         <w:pStyle w:val="Heading2"/>
       </w:pPr>
-      <w:bookmarkStart w:id="55" w:name="_Toc227080028"/>
+      <w:bookmarkStart w:id="55" w:name="_Toc227092709"/>
       <w:r>
         <w:t>8. 1. Osnovna elevacija</w:t>
       </w:r>
@@ -6916,7 +6916,7 @@
       <w:pPr>
         <w:pStyle w:val="Heading2"/>
       </w:pPr>
-      <w:bookmarkStart w:id="63" w:name="_Toc227080029"/>
+      <w:bookmarkStart w:id="63" w:name="_Toc227092710"/>
       <w:r>
         <w:t xml:space="preserve">8. 2. </w:t>
       </w:r>
@@ -6950,7 +6950,7 @@
       <w:r>
         <w:br w:type="page"/>
       </w:r>
-      <w:bookmarkStart w:id="64" w:name="_Toc227080030"/>
+      <w:bookmarkStart w:id="64" w:name="_Toc227092711"/>
       <w:r>
         <w:lastRenderedPageBreak/>
         <w:t xml:space="preserve">8. 3. </w:t>
@@ -7438,76 +7438,543 @@
       <w:pPr>
         <w:pStyle w:val="Heading2"/>
       </w:pPr>
-      <w:bookmarkStart w:id="69" w:name="_Toc227080031"/>
+      <w:bookmarkStart w:id="69" w:name="_Toc227092712"/>
       <w:r>
         <w:lastRenderedPageBreak/>
         <w:t>8. 4. Terase</w:t>
       </w:r>
       <w:bookmarkEnd w:id="69"/>
     </w:p>
+    <w:p>
+      <w:r>
+        <w:t>Ker ima naravni teren pogosto strme klife in terase, je v aplikaciji implementirano tudi vozlišče za njihovo generacijo.</w:t>
+      </w:r>
+      <w:r>
+        <w:t xml:space="preserve"> Evaluacijska funkcija funkcionalnosti za ustvarjanje teras vsako vrednost ustavi v naslednjo enačbo</w:t>
+      </w:r>
+      <w:r>
+        <w:t xml:space="preserve">, kjer je </w:t>
+      </w:r>
+      <w:r>
+        <w:rPr>
+          <w:i/>
+          <w:iCs/>
+        </w:rPr>
+        <w:t>h</w:t>
+      </w:r>
+      <w:r>
+        <w:t xml:space="preserve"> nova višina, </w:t>
+      </w:r>
+      <w:r>
+        <w:rPr>
+          <w:i/>
+          <w:iCs/>
+        </w:rPr>
+        <w:t>h</w:t>
+      </w:r>
+      <w:r>
+        <w:rPr>
+          <w:i/>
+          <w:iCs/>
+          <w:vertAlign w:val="subscript"/>
+        </w:rPr>
+        <w:t>p</w:t>
+      </w:r>
+      <w:r>
+        <w:t xml:space="preserve"> prejšnja višina</w:t>
+      </w:r>
+      <w:r>
+        <w:t>,</w:t>
+      </w:r>
+      <w:r>
+        <w:t xml:space="preserve"> </w:t>
+      </w:r>
+      <w:r>
+        <w:rPr>
+          <w:i/>
+          <w:iCs/>
+        </w:rPr>
+        <w:t xml:space="preserve">round </w:t>
+      </w:r>
+      <w:r>
+        <w:t>zaokroževalna</w:t>
+      </w:r>
+      <w:r>
+        <w:t xml:space="preserve"> funkcija</w:t>
+      </w:r>
+      <w:r>
+        <w:t>,</w:t>
+      </w:r>
+      <w:r>
+        <w:t xml:space="preserve"> </w:t>
+      </w:r>
+      <w:r>
+        <w:rPr>
+          <w:i/>
+          <w:iCs/>
+        </w:rPr>
+        <w:t>s</w:t>
+      </w:r>
+      <w:r>
+        <w:rPr>
+          <w:i/>
+          <w:iCs/>
+        </w:rPr>
+        <w:t xml:space="preserve"> </w:t>
+      </w:r>
+      <w:r>
+        <w:t>strmost robov teras</w:t>
+      </w:r>
+      <w:r>
+        <w:t xml:space="preserve"> in t lastnost, k</w:t>
+      </w:r>
+      <w:r>
+        <w:t>i vpliva na število teras</w:t>
+      </w:r>
+      <w:r>
+        <w:t>:</w:t>
+      </w:r>
+    </w:p>
+    <w:p>
+      <m:oMathPara>
+        <m:oMath>
+          <m:r>
+            <w:rPr>
+              <w:rFonts w:ascii="Cambria Math" w:hAnsi="Cambria Math"/>
+            </w:rPr>
+            <m:t>h=</m:t>
+          </m:r>
+          <m:f>
+            <m:fPr>
+              <m:ctrlPr>
+                <w:rPr>
+                  <w:rFonts w:ascii="Cambria Math" w:hAnsi="Cambria Math"/>
+                  <w:i/>
+                </w:rPr>
+              </m:ctrlPr>
+            </m:fPr>
+            <m:num>
+              <m:d>
+                <m:dPr>
+                  <m:ctrlPr>
+                    <w:rPr>
+                      <w:rFonts w:ascii="Cambria Math" w:hAnsi="Cambria Math"/>
+                      <w:i/>
+                    </w:rPr>
+                  </m:ctrlPr>
+                </m:dPr>
+                <m:e>
+                  <m:r>
+                    <w:rPr>
+                      <w:rFonts w:ascii="Cambria Math" w:hAnsi="Cambria Math"/>
+                    </w:rPr>
+                    <m:t>round</m:t>
+                  </m:r>
+                  <m:d>
+                    <m:dPr>
+                      <m:ctrlPr>
+                        <w:rPr>
+                          <w:rFonts w:ascii="Cambria Math" w:hAnsi="Cambria Math"/>
+                          <w:i/>
+                        </w:rPr>
+                      </m:ctrlPr>
+                    </m:dPr>
+                    <m:e>
+                      <m:sSub>
+                        <m:sSubPr>
+                          <m:ctrlPr>
+                            <w:rPr>
+                              <w:rFonts w:ascii="Cambria Math" w:hAnsi="Cambria Math"/>
+                              <w:i/>
+                            </w:rPr>
+                          </m:ctrlPr>
+                        </m:sSubPr>
+                        <m:e>
+                          <m:r>
+                            <w:rPr>
+                              <w:rFonts w:ascii="Cambria Math" w:hAnsi="Cambria Math"/>
+                            </w:rPr>
+                            <m:t>h</m:t>
+                          </m:r>
+                        </m:e>
+                        <m:sub>
+                          <m:r>
+                            <w:rPr>
+                              <w:rFonts w:ascii="Cambria Math" w:hAnsi="Cambria Math"/>
+                            </w:rPr>
+                            <m:t>p</m:t>
+                          </m:r>
+                        </m:sub>
+                      </m:sSub>
+                    </m:e>
+                  </m:d>
+                  <m:r>
+                    <w:rPr>
+                      <w:rFonts w:ascii="Cambria Math" w:hAnsi="Cambria Math"/>
+                    </w:rPr>
+                    <m:t xml:space="preserve"> </m:t>
+                  </m:r>
+                  <m:r>
+                    <w:rPr>
+                      <w:rFonts w:ascii="Cambria Math" w:hAnsi="Cambria Math"/>
+                    </w:rPr>
+                    <m:t>+ 0.5</m:t>
+                  </m:r>
+                  <m:r>
+                    <w:rPr>
+                      <w:rFonts w:ascii="Cambria Math" w:hAnsi="Cambria Math"/>
+                    </w:rPr>
+                    <m:t>*</m:t>
+                  </m:r>
+                  <m:d>
+                    <m:dPr>
+                      <m:ctrlPr>
+                        <w:rPr>
+                          <w:rFonts w:ascii="Cambria Math" w:hAnsi="Cambria Math"/>
+                          <w:i/>
+                        </w:rPr>
+                      </m:ctrlPr>
+                    </m:dPr>
+                    <m:e>
+                      <m:sSup>
+                        <m:sSupPr>
+                          <m:ctrlPr>
+                            <w:rPr>
+                              <w:rFonts w:ascii="Cambria Math" w:hAnsi="Cambria Math"/>
+                              <w:i/>
+                            </w:rPr>
+                          </m:ctrlPr>
+                        </m:sSupPr>
+                        <m:e>
+                          <m:r>
+                            <w:rPr>
+                              <w:rFonts w:ascii="Cambria Math" w:hAnsi="Cambria Math"/>
+                            </w:rPr>
+                            <m:t>2*</m:t>
+                          </m:r>
+                          <m:d>
+                            <m:dPr>
+                              <m:ctrlPr>
+                                <w:rPr>
+                                  <w:rFonts w:ascii="Cambria Math" w:hAnsi="Cambria Math"/>
+                                  <w:i/>
+                                </w:rPr>
+                              </m:ctrlPr>
+                            </m:dPr>
+                            <m:e>
+                              <m:sSub>
+                                <m:sSubPr>
+                                  <m:ctrlPr>
+                                    <w:rPr>
+                                      <w:rFonts w:ascii="Cambria Math" w:hAnsi="Cambria Math"/>
+                                      <w:i/>
+                                    </w:rPr>
+                                  </m:ctrlPr>
+                                </m:sSubPr>
+                                <m:e>
+                                  <m:r>
+                                    <w:rPr>
+                                      <w:rFonts w:ascii="Cambria Math" w:hAnsi="Cambria Math"/>
+                                    </w:rPr>
+                                    <m:t>h</m:t>
+                                  </m:r>
+                                </m:e>
+                                <m:sub>
+                                  <m:r>
+                                    <w:rPr>
+                                      <w:rFonts w:ascii="Cambria Math" w:hAnsi="Cambria Math"/>
+                                    </w:rPr>
+                                    <m:t>p</m:t>
+                                  </m:r>
+                                </m:sub>
+                              </m:sSub>
+                              <m:r>
+                                <w:rPr>
+                                  <w:rFonts w:ascii="Cambria Math" w:hAnsi="Cambria Math"/>
+                                </w:rPr>
+                                <m:t xml:space="preserve"> - </m:t>
+                              </m:r>
+                              <m:r>
+                                <w:rPr>
+                                  <w:rFonts w:ascii="Cambria Math" w:hAnsi="Cambria Math"/>
+                                </w:rPr>
+                                <m:t>r</m:t>
+                              </m:r>
+                              <m:r>
+                                <w:rPr>
+                                  <w:rFonts w:ascii="Cambria Math" w:hAnsi="Cambria Math"/>
+                                </w:rPr>
+                                <m:t>ound</m:t>
+                              </m:r>
+                              <m:d>
+                                <m:dPr>
+                                  <m:ctrlPr>
+                                    <w:rPr>
+                                      <w:rFonts w:ascii="Cambria Math" w:hAnsi="Cambria Math"/>
+                                      <w:i/>
+                                    </w:rPr>
+                                  </m:ctrlPr>
+                                </m:dPr>
+                                <m:e>
+                                  <m:sSub>
+                                    <m:sSubPr>
+                                      <m:ctrlPr>
+                                        <w:rPr>
+                                          <w:rFonts w:ascii="Cambria Math" w:hAnsi="Cambria Math"/>
+                                          <w:i/>
+                                        </w:rPr>
+                                      </m:ctrlPr>
+                                    </m:sSubPr>
+                                    <m:e>
+                                      <m:r>
+                                        <w:rPr>
+                                          <w:rFonts w:ascii="Cambria Math" w:hAnsi="Cambria Math"/>
+                                        </w:rPr>
+                                        <m:t>h</m:t>
+                                      </m:r>
+                                    </m:e>
+                                    <m:sub>
+                                      <m:r>
+                                        <w:rPr>
+                                          <w:rFonts w:ascii="Cambria Math" w:hAnsi="Cambria Math"/>
+                                        </w:rPr>
+                                        <m:t>p</m:t>
+                                      </m:r>
+                                    </m:sub>
+                                  </m:sSub>
+                                </m:e>
+                              </m:d>
+                            </m:e>
+                          </m:d>
+                        </m:e>
+                        <m:sup>
+                          <m:r>
+                            <w:rPr>
+                              <w:rFonts w:ascii="Cambria Math" w:hAnsi="Cambria Math"/>
+                            </w:rPr>
+                            <m:t>2 * s- 1</m:t>
+                          </m:r>
+                        </m:sup>
+                      </m:sSup>
+                    </m:e>
+                  </m:d>
+                </m:e>
+              </m:d>
+            </m:num>
+            <m:den>
+              <m:r>
+                <w:rPr>
+                  <w:rFonts w:ascii="Cambria Math" w:hAnsi="Cambria Math"/>
+                </w:rPr>
+                <m:t>t</m:t>
+              </m:r>
+            </m:den>
+          </m:f>
+        </m:oMath>
+      </m:oMathPara>
+    </w:p>
+    <w:p>
+      <w:r>
+        <w:t xml:space="preserve">Večina drugih enačb za ustvarjanje teras uporabljajo vsaj eno kotno funkcijo. </w:t>
+      </w:r>
+      <w:r>
+        <w:t>Ker ta enačba ne uporablja kotnih funkcij</w:t>
+      </w:r>
+      <w:r>
+        <w:t xml:space="preserve"> deluje hitreje.</w:t>
+      </w:r>
+      <w:r>
+        <w:t xml:space="preserve"> To je pomembno, saj se izvede velikokrat.</w:t>
+      </w:r>
+      <w:r>
+        <w:t xml:space="preserve"> </w:t>
+      </w:r>
+      <w:r>
+        <w:t xml:space="preserve">Če je uporabljena maska, se za izvede tudi funkcija </w:t>
+      </w:r>
+      <w:r>
+        <w:rPr>
+          <w:i/>
+          <w:iCs/>
+        </w:rPr>
+        <w:t>lerp</w:t>
+      </w:r>
+      <w:r>
+        <w:t>,</w:t>
+      </w:r>
+      <w:r>
+        <w:t xml:space="preserve"> ki interpolira med prejšnjo in novo višino. Ta proces omogoča</w:t>
+      </w:r>
+      <w:r>
+        <w:t>, da se terase ne morajo ustvarjati povsod, vendar le na določenih pozicijah</w:t>
+      </w:r>
+      <w:r>
+        <w:t>.</w:t>
+      </w:r>
+    </w:p>
+    <w:p>
+      <w:pPr>
+        <w:keepNext/>
+      </w:pPr>
+      <w:r>
+        <w:drawing>
+          <wp:inline distT="0" distB="0" distL="0" distR="0" wp14:anchorId="6A3871B8" wp14:editId="014DD2C2">
+            <wp:extent cx="2733675" cy="1819239"/>
+            <wp:effectExtent l="0" t="0" r="0" b="0"/>
+            <wp:docPr id="980342800" name="Picture 1"/>
+            <wp:cNvGraphicFramePr>
+              <a:graphicFrameLocks xmlns:a="http://schemas.openxmlformats.org/drawingml/2006/main" noChangeAspect="1"/>
+            </wp:cNvGraphicFramePr>
+            <a:graphic xmlns:a="http://schemas.openxmlformats.org/drawingml/2006/main">
+              <a:graphicData uri="http://schemas.openxmlformats.org/drawingml/2006/picture">
+                <pic:pic xmlns:pic="http://schemas.openxmlformats.org/drawingml/2006/picture">
+                  <pic:nvPicPr>
+                    <pic:cNvPr id="980342800" name=""/>
+                    <pic:cNvPicPr/>
+                  </pic:nvPicPr>
+                  <pic:blipFill>
+                    <a:blip r:embed="rId44"/>
+                    <a:stretch>
+                      <a:fillRect/>
+                    </a:stretch>
+                  </pic:blipFill>
+                  <pic:spPr>
+                    <a:xfrm>
+                      <a:off x="0" y="0"/>
+                      <a:ext cx="2733675" cy="1819239"/>
+                    </a:xfrm>
+                    <a:prstGeom prst="rect">
+                      <a:avLst/>
+                    </a:prstGeom>
+                  </pic:spPr>
+                </pic:pic>
+              </a:graphicData>
+            </a:graphic>
+          </wp:inline>
+        </w:drawing>
+      </w:r>
+      <w:r>
+        <w:drawing>
+          <wp:inline distT="0" distB="0" distL="0" distR="0" wp14:anchorId="73E79D91" wp14:editId="1794BE56">
+            <wp:extent cx="2780491" cy="1817370"/>
+            <wp:effectExtent l="0" t="0" r="1270" b="0"/>
+            <wp:docPr id="879372545" name="Picture 1"/>
+            <wp:cNvGraphicFramePr>
+              <a:graphicFrameLocks xmlns:a="http://schemas.openxmlformats.org/drawingml/2006/main" noChangeAspect="1"/>
+            </wp:cNvGraphicFramePr>
+            <a:graphic xmlns:a="http://schemas.openxmlformats.org/drawingml/2006/main">
+              <a:graphicData uri="http://schemas.openxmlformats.org/drawingml/2006/picture">
+                <pic:pic xmlns:pic="http://schemas.openxmlformats.org/drawingml/2006/picture">
+                  <pic:nvPicPr>
+                    <pic:cNvPr id="879372545" name=""/>
+                    <pic:cNvPicPr/>
+                  </pic:nvPicPr>
+                  <pic:blipFill>
+                    <a:blip r:embed="rId45">
+                      <a:extLst>
+                        <a:ext uri="{28A0092B-C50C-407E-A947-70E740481C1C}">
+                          <a14:useLocalDpi xmlns:a14="http://schemas.microsoft.com/office/drawing/2010/main" val="0"/>
+                        </a:ext>
+                      </a:extLst>
+                    </a:blip>
+                    <a:stretch>
+                      <a:fillRect/>
+                    </a:stretch>
+                  </pic:blipFill>
+                  <pic:spPr>
+                    <a:xfrm>
+                      <a:off x="0" y="0"/>
+                      <a:ext cx="2793396" cy="1825805"/>
+                    </a:xfrm>
+                    <a:prstGeom prst="rect">
+                      <a:avLst/>
+                    </a:prstGeom>
+                  </pic:spPr>
+                </pic:pic>
+              </a:graphicData>
+            </a:graphic>
+          </wp:inline>
+        </w:drawing>
+      </w:r>
+    </w:p>
+    <w:p>
+      <w:pPr>
+        <w:pStyle w:val="Caption"/>
+      </w:pPr>
+      <w:r>
+        <w:t xml:space="preserve">Slika </w:t>
+      </w:r>
+      <w:r>
+        <w:fldChar w:fldCharType="begin"/>
+      </w:r>
+      <w:r>
+        <w:instrText xml:space="preserve"> SEQ Slika \* ARABIC </w:instrText>
+      </w:r>
+      <w:r>
+        <w:fldChar w:fldCharType="separate"/>
+      </w:r>
+      <w:r>
+        <w:rPr>
+          <w:noProof/>
+        </w:rPr>
+        <w:t>32</w:t>
+      </w:r>
+      <w:r>
+        <w:fldChar w:fldCharType="end"/>
+      </w:r>
+      <w:r>
+        <w:t xml:space="preserve"> Osnovna elevacija iz šuma</w:t>
+      </w:r>
+      <w:r>
+        <w:tab/>
+      </w:r>
+      <w:r>
+        <w:tab/>
+      </w:r>
+      <w:r>
+        <w:tab/>
+      </w:r>
+      <w:r>
+        <w:t xml:space="preserve">Slika </w:t>
+      </w:r>
+      <w:r>
+        <w:fldChar w:fldCharType="begin"/>
+      </w:r>
+      <w:r>
+        <w:instrText xml:space="preserve"> SEQ Slika \* ARABIC </w:instrText>
+      </w:r>
+      <w:r>
+        <w:fldChar w:fldCharType="separate"/>
+      </w:r>
+      <w:r>
+        <w:rPr>
+          <w:noProof/>
+        </w:rPr>
+        <w:t>33</w:t>
+      </w:r>
+      <w:r>
+        <w:fldChar w:fldCharType="end"/>
+      </w:r>
+      <w:r>
+        <w:t xml:space="preserve"> Elevacija iz slike 32</w:t>
+      </w:r>
+      <w:r>
+        <w:rPr>
+          <w:noProof/>
+        </w:rPr>
+        <w:t xml:space="preserve"> obdelana s terasnim vozliščem</w:t>
+      </w:r>
+    </w:p>
     <w:p/>
     <w:p>
       <w:pPr>
         <w:pStyle w:val="Heading2"/>
       </w:pPr>
-      <w:bookmarkStart w:id="70" w:name="_Toc227080032"/>
+      <w:bookmarkStart w:id="70" w:name="_Toc227092713"/>
       <w:r>
         <w:t>8. 5. Simulacija erozije</w:t>
       </w:r>
       <w:bookmarkEnd w:id="70"/>
-    </w:p>
-    <w:p/>
-    <w:p>
-      <w:pPr>
-        <w:pStyle w:val="Heading2"/>
-      </w:pPr>
-      <w:bookmarkStart w:id="71" w:name="_Toc227080033"/>
-      <w:r>
-        <w:t>8. 6. Ostale funkcionalnost</w:t>
-      </w:r>
-      <w:r>
-        <w:t>i</w:t>
-      </w:r>
-      <w:bookmarkEnd w:id="71"/>
-    </w:p>
-    <w:p/>
-    <w:p>
-      <w:pPr>
-        <w:pStyle w:val="Heading1"/>
-      </w:pPr>
-      <w:bookmarkStart w:id="72" w:name="_Toc227080034"/>
-      <w:r>
-        <w:t>9. Izvažanje</w:t>
-      </w:r>
-      <w:bookmarkEnd w:id="72"/>
-    </w:p>
-    <w:p/>
-    <w:p>
-      <w:pPr>
-        <w:pStyle w:val="Heading1"/>
-      </w:pPr>
-      <w:bookmarkStart w:id="73" w:name="_Toc227080035"/>
-      <w:r>
-        <w:t xml:space="preserve">10. </w:t>
-      </w:r>
-      <w:r>
-        <w:t>Shranjevanje</w:t>
-      </w:r>
-      <w:bookmarkEnd w:id="73"/>
-    </w:p>
-    <w:p/>
-    <w:p>
-      <w:pPr>
-        <w:pStyle w:val="Heading1"/>
-      </w:pPr>
-      <w:bookmarkStart w:id="74" w:name="_Toc227080036"/>
-      <w:r>
-        <w:t>11. Viri in literatur</w:t>
-      </w:r>
-      <w:r>
-        <w:t>a</w:t>
-      </w:r>
-      <w:bookmarkEnd w:id="74"/>
     </w:p>
     <w:p/>
     <w:p/>
@@ -7516,19 +7983,246 @@
     <w:p/>
     <w:p>
       <w:pPr>
+        <w:pStyle w:val="Heading2"/>
+      </w:pPr>
+      <w:bookmarkStart w:id="71" w:name="_Toc227092714"/>
+      <w:r>
+        <w:lastRenderedPageBreak/>
+        <w:t>8. 6. Ostale funkcionalnost</w:t>
+      </w:r>
+      <w:r>
+        <w:t>i</w:t>
+      </w:r>
+      <w:bookmarkEnd w:id="71"/>
+    </w:p>
+    <w:p/>
+    <w:p>
+      <w:r>
+        <w:t>Aplikacija vsebuje tudi številna druga vozlišča s svojimi funkcionalnosti.</w:t>
+      </w:r>
+      <w:r>
+        <w:t xml:space="preserve"> </w:t>
+      </w:r>
+      <w:r>
+        <w:t xml:space="preserve">Te </w:t>
+      </w:r>
+      <w:r>
+        <w:t>so:</w:t>
+      </w:r>
+    </w:p>
+    <w:p>
+      <w:pPr>
+        <w:pStyle w:val="ListParagraph"/>
+        <w:numPr>
+          <w:ilvl w:val="0"/>
+          <w:numId w:val="7"/>
+        </w:numPr>
+      </w:pPr>
+      <w:r>
+        <w:t>Funkcionalnost za združevanje</w:t>
+      </w:r>
+      <w:r>
+        <w:t>, ki</w:t>
+      </w:r>
+      <w:r>
+        <w:t xml:space="preserve"> sešteje vse vnose in je namenjeno združevanju posameznih plasti terena.</w:t>
+      </w:r>
+    </w:p>
+    <w:p>
+      <w:pPr>
+        <w:pStyle w:val="ListParagraph"/>
+        <w:numPr>
+          <w:ilvl w:val="0"/>
+          <w:numId w:val="7"/>
+        </w:numPr>
+      </w:pPr>
+      <w:r>
+        <w:t xml:space="preserve">Funkcionalnost, ki na več izhodov posreduje vrednost enega izhoda. Ta je uporabna v primeru, ko hočemo </w:t>
+      </w:r>
+      <w:r>
+        <w:t>izhod vozlišča uporabiti za več stvari</w:t>
+      </w:r>
+      <w:r>
+        <w:t xml:space="preserve">, npr. </w:t>
+      </w:r>
+      <w:r>
+        <w:t>teren</w:t>
+      </w:r>
+      <w:r>
+        <w:t xml:space="preserve"> se uporabi</w:t>
+      </w:r>
+      <w:r>
+        <w:t xml:space="preserve"> tudi kot </w:t>
+      </w:r>
+      <w:r>
+        <w:t>mask</w:t>
+      </w:r>
+      <w:r>
+        <w:t>a</w:t>
+      </w:r>
+      <w:r>
+        <w:t>.</w:t>
+      </w:r>
+    </w:p>
+    <w:p>
+      <w:pPr>
+        <w:pStyle w:val="ListParagraph"/>
+        <w:numPr>
+          <w:ilvl w:val="0"/>
+          <w:numId w:val="7"/>
+        </w:numPr>
+      </w:pPr>
+      <w:r>
+        <w:t xml:space="preserve">Funkcionalnost za normalizacijo, ki normalizira teren. </w:t>
+      </w:r>
+      <w:r>
+        <w:t>Prejšnja najvišja vrednost postane najvišja možna vrednost in prejšnja najnižja vrednost postane najnižja možna vrednost.</w:t>
+      </w:r>
+      <w:r>
+        <w:t xml:space="preserve"> </w:t>
+      </w:r>
+      <w:r>
+        <w:t>Ta funkcionalnost je u</w:t>
+      </w:r>
+      <w:r>
+        <w:t>porabn</w:t>
+      </w:r>
+      <w:r>
+        <w:t>a</w:t>
+      </w:r>
+      <w:r>
+        <w:t>, ko</w:t>
+      </w:r>
+      <w:r>
+        <w:t xml:space="preserve"> želimo</w:t>
+      </w:r>
+      <w:r>
+        <w:t>, da teren pokriva</w:t>
+      </w:r>
+      <w:r>
+        <w:t xml:space="preserve"> vse</w:t>
+      </w:r>
+      <w:r>
+        <w:t xml:space="preserve"> vrednosti od 0 do 1.</w:t>
+      </w:r>
+    </w:p>
+    <w:p>
+      <w:pPr>
+        <w:pStyle w:val="ListParagraph"/>
+        <w:numPr>
+          <w:ilvl w:val="0"/>
+          <w:numId w:val="7"/>
+        </w:numPr>
+      </w:pPr>
+      <w:r>
+        <w:t>Funkcionalnost za naknadno uporabo maske</w:t>
+      </w:r>
+    </w:p>
+    <w:p>
+      <w:pPr>
+        <w:pStyle w:val="ListParagraph"/>
+        <w:numPr>
+          <w:ilvl w:val="0"/>
+          <w:numId w:val="7"/>
+        </w:numPr>
+      </w:pPr>
+      <w:r>
+        <w:t>Funkcionalnost za ustvarjanje gradientne maske, ki ustvari masko glede na uporabnikovo izbiro</w:t>
+      </w:r>
+      <w:r>
+        <w:t xml:space="preserve"> oblike</w:t>
+      </w:r>
+      <w:r>
+        <w:t xml:space="preserve">. </w:t>
+      </w:r>
+      <w:r>
+        <w:t>Ta funkcionalnost je uporabna, ko želimo da se robovi terena bližajo vrednosti 0</w:t>
+      </w:r>
+      <w:r>
+        <w:t>. Nizki robovi</w:t>
+      </w:r>
+      <w:r>
+        <w:t xml:space="preserve"> pomaga</w:t>
+      </w:r>
+      <w:r>
+        <w:t xml:space="preserve">jo </w:t>
+      </w:r>
+      <w:r>
+        <w:t>pri integraciji terena v medije.</w:t>
+      </w:r>
+    </w:p>
+    <w:p>
+      <w:pPr>
+        <w:pStyle w:val="ListParagraph"/>
+        <w:numPr>
+          <w:ilvl w:val="0"/>
+          <w:numId w:val="7"/>
+        </w:numPr>
+      </w:pPr>
+      <w:r>
+        <w:t>Funkcionalnost za izvažanje, ki omogoča izvažanje terena</w:t>
+      </w:r>
+    </w:p>
+    <w:p>
+      <w:pPr>
         <w:pStyle w:val="Heading1"/>
       </w:pPr>
+      <w:bookmarkStart w:id="72" w:name="_Toc227092715"/>
+      <w:r>
+        <w:t>9. Izvažanje</w:t>
+      </w:r>
+      <w:bookmarkEnd w:id="72"/>
+    </w:p>
+    <w:p/>
+    <w:p/>
+    <w:p>
+      <w:pPr>
+        <w:pStyle w:val="Heading1"/>
+      </w:pPr>
+      <w:bookmarkStart w:id="73" w:name="_Toc227092716"/>
+      <w:r>
+        <w:t xml:space="preserve">10. </w:t>
+      </w:r>
+      <w:r>
+        <w:t>Shranjevanje</w:t>
+      </w:r>
+      <w:bookmarkEnd w:id="73"/>
+    </w:p>
+    <w:p/>
+    <w:p>
+      <w:pPr>
+        <w:pStyle w:val="Heading1"/>
+      </w:pPr>
+      <w:bookmarkStart w:id="74" w:name="_Toc227092717"/>
+      <w:r>
+        <w:t>11. Viri in literatur</w:t>
+      </w:r>
+      <w:r>
+        <w:t>a</w:t>
+      </w:r>
+      <w:bookmarkEnd w:id="74"/>
     </w:p>
     <w:p/>
     <w:p/>
     <w:p/>
+    <w:p/>
+    <w:p/>
     <w:p>
       <w:pPr>
         <w:pStyle w:val="Heading1"/>
       </w:pPr>
-      <w:bookmarkStart w:id="75" w:name="_Toc227080037"/>
-      <w:r>
-        <w:lastRenderedPageBreak/>
+    </w:p>
+    <w:p/>
+    <w:p/>
+    <w:p/>
+    <w:p/>
+    <w:p/>
+    <w:p>
+      <w:pPr>
+        <w:pStyle w:val="Heading1"/>
+      </w:pPr>
+      <w:bookmarkStart w:id="75" w:name="_Toc227092718"/>
+      <w:r>
         <w:t>IZJAVA O AVTORSTVU</w:t>
       </w:r>
       <w:bookmarkEnd w:id="75"/>
@@ -7558,10 +8252,10 @@
       </w:r>
     </w:p>
     <w:sectPr>
-      <w:headerReference w:type="default" r:id="rId44"/>
-      <w:footerReference w:type="default" r:id="rId45"/>
-      <w:headerReference w:type="first" r:id="rId46"/>
-      <w:footerReference w:type="first" r:id="rId47"/>
+      <w:headerReference w:type="default" r:id="rId46"/>
+      <w:footerReference w:type="default" r:id="rId47"/>
+      <w:headerReference w:type="first" r:id="rId48"/>
+      <w:footerReference w:type="first" r:id="rId49"/>
       <w:pgSz w:w="12240" w:h="15840"/>
       <w:pgMar w:top="1440" w:right="1440" w:bottom="1440" w:left="1440" w:header="720" w:footer="720" w:gutter="0"/>
       <w:cols w:space="720"/>
@@ -8509,6 +9203,119 @@
 <file path=word/numbering.xml><?xml version="1.0" encoding="utf-8"?>
 <w:numbering xmlns:wpc="http://schemas.microsoft.com/office/word/2010/wordprocessingCanvas" xmlns:cx="http://schemas.microsoft.com/office/drawing/2014/chartex" xmlns:cx1="http://schemas.microsoft.com/office/drawing/2015/9/8/chartex" xmlns:cx2="http://schemas.microsoft.com/office/drawing/2015/10/21/chartex" xmlns:cx3="http://schemas.microsoft.com/office/drawing/2016/5/9/chartex" xmlns:cx4="http://schemas.microsoft.com/office/drawing/2016/5/10/chartex" xmlns:cx5="http://schemas.microsoft.com/office/drawing/2016/5/11/chartex" xmlns:cx6="http://schemas.microsoft.com/office/drawing/2016/5/12/chartex" xmlns:cx7="http://schemas.microsoft.com/office/drawing/2016/5/13/chartex" xmlns:cx8="http://schemas.microsoft.com/office/drawing/2016/5/14/chartex" xmlns:mc="http://schemas.openxmlformats.org/markup-compatibility/2006" xmlns:aink="http://schemas.microsoft.com/office/drawing/2016/ink" xmlns:am3d="http://schemas.microsoft.com/office/drawing/2017/model3d" xmlns:o="urn:schemas-microsoft-com:office:office" xmlns:oel="http://schemas.microsoft.com/office/2019/extlst" xmlns:r="http://schemas.openxmlformats.org/officeDocument/2006/relationships" xmlns:m="http://schemas.openxmlformats.org/officeDocument/2006/math" xmlns:v="urn:schemas-microsoft-com:vml" xmlns:wp14="http://schemas.microsoft.com/office/word/2010/wordprocessingDrawing" xmlns:wp="http://schemas.openxmlformats.org/drawingml/2006/wordprocessingDrawing" xmlns:w10="urn:schemas-microsoft-com:office:word" xmlns:w="http://schemas.openxmlformats.org/wordprocessingml/2006/main" xmlns:w14="http://schemas.microsoft.com/office/word/2010/wordml" xmlns:w15="http://schemas.microsoft.com/office/word/2012/wordml" xmlns:w16cex="http://schemas.microsoft.com/office/word/2018/wordml/cex" xmlns:w16cid="http://schemas.microsoft.com/office/word/2016/wordml/cid" xmlns:w16="http://schemas.microsoft.com/office/word/2018/wordml" xmlns:w16du="http://schemas.microsoft.com/office/word/2023/wordml/word16du" xmlns:w16sdtdh="http://schemas.microsoft.com/office/word/2020/wordml/sdtdatahash" xmlns:w16sdtfl="http://schemas.microsoft.com/office/word/2024/wordml/sdtformatlock" xmlns:w16se="http://schemas.microsoft.com/office/word/2015/wordml/symex" xmlns:wpg="http://schemas.microsoft.com/office/word/2010/wordprocessingGroup" xmlns:wpi="http://schemas.microsoft.com/office/word/2010/wordprocessingInk" xmlns:wne="http://schemas.microsoft.com/office/word/2006/wordml" xmlns:wps="http://schemas.microsoft.com/office/word/2010/wordprocessingShape" mc:Ignorable="w14 w15 w16se w16cid w16 w16cex w16sdtdh w16sdtfl w16du wp14">
   <w:abstractNum w:abstractNumId="0" w15:restartNumberingAfterBreak="0">
+    <w:nsid w:val="19DB0A3D"/>
+    <w:multiLevelType w:val="hybridMultilevel"/>
+    <w:tmpl w:val="7EDC5FFE"/>
+    <w:lvl w:ilvl="0" w:tplc="6344B5F2">
+      <w:start w:val="8"/>
+      <w:numFmt w:val="bullet"/>
+      <w:lvlText w:val="-"/>
+      <w:lvlJc w:val="left"/>
+      <w:pPr>
+        <w:ind w:left="720" w:hanging="360"/>
+      </w:pPr>
+      <w:rPr>
+        <w:rFonts w:ascii="Arial" w:eastAsia="Arial" w:hAnsi="Arial" w:cs="Arial" w:hint="default"/>
+      </w:rPr>
+    </w:lvl>
+    <w:lvl w:ilvl="1" w:tplc="20000003" w:tentative="1">
+      <w:start w:val="1"/>
+      <w:numFmt w:val="bullet"/>
+      <w:lvlText w:val="o"/>
+      <w:lvlJc w:val="left"/>
+      <w:pPr>
+        <w:ind w:left="1440" w:hanging="360"/>
+      </w:pPr>
+      <w:rPr>
+        <w:rFonts w:ascii="Courier New" w:hAnsi="Courier New" w:cs="Courier New" w:hint="default"/>
+      </w:rPr>
+    </w:lvl>
+    <w:lvl w:ilvl="2" w:tplc="20000005" w:tentative="1">
+      <w:start w:val="1"/>
+      <w:numFmt w:val="bullet"/>
+      <w:lvlText w:val=""/>
+      <w:lvlJc w:val="left"/>
+      <w:pPr>
+        <w:ind w:left="2160" w:hanging="360"/>
+      </w:pPr>
+      <w:rPr>
+        <w:rFonts w:ascii="Wingdings" w:hAnsi="Wingdings" w:hint="default"/>
+      </w:rPr>
+    </w:lvl>
+    <w:lvl w:ilvl="3" w:tplc="20000001" w:tentative="1">
+      <w:start w:val="1"/>
+      <w:numFmt w:val="bullet"/>
+      <w:lvlText w:val=""/>
+      <w:lvlJc w:val="left"/>
+      <w:pPr>
+        <w:ind w:left="2880" w:hanging="360"/>
+      </w:pPr>
+      <w:rPr>
+        <w:rFonts w:ascii="Symbol" w:hAnsi="Symbol" w:hint="default"/>
+      </w:rPr>
+    </w:lvl>
+    <w:lvl w:ilvl="4" w:tplc="20000003" w:tentative="1">
+      <w:start w:val="1"/>
+      <w:numFmt w:val="bullet"/>
+      <w:lvlText w:val="o"/>
+      <w:lvlJc w:val="left"/>
+      <w:pPr>
+        <w:ind w:left="3600" w:hanging="360"/>
+      </w:pPr>
+      <w:rPr>
+        <w:rFonts w:ascii="Courier New" w:hAnsi="Courier New" w:cs="Courier New" w:hint="default"/>
+      </w:rPr>
+    </w:lvl>
+    <w:lvl w:ilvl="5" w:tplc="20000005" w:tentative="1">
+      <w:start w:val="1"/>
+      <w:numFmt w:val="bullet"/>
+      <w:lvlText w:val=""/>
+      <w:lvlJc w:val="left"/>
+      <w:pPr>
+        <w:ind w:left="4320" w:hanging="360"/>
+      </w:pPr>
+      <w:rPr>
+        <w:rFonts w:ascii="Wingdings" w:hAnsi="Wingdings" w:hint="default"/>
+      </w:rPr>
+    </w:lvl>
+    <w:lvl w:ilvl="6" w:tplc="20000001" w:tentative="1">
+      <w:start w:val="1"/>
+      <w:numFmt w:val="bullet"/>
+      <w:lvlText w:val=""/>
+      <w:lvlJc w:val="left"/>
+      <w:pPr>
+        <w:ind w:left="5040" w:hanging="360"/>
+      </w:pPr>
+      <w:rPr>
+        <w:rFonts w:ascii="Symbol" w:hAnsi="Symbol" w:hint="default"/>
+      </w:rPr>
+    </w:lvl>
+    <w:lvl w:ilvl="7" w:tplc="20000003" w:tentative="1">
+      <w:start w:val="1"/>
+      <w:numFmt w:val="bullet"/>
+      <w:lvlText w:val="o"/>
+      <w:lvlJc w:val="left"/>
+      <w:pPr>
+        <w:ind w:left="5760" w:hanging="360"/>
+      </w:pPr>
+      <w:rPr>
+        <w:rFonts w:ascii="Courier New" w:hAnsi="Courier New" w:cs="Courier New" w:hint="default"/>
+      </w:rPr>
+    </w:lvl>
+    <w:lvl w:ilvl="8" w:tplc="20000005" w:tentative="1">
+      <w:start w:val="1"/>
+      <w:numFmt w:val="bullet"/>
+      <w:lvlText w:val=""/>
+      <w:lvlJc w:val="left"/>
+      <w:pPr>
+        <w:ind w:left="6480" w:hanging="360"/>
+      </w:pPr>
+      <w:rPr>
+        <w:rFonts w:ascii="Wingdings" w:hAnsi="Wingdings" w:hint="default"/>
+      </w:rPr>
+    </w:lvl>
+  </w:abstractNum>
+  <w:abstractNum w:abstractNumId="1" w15:restartNumberingAfterBreak="0">
     <w:nsid w:val="2B709AE0"/>
     <w:multiLevelType w:val="hybridMultilevel"/>
     <w:tmpl w:val="0134A83C"/>
@@ -8594,7 +9401,7 @@
       </w:pPr>
     </w:lvl>
   </w:abstractNum>
-  <w:abstractNum w:abstractNumId="1" w15:restartNumberingAfterBreak="0">
+  <w:abstractNum w:abstractNumId="2" w15:restartNumberingAfterBreak="0">
     <w:nsid w:val="439B0051"/>
     <w:multiLevelType w:val="hybridMultilevel"/>
     <w:tmpl w:val="7832A370"/>
@@ -8707,7 +9514,120 @@
       </w:rPr>
     </w:lvl>
   </w:abstractNum>
-  <w:abstractNum w:abstractNumId="2" w15:restartNumberingAfterBreak="0">
+  <w:abstractNum w:abstractNumId="3" w15:restartNumberingAfterBreak="0">
+    <w:nsid w:val="4F69221D"/>
+    <w:multiLevelType w:val="hybridMultilevel"/>
+    <w:tmpl w:val="BE86C78C"/>
+    <w:lvl w:ilvl="0" w:tplc="6344B5F2">
+      <w:start w:val="8"/>
+      <w:numFmt w:val="bullet"/>
+      <w:lvlText w:val="-"/>
+      <w:lvlJc w:val="left"/>
+      <w:pPr>
+        <w:ind w:left="720" w:hanging="360"/>
+      </w:pPr>
+      <w:rPr>
+        <w:rFonts w:ascii="Arial" w:eastAsia="Arial" w:hAnsi="Arial" w:cs="Arial" w:hint="default"/>
+      </w:rPr>
+    </w:lvl>
+    <w:lvl w:ilvl="1" w:tplc="20000003" w:tentative="1">
+      <w:start w:val="1"/>
+      <w:numFmt w:val="bullet"/>
+      <w:lvlText w:val="o"/>
+      <w:lvlJc w:val="left"/>
+      <w:pPr>
+        <w:ind w:left="1440" w:hanging="360"/>
+      </w:pPr>
+      <w:rPr>
+        <w:rFonts w:ascii="Courier New" w:hAnsi="Courier New" w:cs="Courier New" w:hint="default"/>
+      </w:rPr>
+    </w:lvl>
+    <w:lvl w:ilvl="2" w:tplc="20000005" w:tentative="1">
+      <w:start w:val="1"/>
+      <w:numFmt w:val="bullet"/>
+      <w:lvlText w:val=""/>
+      <w:lvlJc w:val="left"/>
+      <w:pPr>
+        <w:ind w:left="2160" w:hanging="360"/>
+      </w:pPr>
+      <w:rPr>
+        <w:rFonts w:ascii="Wingdings" w:hAnsi="Wingdings" w:hint="default"/>
+      </w:rPr>
+    </w:lvl>
+    <w:lvl w:ilvl="3" w:tplc="20000001" w:tentative="1">
+      <w:start w:val="1"/>
+      <w:numFmt w:val="bullet"/>
+      <w:lvlText w:val=""/>
+      <w:lvlJc w:val="left"/>
+      <w:pPr>
+        <w:ind w:left="2880" w:hanging="360"/>
+      </w:pPr>
+      <w:rPr>
+        <w:rFonts w:ascii="Symbol" w:hAnsi="Symbol" w:hint="default"/>
+      </w:rPr>
+    </w:lvl>
+    <w:lvl w:ilvl="4" w:tplc="20000003" w:tentative="1">
+      <w:start w:val="1"/>
+      <w:numFmt w:val="bullet"/>
+      <w:lvlText w:val="o"/>
+      <w:lvlJc w:val="left"/>
+      <w:pPr>
+        <w:ind w:left="3600" w:hanging="360"/>
+      </w:pPr>
+      <w:rPr>
+        <w:rFonts w:ascii="Courier New" w:hAnsi="Courier New" w:cs="Courier New" w:hint="default"/>
+      </w:rPr>
+    </w:lvl>
+    <w:lvl w:ilvl="5" w:tplc="20000005" w:tentative="1">
+      <w:start w:val="1"/>
+      <w:numFmt w:val="bullet"/>
+      <w:lvlText w:val=""/>
+      <w:lvlJc w:val="left"/>
+      <w:pPr>
+        <w:ind w:left="4320" w:hanging="360"/>
+      </w:pPr>
+      <w:rPr>
+        <w:rFonts w:ascii="Wingdings" w:hAnsi="Wingdings" w:hint="default"/>
+      </w:rPr>
+    </w:lvl>
+    <w:lvl w:ilvl="6" w:tplc="20000001" w:tentative="1">
+      <w:start w:val="1"/>
+      <w:numFmt w:val="bullet"/>
+      <w:lvlText w:val=""/>
+      <w:lvlJc w:val="left"/>
+      <w:pPr>
+        <w:ind w:left="5040" w:hanging="360"/>
+      </w:pPr>
+      <w:rPr>
+        <w:rFonts w:ascii="Symbol" w:hAnsi="Symbol" w:hint="default"/>
+      </w:rPr>
+    </w:lvl>
+    <w:lvl w:ilvl="7" w:tplc="20000003" w:tentative="1">
+      <w:start w:val="1"/>
+      <w:numFmt w:val="bullet"/>
+      <w:lvlText w:val="o"/>
+      <w:lvlJc w:val="left"/>
+      <w:pPr>
+        <w:ind w:left="5760" w:hanging="360"/>
+      </w:pPr>
+      <w:rPr>
+        <w:rFonts w:ascii="Courier New" w:hAnsi="Courier New" w:cs="Courier New" w:hint="default"/>
+      </w:rPr>
+    </w:lvl>
+    <w:lvl w:ilvl="8" w:tplc="20000005" w:tentative="1">
+      <w:start w:val="1"/>
+      <w:numFmt w:val="bullet"/>
+      <w:lvlText w:val=""/>
+      <w:lvlJc w:val="left"/>
+      <w:pPr>
+        <w:ind w:left="6480" w:hanging="360"/>
+      </w:pPr>
+      <w:rPr>
+        <w:rFonts w:ascii="Wingdings" w:hAnsi="Wingdings" w:hint="default"/>
+      </w:rPr>
+    </w:lvl>
+  </w:abstractNum>
+  <w:abstractNum w:abstractNumId="4" w15:restartNumberingAfterBreak="0">
     <w:nsid w:val="674EE5F6"/>
     <w:multiLevelType w:val="hybridMultilevel"/>
     <w:tmpl w:val="E624A1C6"/>
@@ -8793,7 +9713,7 @@
       </w:pPr>
     </w:lvl>
   </w:abstractNum>
-  <w:abstractNum w:abstractNumId="3" w15:restartNumberingAfterBreak="0">
+  <w:abstractNum w:abstractNumId="5" w15:restartNumberingAfterBreak="0">
     <w:nsid w:val="693042C6"/>
     <w:multiLevelType w:val="hybridMultilevel"/>
     <w:tmpl w:val="4CC23184"/>
@@ -8879,7 +9799,7 @@
       </w:pPr>
     </w:lvl>
   </w:abstractNum>
-  <w:abstractNum w:abstractNumId="4" w15:restartNumberingAfterBreak="0">
+  <w:abstractNum w:abstractNumId="6" w15:restartNumberingAfterBreak="0">
     <w:nsid w:val="6D31EF24"/>
     <w:multiLevelType w:val="hybridMultilevel"/>
     <w:tmpl w:val="7234B698"/>
@@ -8966,19 +9886,25 @@
     </w:lvl>
   </w:abstractNum>
   <w:num w:numId="1" w16cid:durableId="509947281">
-    <w:abstractNumId w:val="3"/>
+    <w:abstractNumId w:val="5"/>
   </w:num>
   <w:num w:numId="2" w16cid:durableId="44373866">
+    <w:abstractNumId w:val="2"/>
+  </w:num>
+  <w:num w:numId="3" w16cid:durableId="2092316367">
     <w:abstractNumId w:val="1"/>
   </w:num>
-  <w:num w:numId="3" w16cid:durableId="2092316367">
+  <w:num w:numId="4" w16cid:durableId="2127894436">
+    <w:abstractNumId w:val="6"/>
+  </w:num>
+  <w:num w:numId="5" w16cid:durableId="761993091">
+    <w:abstractNumId w:val="4"/>
+  </w:num>
+  <w:num w:numId="6" w16cid:durableId="1701936477">
     <w:abstractNumId w:val="0"/>
   </w:num>
-  <w:num w:numId="4" w16cid:durableId="2127894436">
-    <w:abstractNumId w:val="4"/>
-  </w:num>
-  <w:num w:numId="5" w16cid:durableId="761993091">
-    <w:abstractNumId w:val="2"/>
+  <w:num w:numId="7" w16cid:durableId="883062433">
+    <w:abstractNumId w:val="3"/>
   </w:num>
 </w:numbering>
 </file>
@@ -9462,7 +10388,6 @@
   <w:style w:type="character" w:default="1" w:styleId="DefaultParagraphFont">
     <w:name w:val="Default Paragraph Font"/>
     <w:uiPriority w:val="1"/>
-    <w:semiHidden/>
     <w:unhideWhenUsed/>
   </w:style>
   <w:style w:type="table" w:default="1" w:styleId="TableNormal">

</xml_diff>

<commit_message>
Report - Vse poleg viro
</commit_message>
<xml_diff>
--- a/Strokovno Porocilo.docx
+++ b/Strokovno Porocilo.docx
@@ -261,7 +261,7 @@
       <w:bookmarkStart w:id="7" w:name="_Toc226486565"/>
       <w:bookmarkStart w:id="8" w:name="_Toc226486628"/>
       <w:bookmarkStart w:id="9" w:name="_Toc227079926"/>
-      <w:bookmarkStart w:id="10" w:name="_Toc227092692"/>
+      <w:bookmarkStart w:id="10" w:name="_Toc227166594"/>
       <w:r>
         <w:rPr>
           <w:rFonts w:eastAsia="Arial"/>
@@ -315,7 +315,7 @@
           <w:r>
             <w:fldChar w:fldCharType="separate"/>
           </w:r>
-          <w:hyperlink w:anchor="_Toc227092692" w:history="1">
+          <w:hyperlink w:anchor="_Toc227166594" w:history="1">
             <w:r>
               <w:rPr>
                 <w:rStyle w:val="Hyperlink"/>
@@ -342,7 +342,7 @@
                 <w:noProof/>
                 <w:webHidden/>
               </w:rPr>
-              <w:instrText xml:space="preserve"> PAGEREF _Toc227092692 \h </w:instrText>
+              <w:instrText xml:space="preserve"> PAGEREF _Toc227166594 \h </w:instrText>
             </w:r>
             <w:r>
               <w:rPr>
@@ -388,7 +388,7 @@
               <w14:ligatures w14:val="standardContextual"/>
             </w:rPr>
           </w:pPr>
-          <w:hyperlink w:anchor="_Toc227092693" w:history="1">
+          <w:hyperlink w:anchor="_Toc227166595" w:history="1">
             <w:r>
               <w:rPr>
                 <w:rStyle w:val="Hyperlink"/>
@@ -415,7 +415,7 @@
                 <w:noProof/>
                 <w:webHidden/>
               </w:rPr>
-              <w:instrText xml:space="preserve"> PAGEREF _Toc227092693 \h </w:instrText>
+              <w:instrText xml:space="preserve"> PAGEREF _Toc227166595 \h </w:instrText>
             </w:r>
             <w:r>
               <w:rPr>
@@ -435,7 +435,7 @@
                 <w:noProof/>
                 <w:webHidden/>
               </w:rPr>
-              <w:t>4</w:t>
+              <w:t>5</w:t>
             </w:r>
             <w:r>
               <w:rPr>
@@ -461,7 +461,7 @@
               <w14:ligatures w14:val="standardContextual"/>
             </w:rPr>
           </w:pPr>
-          <w:hyperlink w:anchor="_Toc227092694" w:history="1">
+          <w:hyperlink w:anchor="_Toc227166596" w:history="1">
             <w:r>
               <w:rPr>
                 <w:rStyle w:val="Hyperlink"/>
@@ -488,7 +488,7 @@
                 <w:noProof/>
                 <w:webHidden/>
               </w:rPr>
-              <w:instrText xml:space="preserve"> PAGEREF _Toc227092694 \h </w:instrText>
+              <w:instrText xml:space="preserve"> PAGEREF _Toc227166596 \h </w:instrText>
             </w:r>
             <w:r>
               <w:rPr>
@@ -508,7 +508,7 @@
                 <w:noProof/>
                 <w:webHidden/>
               </w:rPr>
-              <w:t>4</w:t>
+              <w:t>5</w:t>
             </w:r>
             <w:r>
               <w:rPr>
@@ -534,7 +534,7 @@
               <w14:ligatures w14:val="standardContextual"/>
             </w:rPr>
           </w:pPr>
-          <w:hyperlink w:anchor="_Toc227092695" w:history="1">
+          <w:hyperlink w:anchor="_Toc227166597" w:history="1">
             <w:r>
               <w:rPr>
                 <w:rStyle w:val="Hyperlink"/>
@@ -561,7 +561,7 @@
                 <w:noProof/>
                 <w:webHidden/>
               </w:rPr>
-              <w:instrText xml:space="preserve"> PAGEREF _Toc227092695 \h </w:instrText>
+              <w:instrText xml:space="preserve"> PAGEREF _Toc227166597 \h </w:instrText>
             </w:r>
             <w:r>
               <w:rPr>
@@ -581,7 +581,7 @@
                 <w:noProof/>
                 <w:webHidden/>
               </w:rPr>
-              <w:t>5</w:t>
+              <w:t>6</w:t>
             </w:r>
             <w:r>
               <w:rPr>
@@ -607,7 +607,7 @@
               <w14:ligatures w14:val="standardContextual"/>
             </w:rPr>
           </w:pPr>
-          <w:hyperlink w:anchor="_Toc227092696" w:history="1">
+          <w:hyperlink w:anchor="_Toc227166598" w:history="1">
             <w:r>
               <w:rPr>
                 <w:rStyle w:val="Hyperlink"/>
@@ -634,7 +634,7 @@
                 <w:noProof/>
                 <w:webHidden/>
               </w:rPr>
-              <w:instrText xml:space="preserve"> PAGEREF _Toc227092696 \h </w:instrText>
+              <w:instrText xml:space="preserve"> PAGEREF _Toc227166598 \h </w:instrText>
             </w:r>
             <w:r>
               <w:rPr>
@@ -654,7 +654,7 @@
                 <w:noProof/>
                 <w:webHidden/>
               </w:rPr>
-              <w:t>6</w:t>
+              <w:t>7</w:t>
             </w:r>
             <w:r>
               <w:rPr>
@@ -680,7 +680,7 @@
               <w14:ligatures w14:val="standardContextual"/>
             </w:rPr>
           </w:pPr>
-          <w:hyperlink w:anchor="_Toc227092697" w:history="1">
+          <w:hyperlink w:anchor="_Toc227166599" w:history="1">
             <w:r>
               <w:rPr>
                 <w:rStyle w:val="Hyperlink"/>
@@ -707,7 +707,7 @@
                 <w:noProof/>
                 <w:webHidden/>
               </w:rPr>
-              <w:instrText xml:space="preserve"> PAGEREF _Toc227092697 \h </w:instrText>
+              <w:instrText xml:space="preserve"> PAGEREF _Toc227166599 \h </w:instrText>
             </w:r>
             <w:r>
               <w:rPr>
@@ -727,7 +727,7 @@
                 <w:noProof/>
                 <w:webHidden/>
               </w:rPr>
-              <w:t>6</w:t>
+              <w:t>7</w:t>
             </w:r>
             <w:r>
               <w:rPr>
@@ -753,7 +753,7 @@
               <w14:ligatures w14:val="standardContextual"/>
             </w:rPr>
           </w:pPr>
-          <w:hyperlink w:anchor="_Toc227092698" w:history="1">
+          <w:hyperlink w:anchor="_Toc227166600" w:history="1">
             <w:r>
               <w:rPr>
                 <w:rStyle w:val="Hyperlink"/>
@@ -780,7 +780,7 @@
                 <w:noProof/>
                 <w:webHidden/>
               </w:rPr>
-              <w:instrText xml:space="preserve"> PAGEREF _Toc227092698 \h </w:instrText>
+              <w:instrText xml:space="preserve"> PAGEREF _Toc227166600 \h </w:instrText>
             </w:r>
             <w:r>
               <w:rPr>
@@ -800,7 +800,7 @@
                 <w:noProof/>
                 <w:webHidden/>
               </w:rPr>
-              <w:t>7</w:t>
+              <w:t>8</w:t>
             </w:r>
             <w:r>
               <w:rPr>
@@ -826,7 +826,7 @@
               <w14:ligatures w14:val="standardContextual"/>
             </w:rPr>
           </w:pPr>
-          <w:hyperlink w:anchor="_Toc227092699" w:history="1">
+          <w:hyperlink w:anchor="_Toc227166601" w:history="1">
             <w:r>
               <w:rPr>
                 <w:rStyle w:val="Hyperlink"/>
@@ -853,7 +853,7 @@
                 <w:noProof/>
                 <w:webHidden/>
               </w:rPr>
-              <w:instrText xml:space="preserve"> PAGEREF _Toc227092699 \h </w:instrText>
+              <w:instrText xml:space="preserve"> PAGEREF _Toc227166601 \h </w:instrText>
             </w:r>
             <w:r>
               <w:rPr>
@@ -873,7 +873,7 @@
                 <w:noProof/>
                 <w:webHidden/>
               </w:rPr>
-              <w:t>8</w:t>
+              <w:t>9</w:t>
             </w:r>
             <w:r>
               <w:rPr>
@@ -896,7 +896,7 @@
               <w14:ligatures w14:val="standardContextual"/>
             </w:rPr>
           </w:pPr>
-          <w:hyperlink w:anchor="_Toc227092700" w:history="1">
+          <w:hyperlink w:anchor="_Toc227166602" w:history="1">
             <w:r>
               <w:rPr>
                 <w:rStyle w:val="Hyperlink"/>
@@ -919,7 +919,7 @@
               <w:rPr>
                 <w:webHidden/>
               </w:rPr>
-              <w:instrText xml:space="preserve"> PAGEREF _Toc227092700 \h </w:instrText>
+              <w:instrText xml:space="preserve"> PAGEREF _Toc227166602 \h </w:instrText>
             </w:r>
             <w:r>
               <w:rPr>
@@ -936,7 +936,7 @@
               <w:rPr>
                 <w:webHidden/>
               </w:rPr>
-              <w:t>8</w:t>
+              <w:t>9</w:t>
             </w:r>
             <w:r>
               <w:rPr>
@@ -958,7 +958,7 @@
               <w14:ligatures w14:val="standardContextual"/>
             </w:rPr>
           </w:pPr>
-          <w:hyperlink w:anchor="_Toc227092701" w:history="1">
+          <w:hyperlink w:anchor="_Toc227166603" w:history="1">
             <w:r>
               <w:rPr>
                 <w:rStyle w:val="Hyperlink"/>
@@ -981,7 +981,7 @@
               <w:rPr>
                 <w:webHidden/>
               </w:rPr>
-              <w:instrText xml:space="preserve"> PAGEREF _Toc227092701 \h </w:instrText>
+              <w:instrText xml:space="preserve"> PAGEREF _Toc227166603 \h </w:instrText>
             </w:r>
             <w:r>
               <w:rPr>
@@ -998,7 +998,7 @@
               <w:rPr>
                 <w:webHidden/>
               </w:rPr>
-              <w:t>9</w:t>
+              <w:t>10</w:t>
             </w:r>
             <w:r>
               <w:rPr>
@@ -1023,7 +1023,7 @@
               <w14:ligatures w14:val="standardContextual"/>
             </w:rPr>
           </w:pPr>
-          <w:hyperlink w:anchor="_Toc227092702" w:history="1">
+          <w:hyperlink w:anchor="_Toc227166604" w:history="1">
             <w:r>
               <w:rPr>
                 <w:rStyle w:val="Hyperlink"/>
@@ -1050,7 +1050,7 @@
                 <w:noProof/>
                 <w:webHidden/>
               </w:rPr>
-              <w:instrText xml:space="preserve"> PAGEREF _Toc227092702 \h </w:instrText>
+              <w:instrText xml:space="preserve"> PAGEREF _Toc227166604 \h </w:instrText>
             </w:r>
             <w:r>
               <w:rPr>
@@ -1070,7 +1070,7 @@
                 <w:noProof/>
                 <w:webHidden/>
               </w:rPr>
-              <w:t>10</w:t>
+              <w:t>11</w:t>
             </w:r>
             <w:r>
               <w:rPr>
@@ -1096,7 +1096,7 @@
               <w14:ligatures w14:val="standardContextual"/>
             </w:rPr>
           </w:pPr>
-          <w:hyperlink w:anchor="_Toc227092703" w:history="1">
+          <w:hyperlink w:anchor="_Toc227166605" w:history="1">
             <w:r>
               <w:rPr>
                 <w:rStyle w:val="Hyperlink"/>
@@ -1123,7 +1123,7 @@
                 <w:noProof/>
                 <w:webHidden/>
               </w:rPr>
-              <w:instrText xml:space="preserve"> PAGEREF _Toc227092703 \h </w:instrText>
+              <w:instrText xml:space="preserve"> PAGEREF _Toc227166605 \h </w:instrText>
             </w:r>
             <w:r>
               <w:rPr>
@@ -1143,7 +1143,7 @@
                 <w:noProof/>
                 <w:webHidden/>
               </w:rPr>
-              <w:t>11</w:t>
+              <w:t>12</w:t>
             </w:r>
             <w:r>
               <w:rPr>
@@ -1169,7 +1169,7 @@
               <w14:ligatures w14:val="standardContextual"/>
             </w:rPr>
           </w:pPr>
-          <w:hyperlink w:anchor="_Toc227092704" w:history="1">
+          <w:hyperlink w:anchor="_Toc227166606" w:history="1">
             <w:r>
               <w:rPr>
                 <w:rStyle w:val="Hyperlink"/>
@@ -1196,7 +1196,7 @@
                 <w:noProof/>
                 <w:webHidden/>
               </w:rPr>
-              <w:instrText xml:space="preserve"> PAGEREF _Toc227092704 \h </w:instrText>
+              <w:instrText xml:space="preserve"> PAGEREF _Toc227166606 \h </w:instrText>
             </w:r>
             <w:r>
               <w:rPr>
@@ -1216,7 +1216,7 @@
                 <w:noProof/>
                 <w:webHidden/>
               </w:rPr>
-              <w:t>11</w:t>
+              <w:t>12</w:t>
             </w:r>
             <w:r>
               <w:rPr>
@@ -1242,7 +1242,7 @@
               <w14:ligatures w14:val="standardContextual"/>
             </w:rPr>
           </w:pPr>
-          <w:hyperlink w:anchor="_Toc227092705" w:history="1">
+          <w:hyperlink w:anchor="_Toc227166607" w:history="1">
             <w:r>
               <w:rPr>
                 <w:rStyle w:val="Hyperlink"/>
@@ -1269,7 +1269,7 @@
                 <w:noProof/>
                 <w:webHidden/>
               </w:rPr>
-              <w:instrText xml:space="preserve"> PAGEREF _Toc227092705 \h </w:instrText>
+              <w:instrText xml:space="preserve"> PAGEREF _Toc227166607 \h </w:instrText>
             </w:r>
             <w:r>
               <w:rPr>
@@ -1289,7 +1289,7 @@
                 <w:noProof/>
                 <w:webHidden/>
               </w:rPr>
-              <w:t>12</w:t>
+              <w:t>13</w:t>
             </w:r>
             <w:r>
               <w:rPr>
@@ -1315,7 +1315,7 @@
               <w14:ligatures w14:val="standardContextual"/>
             </w:rPr>
           </w:pPr>
-          <w:hyperlink w:anchor="_Toc227092706" w:history="1">
+          <w:hyperlink w:anchor="_Toc227166608" w:history="1">
             <w:r>
               <w:rPr>
                 <w:rStyle w:val="Hyperlink"/>
@@ -1342,7 +1342,7 @@
                 <w:noProof/>
                 <w:webHidden/>
               </w:rPr>
-              <w:instrText xml:space="preserve"> PAGEREF _Toc227092706 \h </w:instrText>
+              <w:instrText xml:space="preserve"> PAGEREF _Toc227166608 \h </w:instrText>
             </w:r>
             <w:r>
               <w:rPr>
@@ -1362,7 +1362,7 @@
                 <w:noProof/>
                 <w:webHidden/>
               </w:rPr>
-              <w:t>16</w:t>
+              <w:t>17</w:t>
             </w:r>
             <w:r>
               <w:rPr>
@@ -1388,7 +1388,7 @@
               <w14:ligatures w14:val="standardContextual"/>
             </w:rPr>
           </w:pPr>
-          <w:hyperlink w:anchor="_Toc227092707" w:history="1">
+          <w:hyperlink w:anchor="_Toc227166609" w:history="1">
             <w:r>
               <w:rPr>
                 <w:rStyle w:val="Hyperlink"/>
@@ -1415,7 +1415,7 @@
                 <w:noProof/>
                 <w:webHidden/>
               </w:rPr>
-              <w:instrText xml:space="preserve"> PAGEREF _Toc227092707 \h </w:instrText>
+              <w:instrText xml:space="preserve"> PAGEREF _Toc227166609 \h </w:instrText>
             </w:r>
             <w:r>
               <w:rPr>
@@ -1435,7 +1435,7 @@
                 <w:noProof/>
                 <w:webHidden/>
               </w:rPr>
-              <w:t>17</w:t>
+              <w:t>18</w:t>
             </w:r>
             <w:r>
               <w:rPr>
@@ -1461,7 +1461,7 @@
               <w14:ligatures w14:val="standardContextual"/>
             </w:rPr>
           </w:pPr>
-          <w:hyperlink w:anchor="_Toc227092708" w:history="1">
+          <w:hyperlink w:anchor="_Toc227166610" w:history="1">
             <w:r>
               <w:rPr>
                 <w:rStyle w:val="Hyperlink"/>
@@ -1488,7 +1488,7 @@
                 <w:noProof/>
                 <w:webHidden/>
               </w:rPr>
-              <w:instrText xml:space="preserve"> PAGEREF _Toc227092708 \h </w:instrText>
+              <w:instrText xml:space="preserve"> PAGEREF _Toc227166610 \h </w:instrText>
             </w:r>
             <w:r>
               <w:rPr>
@@ -1508,7 +1508,7 @@
                 <w:noProof/>
                 <w:webHidden/>
               </w:rPr>
-              <w:t>19</w:t>
+              <w:t>20</w:t>
             </w:r>
             <w:r>
               <w:rPr>
@@ -1534,7 +1534,7 @@
               <w14:ligatures w14:val="standardContextual"/>
             </w:rPr>
           </w:pPr>
-          <w:hyperlink w:anchor="_Toc227092709" w:history="1">
+          <w:hyperlink w:anchor="_Toc227166611" w:history="1">
             <w:r>
               <w:rPr>
                 <w:rStyle w:val="Hyperlink"/>
@@ -1561,7 +1561,7 @@
                 <w:noProof/>
                 <w:webHidden/>
               </w:rPr>
-              <w:instrText xml:space="preserve"> PAGEREF _Toc227092709 \h </w:instrText>
+              <w:instrText xml:space="preserve"> PAGEREF _Toc227166611 \h </w:instrText>
             </w:r>
             <w:r>
               <w:rPr>
@@ -1581,7 +1581,7 @@
                 <w:noProof/>
                 <w:webHidden/>
               </w:rPr>
-              <w:t>19</w:t>
+              <w:t>20</w:t>
             </w:r>
             <w:r>
               <w:rPr>
@@ -1607,7 +1607,7 @@
               <w14:ligatures w14:val="standardContextual"/>
             </w:rPr>
           </w:pPr>
-          <w:hyperlink w:anchor="_Toc227092710" w:history="1">
+          <w:hyperlink w:anchor="_Toc227166612" w:history="1">
             <w:r>
               <w:rPr>
                 <w:rStyle w:val="Hyperlink"/>
@@ -1634,7 +1634,7 @@
                 <w:noProof/>
                 <w:webHidden/>
               </w:rPr>
-              <w:instrText xml:space="preserve"> PAGEREF _Toc227092710 \h </w:instrText>
+              <w:instrText xml:space="preserve"> PAGEREF _Toc227166612 \h </w:instrText>
             </w:r>
             <w:r>
               <w:rPr>
@@ -1654,7 +1654,7 @@
                 <w:noProof/>
                 <w:webHidden/>
               </w:rPr>
-              <w:t>21</w:t>
+              <w:t>22</w:t>
             </w:r>
             <w:r>
               <w:rPr>
@@ -1680,7 +1680,7 @@
               <w14:ligatures w14:val="standardContextual"/>
             </w:rPr>
           </w:pPr>
-          <w:hyperlink w:anchor="_Toc227092711" w:history="1">
+          <w:hyperlink w:anchor="_Toc227166613" w:history="1">
             <w:r>
               <w:rPr>
                 <w:rStyle w:val="Hyperlink"/>
@@ -1707,7 +1707,7 @@
                 <w:noProof/>
                 <w:webHidden/>
               </w:rPr>
-              <w:instrText xml:space="preserve"> PAGEREF _Toc227092711 \h </w:instrText>
+              <w:instrText xml:space="preserve"> PAGEREF _Toc227166613 \h </w:instrText>
             </w:r>
             <w:r>
               <w:rPr>
@@ -1727,7 +1727,7 @@
                 <w:noProof/>
                 <w:webHidden/>
               </w:rPr>
-              <w:t>22</w:t>
+              <w:t>23</w:t>
             </w:r>
             <w:r>
               <w:rPr>
@@ -1753,7 +1753,7 @@
               <w14:ligatures w14:val="standardContextual"/>
             </w:rPr>
           </w:pPr>
-          <w:hyperlink w:anchor="_Toc227092712" w:history="1">
+          <w:hyperlink w:anchor="_Toc227166614" w:history="1">
             <w:r>
               <w:rPr>
                 <w:rStyle w:val="Hyperlink"/>
@@ -1780,7 +1780,7 @@
                 <w:noProof/>
                 <w:webHidden/>
               </w:rPr>
-              <w:instrText xml:space="preserve"> PAGEREF _Toc227092712 \h </w:instrText>
+              <w:instrText xml:space="preserve"> PAGEREF _Toc227166614 \h </w:instrText>
             </w:r>
             <w:r>
               <w:rPr>
@@ -1800,7 +1800,7 @@
                 <w:noProof/>
                 <w:webHidden/>
               </w:rPr>
-              <w:t>23</w:t>
+              <w:t>24</w:t>
             </w:r>
             <w:r>
               <w:rPr>
@@ -1826,7 +1826,7 @@
               <w14:ligatures w14:val="standardContextual"/>
             </w:rPr>
           </w:pPr>
-          <w:hyperlink w:anchor="_Toc227092713" w:history="1">
+          <w:hyperlink w:anchor="_Toc227166615" w:history="1">
             <w:r>
               <w:rPr>
                 <w:rStyle w:val="Hyperlink"/>
@@ -1853,7 +1853,7 @@
                 <w:noProof/>
                 <w:webHidden/>
               </w:rPr>
-              <w:instrText xml:space="preserve"> PAGEREF _Toc227092713 \h </w:instrText>
+              <w:instrText xml:space="preserve"> PAGEREF _Toc227166615 \h </w:instrText>
             </w:r>
             <w:r>
               <w:rPr>
@@ -1873,7 +1873,7 @@
                 <w:noProof/>
                 <w:webHidden/>
               </w:rPr>
-              <w:t>23</w:t>
+              <w:t>24</w:t>
             </w:r>
             <w:r>
               <w:rPr>
@@ -1899,7 +1899,7 @@
               <w14:ligatures w14:val="standardContextual"/>
             </w:rPr>
           </w:pPr>
-          <w:hyperlink w:anchor="_Toc227092714" w:history="1">
+          <w:hyperlink w:anchor="_Toc227166616" w:history="1">
             <w:r>
               <w:rPr>
                 <w:rStyle w:val="Hyperlink"/>
@@ -1926,7 +1926,7 @@
                 <w:noProof/>
                 <w:webHidden/>
               </w:rPr>
-              <w:instrText xml:space="preserve"> PAGEREF _Toc227092714 \h </w:instrText>
+              <w:instrText xml:space="preserve"> PAGEREF _Toc227166616 \h </w:instrText>
             </w:r>
             <w:r>
               <w:rPr>
@@ -1946,7 +1946,7 @@
                 <w:noProof/>
                 <w:webHidden/>
               </w:rPr>
-              <w:t>23</w:t>
+              <w:t>25</w:t>
             </w:r>
             <w:r>
               <w:rPr>
@@ -1972,13 +1972,13 @@
               <w14:ligatures w14:val="standardContextual"/>
             </w:rPr>
           </w:pPr>
-          <w:hyperlink w:anchor="_Toc227092715" w:history="1">
+          <w:hyperlink w:anchor="_Toc227166617" w:history="1">
             <w:r>
               <w:rPr>
                 <w:rStyle w:val="Hyperlink"/>
                 <w:noProof/>
               </w:rPr>
-              <w:t>9. Izvažanje</w:t>
+              <w:t>9. Izvoz</w:t>
             </w:r>
             <w:r>
               <w:rPr>
@@ -1999,7 +1999,7 @@
                 <w:noProof/>
                 <w:webHidden/>
               </w:rPr>
-              <w:instrText xml:space="preserve"> PAGEREF _Toc227092715 \h </w:instrText>
+              <w:instrText xml:space="preserve"> PAGEREF _Toc227166617 \h </w:instrText>
             </w:r>
             <w:r>
               <w:rPr>
@@ -2019,7 +2019,7 @@
                 <w:noProof/>
                 <w:webHidden/>
               </w:rPr>
-              <w:t>24</w:t>
+              <w:t>25</w:t>
             </w:r>
             <w:r>
               <w:rPr>
@@ -2045,7 +2045,7 @@
               <w14:ligatures w14:val="standardContextual"/>
             </w:rPr>
           </w:pPr>
-          <w:hyperlink w:anchor="_Toc227092716" w:history="1">
+          <w:hyperlink w:anchor="_Toc227166618" w:history="1">
             <w:r>
               <w:rPr>
                 <w:rStyle w:val="Hyperlink"/>
@@ -2072,7 +2072,7 @@
                 <w:noProof/>
                 <w:webHidden/>
               </w:rPr>
-              <w:instrText xml:space="preserve"> PAGEREF _Toc227092716 \h </w:instrText>
+              <w:instrText xml:space="preserve"> PAGEREF _Toc227166618 \h </w:instrText>
             </w:r>
             <w:r>
               <w:rPr>
@@ -2092,7 +2092,7 @@
                 <w:noProof/>
                 <w:webHidden/>
               </w:rPr>
-              <w:t>24</w:t>
+              <w:t>26</w:t>
             </w:r>
             <w:r>
               <w:rPr>
@@ -2118,13 +2118,13 @@
               <w14:ligatures w14:val="standardContextual"/>
             </w:rPr>
           </w:pPr>
-          <w:hyperlink w:anchor="_Toc227092717" w:history="1">
+          <w:hyperlink w:anchor="_Toc227166619" w:history="1">
             <w:r>
               <w:rPr>
                 <w:rStyle w:val="Hyperlink"/>
                 <w:noProof/>
               </w:rPr>
-              <w:t>11. Viri in literatura</w:t>
+              <w:t>11. Zaključek</w:t>
             </w:r>
             <w:r>
               <w:rPr>
@@ -2145,7 +2145,7 @@
                 <w:noProof/>
                 <w:webHidden/>
               </w:rPr>
-              <w:instrText xml:space="preserve"> PAGEREF _Toc227092717 \h </w:instrText>
+              <w:instrText xml:space="preserve"> PAGEREF _Toc227166619 \h </w:instrText>
             </w:r>
             <w:r>
               <w:rPr>
@@ -2165,7 +2165,7 @@
                 <w:noProof/>
                 <w:webHidden/>
               </w:rPr>
-              <w:t>24</w:t>
+              <w:t>27</w:t>
             </w:r>
             <w:r>
               <w:rPr>
@@ -2191,12 +2191,85 @@
               <w14:ligatures w14:val="standardContextual"/>
             </w:rPr>
           </w:pPr>
-          <w:hyperlink w:anchor="_Toc227092718" w:history="1">
+          <w:hyperlink w:anchor="_Toc227166620" w:history="1">
             <w:r>
               <w:rPr>
                 <w:rStyle w:val="Hyperlink"/>
                 <w:noProof/>
               </w:rPr>
+              <w:t>12. Viri in literatura</w:t>
+            </w:r>
+            <w:r>
+              <w:rPr>
+                <w:noProof/>
+                <w:webHidden/>
+              </w:rPr>
+              <w:tab/>
+            </w:r>
+            <w:r>
+              <w:rPr>
+                <w:noProof/>
+                <w:webHidden/>
+              </w:rPr>
+              <w:fldChar w:fldCharType="begin"/>
+            </w:r>
+            <w:r>
+              <w:rPr>
+                <w:noProof/>
+                <w:webHidden/>
+              </w:rPr>
+              <w:instrText xml:space="preserve"> PAGEREF _Toc227166620 \h </w:instrText>
+            </w:r>
+            <w:r>
+              <w:rPr>
+                <w:noProof/>
+                <w:webHidden/>
+              </w:rPr>
+            </w:r>
+            <w:r>
+              <w:rPr>
+                <w:noProof/>
+                <w:webHidden/>
+              </w:rPr>
+              <w:fldChar w:fldCharType="separate"/>
+            </w:r>
+            <w:r>
+              <w:rPr>
+                <w:noProof/>
+                <w:webHidden/>
+              </w:rPr>
+              <w:t>27</w:t>
+            </w:r>
+            <w:r>
+              <w:rPr>
+                <w:noProof/>
+                <w:webHidden/>
+              </w:rPr>
+              <w:fldChar w:fldCharType="end"/>
+            </w:r>
+          </w:hyperlink>
+        </w:p>
+        <w:p>
+          <w:pPr>
+            <w:pStyle w:val="TOC1"/>
+            <w:tabs>
+              <w:tab w:val="right" w:leader="dot" w:pos="9350"/>
+            </w:tabs>
+            <w:rPr>
+              <w:rFonts w:asciiTheme="minorHAnsi" w:eastAsiaTheme="minorEastAsia" w:hAnsiTheme="minorHAnsi" w:cstheme="minorBidi"/>
+              <w:noProof/>
+              <w:color w:val="auto"/>
+              <w:kern w:val="2"/>
+              <w:lang w:val="en-SI" w:eastAsia="en-SI"/>
+              <w14:ligatures w14:val="standardContextual"/>
+            </w:rPr>
+          </w:pPr>
+          <w:hyperlink w:anchor="_Toc227166621" w:history="1">
+            <w:r>
+              <w:rPr>
+                <w:rStyle w:val="Hyperlink"/>
+                <w:noProof/>
+              </w:rPr>
               <w:t>IZJAVA O AVTORSTVU</w:t>
             </w:r>
             <w:r>
@@ -2218,7 +2291,7 @@
                 <w:noProof/>
                 <w:webHidden/>
               </w:rPr>
-              <w:instrText xml:space="preserve"> PAGEREF _Toc227092718 \h </w:instrText>
+              <w:instrText xml:space="preserve"> PAGEREF _Toc227166621 \h </w:instrText>
             </w:r>
             <w:r>
               <w:rPr>
@@ -2238,7 +2311,7 @@
                 <w:noProof/>
                 <w:webHidden/>
               </w:rPr>
-              <w:t>25</w:t>
+              <w:t>28</w:t>
             </w:r>
             <w:r>
               <w:rPr>
@@ -2262,17 +2335,12 @@
       </w:sdtContent>
     </w:sdt>
     <w:p>
-      <w:r>
-        <w:br w:type="page"/>
-      </w:r>
-    </w:p>
-    <w:p>
       <w:pPr>
         <w:pStyle w:val="Heading1"/>
       </w:pPr>
       <w:bookmarkStart w:id="11" w:name="_Toc226486566"/>
       <w:bookmarkStart w:id="12" w:name="_Toc226486629"/>
-      <w:bookmarkStart w:id="13" w:name="_Toc227092693"/>
+      <w:bookmarkStart w:id="13" w:name="_Toc227166595"/>
       <w:r>
         <w:lastRenderedPageBreak/>
         <w:t>1. Uvod</w:t>
@@ -2376,7 +2444,7 @@
       </w:pPr>
       <w:bookmarkStart w:id="14" w:name="_Toc226486567"/>
       <w:bookmarkStart w:id="15" w:name="_Toc226486630"/>
-      <w:bookmarkStart w:id="16" w:name="_Toc227092694"/>
+      <w:bookmarkStart w:id="16" w:name="_Toc227166596"/>
       <w:r>
         <w:t>2. Izbira orodij in programskih jezikov</w:t>
       </w:r>
@@ -2586,7 +2654,7 @@
       </w:pPr>
       <w:bookmarkStart w:id="20" w:name="_Toc226486568"/>
       <w:bookmarkStart w:id="21" w:name="_Toc226486631"/>
-      <w:bookmarkStart w:id="22" w:name="_Toc227092695"/>
+      <w:bookmarkStart w:id="22" w:name="_Toc227166597"/>
       <w:r>
         <w:lastRenderedPageBreak/>
         <w:t>3. O aplikaciji</w:t>
@@ -2828,7 +2896,7 @@
       <w:pPr>
         <w:pStyle w:val="Heading1"/>
       </w:pPr>
-      <w:bookmarkStart w:id="23" w:name="_Toc227092696"/>
+      <w:bookmarkStart w:id="23" w:name="_Toc227166598"/>
       <w:r>
         <w:lastRenderedPageBreak/>
         <w:t xml:space="preserve">4. </w:t>
@@ -2917,7 +2985,7 @@
       <w:pPr>
         <w:pStyle w:val="Heading2"/>
       </w:pPr>
-      <w:bookmarkStart w:id="25" w:name="_Toc227092697"/>
+      <w:bookmarkStart w:id="25" w:name="_Toc227166599"/>
       <w:r>
         <w:t>4. 1. Konstrukcija modela</w:t>
       </w:r>
@@ -3137,7 +3205,7 @@
       <w:pPr>
         <w:pStyle w:val="Heading2"/>
       </w:pPr>
-      <w:bookmarkStart w:id="28" w:name="_Toc227092698"/>
+      <w:bookmarkStart w:id="28" w:name="_Toc227166600"/>
       <w:r>
         <w:lastRenderedPageBreak/>
         <w:t xml:space="preserve">4. 2. </w:t>
@@ -3382,7 +3450,7 @@
       <w:pPr>
         <w:pStyle w:val="Heading2"/>
       </w:pPr>
-      <w:bookmarkStart w:id="31" w:name="_Toc227092699"/>
+      <w:bookmarkStart w:id="31" w:name="_Toc227166601"/>
       <w:r>
         <w:lastRenderedPageBreak/>
         <w:t xml:space="preserve">4. 2. </w:t>
@@ -3439,7 +3507,7 @@
       <w:pPr>
         <w:pStyle w:val="Heading3"/>
       </w:pPr>
-      <w:bookmarkStart w:id="32" w:name="_Toc227092700"/>
+      <w:bookmarkStart w:id="32" w:name="_Toc227166602"/>
       <w:r>
         <w:t>4. 2. 1. Kamera</w:t>
       </w:r>
@@ -3905,7 +3973,7 @@
       <w:pPr>
         <w:pStyle w:val="Heading3"/>
       </w:pPr>
-      <w:bookmarkStart w:id="35" w:name="_Toc227092701"/>
+      <w:bookmarkStart w:id="35" w:name="_Toc227166603"/>
       <w:r>
         <w:t xml:space="preserve">4. 2. 2. </w:t>
       </w:r>
@@ -4045,7 +4113,7 @@
       <w:pPr>
         <w:pStyle w:val="Heading2"/>
       </w:pPr>
-      <w:bookmarkStart w:id="36" w:name="_Toc227092702"/>
+      <w:bookmarkStart w:id="36" w:name="_Toc227166604"/>
       <w:r>
         <w:lastRenderedPageBreak/>
         <w:t>4. 3. Urejevalnik</w:t>
@@ -4197,7 +4265,7 @@
       <w:pPr>
         <w:pStyle w:val="Heading1"/>
       </w:pPr>
-      <w:bookmarkStart w:id="37" w:name="_Toc227092703"/>
+      <w:bookmarkStart w:id="37" w:name="_Toc227166605"/>
       <w:r>
         <w:lastRenderedPageBreak/>
         <w:t xml:space="preserve">5. </w:t>
@@ -4242,7 +4310,7 @@
       <w:pPr>
         <w:pStyle w:val="Heading2"/>
       </w:pPr>
-      <w:bookmarkStart w:id="38" w:name="_Toc227092704"/>
+      <w:bookmarkStart w:id="38" w:name="_Toc227166606"/>
       <w:r>
         <w:t>5. 1.  Vozlišče (node)</w:t>
       </w:r>
@@ -4665,7 +4733,7 @@
       <w:pPr>
         <w:pStyle w:val="Heading2"/>
       </w:pPr>
-      <w:bookmarkStart w:id="41" w:name="_Toc227092705"/>
+      <w:bookmarkStart w:id="41" w:name="_Toc227166607"/>
       <w:r>
         <w:t xml:space="preserve">5. 2. </w:t>
       </w:r>
@@ -5484,7 +5552,7 @@
       <w:pPr>
         <w:pStyle w:val="Heading1"/>
       </w:pPr>
-      <w:bookmarkStart w:id="48" w:name="_Toc227092706"/>
+      <w:bookmarkStart w:id="48" w:name="_Toc227166608"/>
       <w:r>
         <w:lastRenderedPageBreak/>
         <w:t>6. Inšpektor vozlišč</w:t>
@@ -5713,7 +5781,7 @@
       <w:pPr>
         <w:pStyle w:val="Heading1"/>
       </w:pPr>
-      <w:bookmarkStart w:id="50" w:name="_Toc227092707"/>
+      <w:bookmarkStart w:id="50" w:name="_Toc227166609"/>
       <w:r>
         <w:lastRenderedPageBreak/>
         <w:t xml:space="preserve">7. </w:t>
@@ -6234,7 +6302,7 @@
       <w:pPr>
         <w:pStyle w:val="Heading1"/>
       </w:pPr>
-      <w:bookmarkStart w:id="53" w:name="_Toc227092708"/>
+      <w:bookmarkStart w:id="53" w:name="_Toc227166610"/>
       <w:r>
         <w:lastRenderedPageBreak/>
         <w:t xml:space="preserve">8. Generacija terena in vrste </w:t>
@@ -6276,7 +6344,7 @@
       <w:pPr>
         <w:pStyle w:val="Heading2"/>
       </w:pPr>
-      <w:bookmarkStart w:id="55" w:name="_Toc227092709"/>
+      <w:bookmarkStart w:id="55" w:name="_Toc227166611"/>
       <w:r>
         <w:t>8. 1. Osnovna elevacija</w:t>
       </w:r>
@@ -6916,7 +6984,7 @@
       <w:pPr>
         <w:pStyle w:val="Heading2"/>
       </w:pPr>
-      <w:bookmarkStart w:id="63" w:name="_Toc227092710"/>
+      <w:bookmarkStart w:id="63" w:name="_Toc227166612"/>
       <w:r>
         <w:t xml:space="preserve">8. 2. </w:t>
       </w:r>
@@ -6950,7 +7018,7 @@
       <w:r>
         <w:br w:type="page"/>
       </w:r>
-      <w:bookmarkStart w:id="64" w:name="_Toc227092711"/>
+      <w:bookmarkStart w:id="64" w:name="_Toc227166613"/>
       <w:r>
         <w:lastRenderedPageBreak/>
         <w:t xml:space="preserve">8. 3. </w:t>
@@ -7438,7 +7506,7 @@
       <w:pPr>
         <w:pStyle w:val="Heading2"/>
       </w:pPr>
-      <w:bookmarkStart w:id="69" w:name="_Toc227092712"/>
+      <w:bookmarkStart w:id="69" w:name="_Toc227166614"/>
       <w:r>
         <w:lastRenderedPageBreak/>
         <w:t>8. 4. Terase</w:t>
@@ -7612,19 +7680,7 @@
                     <w:rPr>
                       <w:rFonts w:ascii="Cambria Math" w:hAnsi="Cambria Math"/>
                     </w:rPr>
-                    <m:t xml:space="preserve"> </m:t>
-                  </m:r>
-                  <m:r>
-                    <w:rPr>
-                      <w:rFonts w:ascii="Cambria Math" w:hAnsi="Cambria Math"/>
-                    </w:rPr>
-                    <m:t>+ 0.5</m:t>
-                  </m:r>
-                  <m:r>
-                    <w:rPr>
-                      <w:rFonts w:ascii="Cambria Math" w:hAnsi="Cambria Math"/>
-                    </w:rPr>
-                    <m:t>*</m:t>
+                    <m:t xml:space="preserve"> + 0.5*</m:t>
                   </m:r>
                   <m:d>
                     <m:dPr>
@@ -7692,19 +7748,7 @@
                                 <w:rPr>
                                   <w:rFonts w:ascii="Cambria Math" w:hAnsi="Cambria Math"/>
                                 </w:rPr>
-                                <m:t xml:space="preserve"> - </m:t>
-                              </m:r>
-                              <m:r>
-                                <w:rPr>
-                                  <w:rFonts w:ascii="Cambria Math" w:hAnsi="Cambria Math"/>
-                                </w:rPr>
-                                <m:t>r</m:t>
-                              </m:r>
-                              <m:r>
-                                <w:rPr>
-                                  <w:rFonts w:ascii="Cambria Math" w:hAnsi="Cambria Math"/>
-                                </w:rPr>
-                                <m:t>ound</m:t>
+                                <m:t xml:space="preserve"> - round</m:t>
                               </m:r>
                               <m:d>
                                 <m:dPr>
@@ -7817,6 +7861,9 @@
         <w:keepNext/>
       </w:pPr>
       <w:r>
+        <w:rPr>
+          <w:noProof/>
+        </w:rPr>
         <w:drawing>
           <wp:inline distT="0" distB="0" distL="0" distR="0" wp14:anchorId="6A3871B8" wp14:editId="014DD2C2">
             <wp:extent cx="2733675" cy="1819239"/>
@@ -7854,6 +7901,9 @@
         </w:drawing>
       </w:r>
       <w:r>
+        <w:rPr>
+          <w:noProof/>
+        </w:rPr>
         <w:drawing>
           <wp:inline distT="0" distB="0" distL="0" distR="0" wp14:anchorId="73E79D91" wp14:editId="1794BE56">
             <wp:extent cx="2780491" cy="1817370"/>
@@ -7970,11 +8020,869 @@
       <w:pPr>
         <w:pStyle w:val="Heading2"/>
       </w:pPr>
-      <w:bookmarkStart w:id="70" w:name="_Toc227092713"/>
+      <w:bookmarkStart w:id="70" w:name="_Toc227166615"/>
       <w:r>
         <w:t>8. 5. Simulacija erozije</w:t>
       </w:r>
       <w:bookmarkEnd w:id="70"/>
+    </w:p>
+    <w:p/>
+    <w:p>
+      <w:r>
+        <w:t>V naravi je erozija izjemno pomemben dejavnik pri oblikovanju terena. Najbolj opazna oblika erozije je verjetno hidravlična erozija, ki nastane zaradi tekoče vode, ki oblikuje teren.</w:t>
+      </w:r>
+      <w:r>
+        <w:t xml:space="preserve"> </w:t>
+      </w:r>
+      <w:r>
+        <w:t>Ko dežne kapljice padejo na teren in po njem tečejo ga obrabljajo in znižujejo. Med tem ko kapljice tečejo navzdol nabirajo v sebi delce, ki jih kličemo sediment. Kjer teren ni več strm, voda teče počasneje in sediment v kapljicah se odloži, kar poviša teren v tisti točki.</w:t>
+      </w:r>
+    </w:p>
+    <w:p>
+      <w:pPr>
+        <w:jc w:val="left"/>
+      </w:pPr>
+      <w:r>
+        <w:br w:type="page"/>
+      </w:r>
+    </w:p>
+    <w:p>
+      <w:r>
+        <w:lastRenderedPageBreak/>
+        <w:t>Hidravlično erozijo se lahko simulira na več načinov</w:t>
+      </w:r>
+      <w:r>
+        <w:t xml:space="preserve">. V tej aplikaciji je uporabljen način, ki </w:t>
+      </w:r>
+      <w:r>
+        <w:t>simulira vsak delec vode posamezno</w:t>
+      </w:r>
+      <w:r>
+        <w:t>. Ta način je relativno</w:t>
+      </w:r>
+      <w:r>
+        <w:t xml:space="preserve"> počas</w:t>
+      </w:r>
+      <w:r>
+        <w:t>en in</w:t>
+      </w:r>
+      <w:r>
+        <w:t xml:space="preserve"> </w:t>
+      </w:r>
+      <w:r>
+        <w:t>z</w:t>
+      </w:r>
+      <w:r>
+        <w:t xml:space="preserve">a doseg </w:t>
+      </w:r>
+      <w:r>
+        <w:t xml:space="preserve">dobrih </w:t>
+      </w:r>
+      <w:r>
+        <w:t xml:space="preserve">rezultatov </w:t>
+      </w:r>
+      <w:r>
+        <w:t xml:space="preserve">je treba </w:t>
+      </w:r>
+      <w:r>
+        <w:t>simulirati več tisoč kapljic</w:t>
+      </w:r>
+      <w:r>
+        <w:t>, vendar za namene te aplikacije je zadovoljiv.</w:t>
+      </w:r>
+    </w:p>
+    <w:p>
+      <w:r>
+        <w:t xml:space="preserve">Funkcionalnost vozlišča za erozijo večkrat naključno na teren postavi delec vode. Kapljica se </w:t>
+      </w:r>
+      <w:r>
+        <w:t>giblje</w:t>
+      </w:r>
+      <w:r>
+        <w:t xml:space="preserve"> glede na izračunan gradient spremembe višine. Ko se premika navzdol niža teren in povečuje količino sedimenta, ki ga vsebuje. Če preseže svojo kapaciteto sedimenta, se ga nekaj odloži nazaj na teren. </w:t>
+      </w:r>
+    </w:p>
+    <w:p>
+      <w:r>
+        <w:t xml:space="preserve">Da kapljica lahko niža teren vse okoli sebe in ne samo na točki kjer se nahaja se uporablja </w:t>
+      </w:r>
+      <w:r>
+        <w:t>»</w:t>
+      </w:r>
+      <w:r>
+        <w:t>brush</w:t>
+      </w:r>
+      <w:r>
+        <w:t>«</w:t>
+      </w:r>
+      <w:r>
+        <w:t>, ki ima shranjene vse celice terena, na katere lahko iz trenutne pozicije kapljice erozija vpliva.</w:t>
+      </w:r>
+      <w:r>
+        <w:t xml:space="preserve"> Odlaganje sedimenta tega sistema ne uporablja.</w:t>
+      </w:r>
+    </w:p>
+    <w:p>
+      <w:pPr>
+        <w:keepNext/>
+      </w:pPr>
+      <w:r>
+        <w:drawing>
+          <wp:inline distT="0" distB="0" distL="0" distR="0" wp14:anchorId="5D76D0A2" wp14:editId="3C68A708">
+            <wp:extent cx="5943600" cy="2518410"/>
+            <wp:effectExtent l="0" t="0" r="0" b="0"/>
+            <wp:docPr id="1091867451" name="Picture 1"/>
+            <wp:cNvGraphicFramePr>
+              <a:graphicFrameLocks xmlns:a="http://schemas.openxmlformats.org/drawingml/2006/main" noChangeAspect="1"/>
+            </wp:cNvGraphicFramePr>
+            <a:graphic xmlns:a="http://schemas.openxmlformats.org/drawingml/2006/main">
+              <a:graphicData uri="http://schemas.openxmlformats.org/drawingml/2006/picture">
+                <pic:pic xmlns:pic="http://schemas.openxmlformats.org/drawingml/2006/picture">
+                  <pic:nvPicPr>
+                    <pic:cNvPr id="1091867451" name=""/>
+                    <pic:cNvPicPr/>
+                  </pic:nvPicPr>
+                  <pic:blipFill>
+                    <a:blip r:embed="rId46"/>
+                    <a:stretch>
+                      <a:fillRect/>
+                    </a:stretch>
+                  </pic:blipFill>
+                  <pic:spPr>
+                    <a:xfrm>
+                      <a:off x="0" y="0"/>
+                      <a:ext cx="5943600" cy="2518410"/>
+                    </a:xfrm>
+                    <a:prstGeom prst="rect">
+                      <a:avLst/>
+                    </a:prstGeom>
+                  </pic:spPr>
+                </pic:pic>
+              </a:graphicData>
+            </a:graphic>
+          </wp:inline>
+        </w:drawing>
+      </w:r>
+    </w:p>
+    <w:p>
+      <w:pPr>
+        <w:pStyle w:val="Caption"/>
+      </w:pPr>
+      <w:r>
+        <w:t xml:space="preserve">Slika </w:t>
+      </w:r>
+      <w:r>
+        <w:fldChar w:fldCharType="begin"/>
+      </w:r>
+      <w:r>
+        <w:instrText xml:space="preserve"> SEQ Slika \* ARABIC </w:instrText>
+      </w:r>
+      <w:r>
+        <w:fldChar w:fldCharType="separate"/>
+      </w:r>
+      <w:r>
+        <w:rPr>
+          <w:noProof/>
+        </w:rPr>
+        <w:t>34</w:t>
+      </w:r>
+      <w:r>
+        <w:fldChar w:fldCharType="end"/>
+      </w:r>
+      <w:r>
+        <w:t xml:space="preserve"> Erozija in odlaganje sedimenta</w:t>
+      </w:r>
+    </w:p>
+    <w:p>
+      <w:pPr>
+        <w:pStyle w:val="Heading2"/>
+      </w:pPr>
+      <w:bookmarkStart w:id="71" w:name="_Toc227166616"/>
+      <w:r>
+        <w:t>8. 6. Ostale funkcionalnost</w:t>
+      </w:r>
+      <w:r>
+        <w:t>i</w:t>
+      </w:r>
+      <w:bookmarkEnd w:id="71"/>
+    </w:p>
+    <w:p/>
+    <w:p>
+      <w:r>
+        <w:t>Aplikacija vsebuje tudi številna druga vozlišča s svojimi funkcionalnosti.</w:t>
+      </w:r>
+      <w:r>
+        <w:t xml:space="preserve"> </w:t>
+      </w:r>
+      <w:r>
+        <w:t xml:space="preserve">Te </w:t>
+      </w:r>
+      <w:r>
+        <w:t>so:</w:t>
+      </w:r>
+    </w:p>
+    <w:p>
+      <w:pPr>
+        <w:pStyle w:val="ListParagraph"/>
+        <w:numPr>
+          <w:ilvl w:val="0"/>
+          <w:numId w:val="7"/>
+        </w:numPr>
+      </w:pPr>
+      <w:r>
+        <w:t>Funkcionalnost za združevanje</w:t>
+      </w:r>
+      <w:r>
+        <w:t>, ki</w:t>
+      </w:r>
+      <w:r>
+        <w:t xml:space="preserve"> sešteje vse vnose in je namenjeno združevanju posameznih plasti terena.</w:t>
+      </w:r>
+    </w:p>
+    <w:p>
+      <w:pPr>
+        <w:pStyle w:val="ListParagraph"/>
+        <w:numPr>
+          <w:ilvl w:val="0"/>
+          <w:numId w:val="7"/>
+        </w:numPr>
+      </w:pPr>
+      <w:r>
+        <w:t xml:space="preserve">Funkcionalnost, ki na več izhodov posreduje vrednost enega izhoda. Ta je uporabna v primeru, ko hočemo </w:t>
+      </w:r>
+      <w:r>
+        <w:t>izhod vozlišča uporabiti za več stvari</w:t>
+      </w:r>
+      <w:r>
+        <w:t xml:space="preserve">, npr. </w:t>
+      </w:r>
+      <w:r>
+        <w:t>teren</w:t>
+      </w:r>
+      <w:r>
+        <w:t xml:space="preserve"> se uporabi</w:t>
+      </w:r>
+      <w:r>
+        <w:t xml:space="preserve"> tudi kot </w:t>
+      </w:r>
+      <w:r>
+        <w:t>mask</w:t>
+      </w:r>
+      <w:r>
+        <w:t>a</w:t>
+      </w:r>
+      <w:r>
+        <w:t>.</w:t>
+      </w:r>
+    </w:p>
+    <w:p>
+      <w:pPr>
+        <w:jc w:val="left"/>
+      </w:pPr>
+      <w:r>
+        <w:br w:type="page"/>
+      </w:r>
+    </w:p>
+    <w:p>
+      <w:pPr>
+        <w:pStyle w:val="ListParagraph"/>
+        <w:numPr>
+          <w:ilvl w:val="0"/>
+          <w:numId w:val="7"/>
+        </w:numPr>
+      </w:pPr>
+      <w:r>
+        <w:lastRenderedPageBreak/>
+        <w:t xml:space="preserve">Funkcionalnost za normalizacijo, ki normalizira teren. </w:t>
+      </w:r>
+      <w:r>
+        <w:t>Prejšnja najvišja vrednost postane najvišja možna vrednost in prejšnja najnižja vrednost postane najnižja možna vrednost.</w:t>
+      </w:r>
+      <w:r>
+        <w:t xml:space="preserve"> </w:t>
+      </w:r>
+      <w:r>
+        <w:t>Ta funkcionalnost je u</w:t>
+      </w:r>
+      <w:r>
+        <w:t>porabn</w:t>
+      </w:r>
+      <w:r>
+        <w:t>a</w:t>
+      </w:r>
+      <w:r>
+        <w:t>, ko</w:t>
+      </w:r>
+      <w:r>
+        <w:t xml:space="preserve"> želimo</w:t>
+      </w:r>
+      <w:r>
+        <w:t>, da teren pokriva</w:t>
+      </w:r>
+      <w:r>
+        <w:t xml:space="preserve"> vse</w:t>
+      </w:r>
+      <w:r>
+        <w:t xml:space="preserve"> vrednosti od 0 do 1.</w:t>
+      </w:r>
+    </w:p>
+    <w:p>
+      <w:pPr>
+        <w:pStyle w:val="ListParagraph"/>
+        <w:numPr>
+          <w:ilvl w:val="0"/>
+          <w:numId w:val="7"/>
+        </w:numPr>
+      </w:pPr>
+      <w:r>
+        <w:t>Funkcionalnost za naknadno uporabo maske</w:t>
+      </w:r>
+    </w:p>
+    <w:p>
+      <w:pPr>
+        <w:pStyle w:val="ListParagraph"/>
+        <w:numPr>
+          <w:ilvl w:val="0"/>
+          <w:numId w:val="7"/>
+        </w:numPr>
+      </w:pPr>
+      <w:r>
+        <w:t>Funkcionalnost za ustvarjanje gradientne maske, ki ustvari masko glede na uporabnikovo izbiro</w:t>
+      </w:r>
+      <w:r>
+        <w:t xml:space="preserve"> oblike</w:t>
+      </w:r>
+      <w:r>
+        <w:t xml:space="preserve">. </w:t>
+      </w:r>
+      <w:r>
+        <w:t>Ta funkcionalnost je uporabna, ko želimo da se robovi terena bližajo vrednosti 0</w:t>
+      </w:r>
+      <w:r>
+        <w:t>. Nizki robovi</w:t>
+      </w:r>
+      <w:r>
+        <w:t xml:space="preserve"> pomaga</w:t>
+      </w:r>
+      <w:r>
+        <w:t xml:space="preserve">jo </w:t>
+      </w:r>
+      <w:r>
+        <w:t>pri integraciji terena v medije.</w:t>
+      </w:r>
+    </w:p>
+    <w:p>
+      <w:pPr>
+        <w:pStyle w:val="ListParagraph"/>
+        <w:numPr>
+          <w:ilvl w:val="0"/>
+          <w:numId w:val="7"/>
+        </w:numPr>
+      </w:pPr>
+      <w:r>
+        <w:t>Funkcionalnost za izvažanje, ki omogoča izvažanje terena</w:t>
+      </w:r>
+    </w:p>
+    <w:p>
+      <w:pPr>
+        <w:pStyle w:val="Heading1"/>
+      </w:pPr>
+      <w:bookmarkStart w:id="72" w:name="_Toc227166617"/>
+      <w:r>
+        <w:t xml:space="preserve">9. </w:t>
+      </w:r>
+      <w:r>
+        <w:t>Izvoz</w:t>
+      </w:r>
+      <w:bookmarkEnd w:id="72"/>
+    </w:p>
+    <w:p/>
+    <w:p>
+      <w:r>
+        <w:t>Za uporabo generiranega terena v drugih medijih ga je potrebno iz aplikacije izvoziti. To omogoča vozlišče za izvoz. Ker je njegova naloga izvoz končnega rezultata nima izhodov in se uporablja na koncu, ko so vse predhodne operacije že bile izvedene nad terenom.</w:t>
+      </w:r>
+      <w:r>
+        <w:t xml:space="preserve"> </w:t>
+      </w:r>
+      <w:r>
+        <w:t>Teren je mogoče izvoziti kot sliko v obliki višinskega zemljevida ali kot 3D model v formatu .glb.</w:t>
+      </w:r>
+      <w:r>
+        <w:t xml:space="preserve"> </w:t>
+      </w:r>
+      <w:r>
+        <w:t>Ko se teren izvaža kot višinski zemljevid, funkcionalnost vozlišča za izvoz po generiranju terena ustvari sliko, kjer vsakemu pikslu posebej nastavi vrednost glede na višino ustrezne celice terena.</w:t>
+      </w:r>
+    </w:p>
+    <w:p>
+      <w:pPr>
+        <w:keepNext/>
+      </w:pPr>
+      <w:r>
+        <w:drawing>
+          <wp:inline distT="0" distB="0" distL="0" distR="0" wp14:anchorId="3E669F78" wp14:editId="5B2B3838">
+            <wp:extent cx="3343275" cy="1112136"/>
+            <wp:effectExtent l="0" t="0" r="0" b="0"/>
+            <wp:docPr id="1158468161" name="Picture 1"/>
+            <wp:cNvGraphicFramePr>
+              <a:graphicFrameLocks xmlns:a="http://schemas.openxmlformats.org/drawingml/2006/main" noChangeAspect="1"/>
+            </wp:cNvGraphicFramePr>
+            <a:graphic xmlns:a="http://schemas.openxmlformats.org/drawingml/2006/main">
+              <a:graphicData uri="http://schemas.openxmlformats.org/drawingml/2006/picture">
+                <pic:pic xmlns:pic="http://schemas.openxmlformats.org/drawingml/2006/picture">
+                  <pic:nvPicPr>
+                    <pic:cNvPr id="1158468161" name=""/>
+                    <pic:cNvPicPr/>
+                  </pic:nvPicPr>
+                  <pic:blipFill>
+                    <a:blip r:embed="rId47"/>
+                    <a:stretch>
+                      <a:fillRect/>
+                    </a:stretch>
+                  </pic:blipFill>
+                  <pic:spPr>
+                    <a:xfrm>
+                      <a:off x="0" y="0"/>
+                      <a:ext cx="3346886" cy="1113337"/>
+                    </a:xfrm>
+                    <a:prstGeom prst="rect">
+                      <a:avLst/>
+                    </a:prstGeom>
+                  </pic:spPr>
+                </pic:pic>
+              </a:graphicData>
+            </a:graphic>
+          </wp:inline>
+        </w:drawing>
+      </w:r>
+    </w:p>
+    <w:p>
+      <w:pPr>
+        <w:pStyle w:val="Caption"/>
+      </w:pPr>
+      <w:r>
+        <w:t xml:space="preserve">Slika </w:t>
+      </w:r>
+      <w:r>
+        <w:fldChar w:fldCharType="begin"/>
+      </w:r>
+      <w:r>
+        <w:instrText xml:space="preserve"> SEQ Slika \* ARABIC </w:instrText>
+      </w:r>
+      <w:r>
+        <w:fldChar w:fldCharType="separate"/>
+      </w:r>
+      <w:r>
+        <w:rPr>
+          <w:noProof/>
+        </w:rPr>
+        <w:t>35</w:t>
+      </w:r>
+      <w:r>
+        <w:fldChar w:fldCharType="end"/>
+      </w:r>
+      <w:r>
+        <w:t xml:space="preserve"> Odlomek generacije slike višinskega zemljevida</w:t>
+      </w:r>
+    </w:p>
+    <w:p>
+      <w:r>
+        <w:t xml:space="preserve">Če teren shranjujemo kot model dejanski izvoz poteka na skripti vizualizacije terena. </w:t>
+      </w:r>
+      <w:r>
+        <w:t>Ta uporabi funkcijo</w:t>
+      </w:r>
+      <w:r>
+        <w:t xml:space="preserve"> </w:t>
+      </w:r>
+      <w:r>
+        <w:rPr>
+          <w:i/>
+          <w:iCs/>
+          <w:lang w:val="en-SI"/>
+        </w:rPr>
+        <w:t>generate_export_terrain</w:t>
+      </w:r>
+      <w:r>
+        <w:t xml:space="preserve">, </w:t>
+      </w:r>
+      <w:r>
+        <w:t xml:space="preserve">ki je </w:t>
+      </w:r>
+      <w:r>
+        <w:t>podobn</w:t>
+      </w:r>
+      <w:r>
+        <w:t xml:space="preserve">a </w:t>
+      </w:r>
+      <w:r>
+        <w:t>funkciji za konstrukcijo modela, saj obe</w:t>
+      </w:r>
+      <w:r>
+        <w:t xml:space="preserve"> naredita model</w:t>
+      </w:r>
+      <w:r>
+        <w:t>.</w:t>
+      </w:r>
+      <w:r>
+        <w:t xml:space="preserve"> Funkcija za izvoz pa dodatno še izvozi model terena s pomočjo razredov za upravljanje z </w:t>
+      </w:r>
+      <w:r>
+        <w:t>GLTF</w:t>
+      </w:r>
+      <w:r>
+        <w:t xml:space="preserve"> datotekami.</w:t>
+      </w:r>
+    </w:p>
+    <w:p>
+      <w:pPr>
+        <w:jc w:val="left"/>
+      </w:pPr>
+      <w:r>
+        <w:br w:type="page"/>
+      </w:r>
+    </w:p>
+    <w:p>
+      <w:pPr>
+        <w:keepNext/>
+      </w:pPr>
+      <w:r>
+        <w:rPr>
+          <w:lang w:val="en-SI"/>
+        </w:rPr>
+        <w:lastRenderedPageBreak/>
+        <w:drawing>
+          <wp:inline distT="0" distB="0" distL="0" distR="0" wp14:anchorId="5B8AEE04" wp14:editId="13C1B410">
+            <wp:extent cx="2788285" cy="1943085"/>
+            <wp:effectExtent l="0" t="0" r="0" b="635"/>
+            <wp:docPr id="160967560" name="Picture 1"/>
+            <wp:cNvGraphicFramePr>
+              <a:graphicFrameLocks xmlns:a="http://schemas.openxmlformats.org/drawingml/2006/main" noChangeAspect="1"/>
+            </wp:cNvGraphicFramePr>
+            <a:graphic xmlns:a="http://schemas.openxmlformats.org/drawingml/2006/main">
+              <a:graphicData uri="http://schemas.openxmlformats.org/drawingml/2006/picture">
+                <pic:pic xmlns:pic="http://schemas.openxmlformats.org/drawingml/2006/picture">
+                  <pic:nvPicPr>
+                    <pic:cNvPr id="160967560" name=""/>
+                    <pic:cNvPicPr/>
+                  </pic:nvPicPr>
+                  <pic:blipFill rotWithShape="1">
+                    <a:blip r:embed="rId48"/>
+                    <a:srcRect l="5851" t="11281" r="4997" b="10103"/>
+                    <a:stretch>
+                      <a:fillRect/>
+                    </a:stretch>
+                  </pic:blipFill>
+                  <pic:spPr bwMode="auto">
+                    <a:xfrm>
+                      <a:off x="0" y="0"/>
+                      <a:ext cx="2807098" cy="1956195"/>
+                    </a:xfrm>
+                    <a:prstGeom prst="rect">
+                      <a:avLst/>
+                    </a:prstGeom>
+                    <a:ln>
+                      <a:noFill/>
+                    </a:ln>
+                    <a:extLst>
+                      <a:ext uri="{53640926-AAD7-44D8-BBD7-CCE9431645EC}">
+                        <a14:shadowObscured xmlns:a14="http://schemas.microsoft.com/office/drawing/2010/main"/>
+                      </a:ext>
+                    </a:extLst>
+                  </pic:spPr>
+                </pic:pic>
+              </a:graphicData>
+            </a:graphic>
+          </wp:inline>
+        </w:drawing>
+      </w:r>
+    </w:p>
+    <w:p>
+      <w:pPr>
+        <w:pStyle w:val="Caption"/>
+      </w:pPr>
+      <w:r>
+        <w:t xml:space="preserve">Slika </w:t>
+      </w:r>
+      <w:r>
+        <w:fldChar w:fldCharType="begin"/>
+      </w:r>
+      <w:r>
+        <w:instrText xml:space="preserve"> SEQ Slika \* ARABIC </w:instrText>
+      </w:r>
+      <w:r>
+        <w:fldChar w:fldCharType="separate"/>
+      </w:r>
+      <w:r>
+        <w:rPr>
+          <w:noProof/>
+        </w:rPr>
+        <w:t>36</w:t>
+      </w:r>
+      <w:r>
+        <w:fldChar w:fldCharType="end"/>
+      </w:r>
+      <w:r>
+        <w:t xml:space="preserve"> </w:t>
+      </w:r>
+      <w:r>
+        <w:t>Model terena, uvožen v program Blender</w:t>
+      </w:r>
+    </w:p>
+    <w:p>
+      <w:pPr>
+        <w:pStyle w:val="Heading1"/>
+      </w:pPr>
+      <w:bookmarkStart w:id="73" w:name="_Toc227166618"/>
+      <w:r>
+        <w:t xml:space="preserve">10. </w:t>
+      </w:r>
+      <w:r>
+        <w:t>Shranjevanje</w:t>
+      </w:r>
+      <w:bookmarkEnd w:id="73"/>
+    </w:p>
+    <w:p/>
+    <w:p>
+      <w:pPr>
+        <w:keepNext/>
+      </w:pPr>
+      <w:r>
+        <w:t>Trenutni projekt lahko uporabnik tudi shrani v datoteko. V datoteki so shranjeni podatki o vseh vozliščih, njihovih povezavah in nastavitvah. Shranijo se tudi nastavitve projekta, kot je na primer velikost terena. Projekt se kasneje lahko uvozi in naložijo se nastavitve in vsa vozlišča, kot so bila nastavljena ob shranjevanju.</w:t>
+      </w:r>
+    </w:p>
+    <w:p>
+      <w:pPr>
+        <w:keepNext/>
+      </w:pPr>
+      <w:r>
+        <w:t xml:space="preserve"> Shranjevanje in uvažanje nadzira urejevalniku podrejen objekt </w:t>
+      </w:r>
+      <w:r>
+        <w:rPr>
+          <w:i/>
+          <w:iCs/>
+        </w:rPr>
+        <w:t>NodeLoadingManager</w:t>
+      </w:r>
+      <w:r>
+        <w:t xml:space="preserve">. Ob shranjevanju skripta objekta </w:t>
+      </w:r>
+      <w:r>
+        <w:rPr>
+          <w:i/>
+          <w:iCs/>
+        </w:rPr>
+        <w:t>NodeLoadingManager</w:t>
+      </w:r>
+      <w:r>
+        <w:rPr>
+          <w:i/>
+          <w:iCs/>
+        </w:rPr>
+        <w:t xml:space="preserve"> </w:t>
+      </w:r>
+      <w:r>
+        <w:t>serializira vsa vozlišča</w:t>
+      </w:r>
+      <w:r>
+        <w:t xml:space="preserve">, </w:t>
+      </w:r>
+      <w:r>
+        <w:t xml:space="preserve">povezave </w:t>
+      </w:r>
+      <w:r>
+        <w:t xml:space="preserve">in nastavitve </w:t>
+      </w:r>
+      <w:r>
+        <w:t>v JSON format.</w:t>
+      </w:r>
+      <w:r>
+        <w:t xml:space="preserve"> Pridobljeni JSON potem zapiše v datoteko.</w:t>
+      </w:r>
+      <w:r>
+        <w:t xml:space="preserve"> </w:t>
+      </w:r>
+    </w:p>
+    <w:p>
+      <w:pPr>
+        <w:keepNext/>
+      </w:pPr>
+      <w:r>
+        <w:t xml:space="preserve">Da aplikacija razlikuje vozlišča, povezave in nastavitve ima vsak zapis v datoteki tip, ki nakazuje na </w:t>
+      </w:r>
+      <w:r>
+        <w:t>vrsto</w:t>
+      </w:r>
+      <w:r>
+        <w:t xml:space="preserve"> shranjene vsebine v JSON</w:t>
+      </w:r>
+      <w:r>
+        <w:t xml:space="preserve"> </w:t>
+      </w:r>
+      <w:r>
+        <w:t>objektu.</w:t>
+      </w:r>
+      <w:r>
+        <w:t xml:space="preserve"> </w:t>
+      </w:r>
+    </w:p>
+    <w:p>
+      <w:pPr>
+        <w:keepNext/>
+      </w:pPr>
+      <w:r>
+        <w:drawing>
+          <wp:inline distT="0" distB="0" distL="0" distR="0" wp14:anchorId="4EBE95EB" wp14:editId="1BE2D022">
+            <wp:extent cx="5049260" cy="1943100"/>
+            <wp:effectExtent l="0" t="0" r="0" b="0"/>
+            <wp:docPr id="120970170" name="Picture 1"/>
+            <wp:cNvGraphicFramePr>
+              <a:graphicFrameLocks xmlns:a="http://schemas.openxmlformats.org/drawingml/2006/main" noChangeAspect="1"/>
+            </wp:cNvGraphicFramePr>
+            <a:graphic xmlns:a="http://schemas.openxmlformats.org/drawingml/2006/main">
+              <a:graphicData uri="http://schemas.openxmlformats.org/drawingml/2006/picture">
+                <pic:pic xmlns:pic="http://schemas.openxmlformats.org/drawingml/2006/picture">
+                  <pic:nvPicPr>
+                    <pic:cNvPr id="120970170" name=""/>
+                    <pic:cNvPicPr/>
+                  </pic:nvPicPr>
+                  <pic:blipFill>
+                    <a:blip r:embed="rId49"/>
+                    <a:stretch>
+                      <a:fillRect/>
+                    </a:stretch>
+                  </pic:blipFill>
+                  <pic:spPr>
+                    <a:xfrm>
+                      <a:off x="0" y="0"/>
+                      <a:ext cx="5091154" cy="1959222"/>
+                    </a:xfrm>
+                    <a:prstGeom prst="rect">
+                      <a:avLst/>
+                    </a:prstGeom>
+                  </pic:spPr>
+                </pic:pic>
+              </a:graphicData>
+            </a:graphic>
+          </wp:inline>
+        </w:drawing>
+      </w:r>
+    </w:p>
+    <w:p>
+      <w:pPr>
+        <w:pStyle w:val="Caption"/>
+      </w:pPr>
+      <w:r>
+        <w:t xml:space="preserve">Slika </w:t>
+      </w:r>
+      <w:r>
+        <w:fldChar w:fldCharType="begin"/>
+      </w:r>
+      <w:r>
+        <w:instrText xml:space="preserve"> SEQ Slika \* ARABIC </w:instrText>
+      </w:r>
+      <w:r>
+        <w:fldChar w:fldCharType="separate"/>
+      </w:r>
+      <w:r>
+        <w:rPr>
+          <w:noProof/>
+        </w:rPr>
+        <w:t>37</w:t>
+      </w:r>
+      <w:r>
+        <w:fldChar w:fldCharType="end"/>
+      </w:r>
+      <w:r>
+        <w:t xml:space="preserve"> Shranjevanje vozlišč, povezav in nastavit</w:t>
+      </w:r>
+      <w:r>
+        <w:t>ev</w:t>
+      </w:r>
+    </w:p>
+    <w:p>
+      <w:r>
+        <w:t>Pri serializaciji vozlišč se uporablja enostaven razred, ki pomaga pri pretvorbi podatkov vozlišča v JSON format.</w:t>
+      </w:r>
+    </w:p>
+    <w:p>
+      <w:r>
+        <w:lastRenderedPageBreak/>
+        <w:t xml:space="preserve">Ko uporabnik uvozi projekt, </w:t>
+      </w:r>
+      <w:r>
+        <w:rPr>
+          <w:i/>
+          <w:iCs/>
+        </w:rPr>
+        <w:t>NodeLoadingManager</w:t>
+      </w:r>
+      <w:r>
+        <w:t xml:space="preserve"> odpre in prebere shranjeno datoteko. Po vrsti prebere vsak zapis in glede na tip zapisa ustvari primeren objekt ali spremeni nastavitev. Ker so v datoteki najprej zapisani podatki o vozliščih, se najprej ustvarijo vozlišča, šele nato pa povezave med njimi. Če bi aplikacija ustvarjala povezave, preden se ustvarijo vsa vozlišča, bi lahko prišlo do napak, saj povezava med neobstoječimi vozlišči ni mogoča.</w:t>
+      </w:r>
+    </w:p>
+    <w:p>
+      <w:pPr>
+        <w:pStyle w:val="Heading1"/>
+      </w:pPr>
+      <w:bookmarkStart w:id="74" w:name="_Toc227166619"/>
+      <w:r>
+        <w:t xml:space="preserve">11. </w:t>
+      </w:r>
+      <w:r>
+        <w:t>Zaključek</w:t>
+      </w:r>
+      <w:bookmarkEnd w:id="74"/>
+    </w:p>
+    <w:p/>
+    <w:p>
+      <w:r>
+        <w:t xml:space="preserve">Glavni cilj naloge je bil dosežen, saj aplikacija deluje in </w:t>
+      </w:r>
+      <w:r>
+        <w:t>sem jo med in po razvijanjem pogosto preizkušal</w:t>
+      </w:r>
+      <w:r>
+        <w:t>. Omogoča generacijo terena z uporabo različnih funkcionalnosti in njihovo povezovanje v grafu, kar daje uporabniku fleksibilnost pri ustvarjanju različnih oblik terena.</w:t>
+      </w:r>
+      <w:r>
+        <w:t xml:space="preserve"> </w:t>
+      </w:r>
+      <w:r>
+        <w:t>Izvedba operacij</w:t>
+      </w:r>
+      <w:r>
+        <w:t xml:space="preserve"> bi lahko bila hitrejša, vendar bi to zahtevalo izvajanje operacij nad terenom na grafičnem procesorju, kar je zahtevnejše za implementacijo in presega obseg tega projekta.</w:t>
+      </w:r>
+    </w:p>
+    <w:p>
+      <w:pPr>
+        <w:jc w:val="left"/>
+      </w:pPr>
+      <w:r>
+        <w:br w:type="page"/>
+      </w:r>
+    </w:p>
+    <w:p>
+      <w:pPr>
+        <w:pStyle w:val="Heading1"/>
+      </w:pPr>
+      <w:bookmarkStart w:id="75" w:name="_Toc227166620"/>
+      <w:r>
+        <w:lastRenderedPageBreak/>
+        <w:t>1</w:t>
+      </w:r>
+      <w:r>
+        <w:t>2</w:t>
+      </w:r>
+      <w:r>
+        <w:t>. Viri in literatur</w:t>
+      </w:r>
+      <w:r>
+        <w:t>a</w:t>
+      </w:r>
+      <w:bookmarkEnd w:id="75"/>
     </w:p>
     <w:p/>
     <w:p/>
@@ -7983,263 +8891,50 @@
     <w:p/>
     <w:p>
       <w:pPr>
-        <w:pStyle w:val="Heading2"/>
-      </w:pPr>
-      <w:bookmarkStart w:id="71" w:name="_Toc227092714"/>
+        <w:pStyle w:val="Heading1"/>
+      </w:pPr>
+    </w:p>
+    <w:p/>
+    <w:p>
+      <w:pPr>
+        <w:jc w:val="left"/>
+      </w:pPr>
+      <w:r>
+        <w:br w:type="page"/>
+      </w:r>
+    </w:p>
+    <w:p>
+      <w:pPr>
+        <w:pStyle w:val="Heading1"/>
+        <w:jc w:val="center"/>
+      </w:pPr>
+      <w:bookmarkStart w:id="76" w:name="_Toc227166621"/>
       <w:r>
         <w:lastRenderedPageBreak/>
-        <w:t>8. 6. Ostale funkcionalnost</w:t>
-      </w:r>
-      <w:r>
-        <w:t>i</w:t>
-      </w:r>
-      <w:bookmarkEnd w:id="71"/>
+        <w:t>IZJAVA O AVTORSTVU</w:t>
+      </w:r>
+      <w:bookmarkEnd w:id="76"/>
     </w:p>
     <w:p/>
     <w:p>
       <w:r>
-        <w:t>Aplikacija vsebuje tudi številna druga vozlišča s svojimi funkcionalnosti.</w:t>
+        <w:t xml:space="preserve">Izjavljam, da je strokovno poročilo </w:t>
+      </w:r>
+      <w:r>
+        <w:rPr>
+          <w:i/>
+          <w:iCs/>
+        </w:rPr>
+        <w:t>Aplikacija za proceduralno generiranje višinskih zemljevidov in digitalnih modelov terena</w:t>
       </w:r>
       <w:r>
         <w:t xml:space="preserve"> </w:t>
       </w:r>
       <w:r>
-        <w:t xml:space="preserve">Te </w:t>
-      </w:r>
-      <w:r>
-        <w:t>so:</w:t>
-      </w:r>
-    </w:p>
-    <w:p>
-      <w:pPr>
-        <w:pStyle w:val="ListParagraph"/>
-        <w:numPr>
-          <w:ilvl w:val="0"/>
-          <w:numId w:val="7"/>
-        </w:numPr>
-      </w:pPr>
-      <w:r>
-        <w:t>Funkcionalnost za združevanje</w:t>
-      </w:r>
-      <w:r>
-        <w:t>, ki</w:t>
-      </w:r>
-      <w:r>
-        <w:t xml:space="preserve"> sešteje vse vnose in je namenjeno združevanju posameznih plasti terena.</w:t>
-      </w:r>
-    </w:p>
-    <w:p>
-      <w:pPr>
-        <w:pStyle w:val="ListParagraph"/>
-        <w:numPr>
-          <w:ilvl w:val="0"/>
-          <w:numId w:val="7"/>
-        </w:numPr>
-      </w:pPr>
-      <w:r>
-        <w:t xml:space="preserve">Funkcionalnost, ki na več izhodov posreduje vrednost enega izhoda. Ta je uporabna v primeru, ko hočemo </w:t>
-      </w:r>
-      <w:r>
-        <w:t>izhod vozlišča uporabiti za več stvari</w:t>
-      </w:r>
-      <w:r>
-        <w:t xml:space="preserve">, npr. </w:t>
-      </w:r>
-      <w:r>
-        <w:t>teren</w:t>
-      </w:r>
-      <w:r>
-        <w:t xml:space="preserve"> se uporabi</w:t>
-      </w:r>
-      <w:r>
-        <w:t xml:space="preserve"> tudi kot </w:t>
-      </w:r>
-      <w:r>
-        <w:t>mask</w:t>
-      </w:r>
-      <w:r>
-        <w:t>a</w:t>
-      </w:r>
-      <w:r>
-        <w:t>.</w:t>
-      </w:r>
-    </w:p>
-    <w:p>
-      <w:pPr>
-        <w:pStyle w:val="ListParagraph"/>
-        <w:numPr>
-          <w:ilvl w:val="0"/>
-          <w:numId w:val="7"/>
-        </w:numPr>
-      </w:pPr>
-      <w:r>
-        <w:t xml:space="preserve">Funkcionalnost za normalizacijo, ki normalizira teren. </w:t>
-      </w:r>
-      <w:r>
-        <w:t>Prejšnja najvišja vrednost postane najvišja možna vrednost in prejšnja najnižja vrednost postane najnižja možna vrednost.</w:t>
-      </w:r>
-      <w:r>
-        <w:t xml:space="preserve"> </w:t>
-      </w:r>
-      <w:r>
-        <w:t>Ta funkcionalnost je u</w:t>
-      </w:r>
-      <w:r>
-        <w:t>porabn</w:t>
-      </w:r>
-      <w:r>
-        <w:t>a</w:t>
-      </w:r>
-      <w:r>
-        <w:t>, ko</w:t>
-      </w:r>
-      <w:r>
-        <w:t xml:space="preserve"> želimo</w:t>
-      </w:r>
-      <w:r>
-        <w:t>, da teren pokriva</w:t>
-      </w:r>
-      <w:r>
-        <w:t xml:space="preserve"> vse</w:t>
-      </w:r>
-      <w:r>
-        <w:t xml:space="preserve"> vrednosti od 0 do 1.</w:t>
-      </w:r>
-    </w:p>
-    <w:p>
-      <w:pPr>
-        <w:pStyle w:val="ListParagraph"/>
-        <w:numPr>
-          <w:ilvl w:val="0"/>
-          <w:numId w:val="7"/>
-        </w:numPr>
-      </w:pPr>
-      <w:r>
-        <w:t>Funkcionalnost za naknadno uporabo maske</w:t>
-      </w:r>
-    </w:p>
-    <w:p>
-      <w:pPr>
-        <w:pStyle w:val="ListParagraph"/>
-        <w:numPr>
-          <w:ilvl w:val="0"/>
-          <w:numId w:val="7"/>
-        </w:numPr>
-      </w:pPr>
-      <w:r>
-        <w:t>Funkcionalnost za ustvarjanje gradientne maske, ki ustvari masko glede na uporabnikovo izbiro</w:t>
-      </w:r>
-      <w:r>
-        <w:t xml:space="preserve"> oblike</w:t>
-      </w:r>
-      <w:r>
-        <w:t xml:space="preserve">. </w:t>
-      </w:r>
-      <w:r>
-        <w:t>Ta funkcionalnost je uporabna, ko želimo da se robovi terena bližajo vrednosti 0</w:t>
-      </w:r>
-      <w:r>
-        <w:t>. Nizki robovi</w:t>
-      </w:r>
-      <w:r>
-        <w:t xml:space="preserve"> pomaga</w:t>
-      </w:r>
-      <w:r>
-        <w:t xml:space="preserve">jo </w:t>
-      </w:r>
-      <w:r>
-        <w:t>pri integraciji terena v medije.</w:t>
-      </w:r>
-    </w:p>
-    <w:p>
-      <w:pPr>
-        <w:pStyle w:val="ListParagraph"/>
-        <w:numPr>
-          <w:ilvl w:val="0"/>
-          <w:numId w:val="7"/>
-        </w:numPr>
-      </w:pPr>
-      <w:r>
-        <w:t>Funkcionalnost za izvažanje, ki omogoča izvažanje terena</w:t>
-      </w:r>
-    </w:p>
-    <w:p>
-      <w:pPr>
-        <w:pStyle w:val="Heading1"/>
-      </w:pPr>
-      <w:bookmarkStart w:id="72" w:name="_Toc227092715"/>
-      <w:r>
-        <w:t>9. Izvažanje</w:t>
-      </w:r>
-      <w:bookmarkEnd w:id="72"/>
+        <w:t xml:space="preserve">v celoti moje avtorsko delo, ki sem ga izdelal samostojno s pomočjo navedene literature in pod vodstvom mentorja. </w:t>
+      </w:r>
     </w:p>
     <w:p/>
-    <w:p/>
-    <w:p>
-      <w:pPr>
-        <w:pStyle w:val="Heading1"/>
-      </w:pPr>
-      <w:bookmarkStart w:id="73" w:name="_Toc227092716"/>
-      <w:r>
-        <w:t xml:space="preserve">10. </w:t>
-      </w:r>
-      <w:r>
-        <w:t>Shranjevanje</w:t>
-      </w:r>
-      <w:bookmarkEnd w:id="73"/>
-    </w:p>
-    <w:p/>
-    <w:p>
-      <w:pPr>
-        <w:pStyle w:val="Heading1"/>
-      </w:pPr>
-      <w:bookmarkStart w:id="74" w:name="_Toc227092717"/>
-      <w:r>
-        <w:t>11. Viri in literatur</w:t>
-      </w:r>
-      <w:r>
-        <w:t>a</w:t>
-      </w:r>
-      <w:bookmarkEnd w:id="74"/>
-    </w:p>
-    <w:p/>
-    <w:p/>
-    <w:p/>
-    <w:p/>
-    <w:p/>
-    <w:p>
-      <w:pPr>
-        <w:pStyle w:val="Heading1"/>
-      </w:pPr>
-    </w:p>
-    <w:p/>
-    <w:p/>
-    <w:p/>
-    <w:p/>
-    <w:p/>
-    <w:p>
-      <w:pPr>
-        <w:pStyle w:val="Heading1"/>
-      </w:pPr>
-      <w:bookmarkStart w:id="75" w:name="_Toc227092718"/>
-      <w:r>
-        <w:t>IZJAVA O AVTORSTVU</w:t>
-      </w:r>
-      <w:bookmarkEnd w:id="75"/>
-    </w:p>
-    <w:p/>
-    <w:p>
-      <w:r>
-        <w:t>Izjavljam, da je strokovno poročilo Aplikacija za proceduralno generiranje višinskih zemljevidov in digitalnih modelov terena</w:t>
-      </w:r>
-      <w:r>
-        <w:t xml:space="preserve"> </w:t>
-      </w:r>
-      <w:r>
-        <w:t xml:space="preserve">v celoti moje avtorsko delo, ki sem ga izdelal samostojno s pomočjo navedene literature in pod vodstvom mentorja. </w:t>
-      </w:r>
-    </w:p>
-    <w:p/>
     <w:p>
       <w:r>
         <w:t>Ljubljana, 13. 4. 2026</w:t>
@@ -8252,10 +8947,10 @@
       </w:r>
     </w:p>
     <w:sectPr>
-      <w:headerReference w:type="default" r:id="rId46"/>
-      <w:footerReference w:type="default" r:id="rId47"/>
-      <w:headerReference w:type="first" r:id="rId48"/>
-      <w:footerReference w:type="first" r:id="rId49"/>
+      <w:headerReference w:type="default" r:id="rId50"/>
+      <w:footerReference w:type="default" r:id="rId51"/>
+      <w:headerReference w:type="first" r:id="rId52"/>
+      <w:footerReference w:type="first" r:id="rId53"/>
       <w:pgSz w:w="12240" w:h="15840"/>
       <w:pgMar w:top="1440" w:right="1440" w:bottom="1440" w:left="1440" w:header="720" w:footer="720" w:gutter="0"/>
       <w:cols w:space="720"/>

</xml_diff>

<commit_message>
Report - Wo. sources
</commit_message>
<xml_diff>
--- a/Strokovno Porocilo.docx
+++ b/Strokovno Porocilo.docx
@@ -214,9 +214,58 @@
       <w:bookmarkEnd w:id="2"/>
     </w:p>
     <w:p/>
+    <w:p>
+      <w:pPr>
+        <w:rPr>
+          <w:lang w:val="en-SI"/>
+        </w:rPr>
+      </w:pPr>
+      <w:r>
+        <w:t>This report presents the development of an application for terrain generation that can then be used in other digital media.</w:t>
+      </w:r>
+      <w:r>
+        <w:t xml:space="preserve"> </w:t>
+      </w:r>
+      <w:r>
+        <w:t>The initial part of the report presents the basic structure of the application and the process of visualizing terrain created by the user. This is</w:t>
+      </w:r>
+      <w:r>
+        <w:t xml:space="preserve"> then</w:t>
+      </w:r>
+      <w:r>
+        <w:t xml:space="preserve"> followed by a description of the system that allows the user to assemble the terrain generation process, as well as its composition and operation. The </w:t>
+      </w:r>
+      <w:r>
+        <w:rPr>
+          <w:lang w:val="en-SI"/>
+        </w:rPr>
+        <w:t>subsequent section</w:t>
+      </w:r>
+      <w:r>
+        <w:rPr>
+          <w:lang w:val="en-SI"/>
+        </w:rPr>
+        <w:t xml:space="preserve"> </w:t>
+      </w:r>
+      <w:r>
+        <w:t xml:space="preserve">presents the methods and techniques used in terrain generation, such as erosion simulation, and their implementation in the application. </w:t>
+      </w:r>
+      <w:r>
+        <w:t>The final part describes the systems for exporting terrain data and saving projects created within the application.</w:t>
+      </w:r>
+    </w:p>
     <w:p/>
-    <w:p/>
-    <w:p/>
+    <w:p>
+      <w:r>
+        <w:t>Keywords: procedural generation, terrain, height map, erosion simulation, Godot</w:t>
+      </w:r>
+      <w:r>
+        <w:t xml:space="preserve">, </w:t>
+      </w:r>
+      <w:r>
+        <w:t>C#</w:t>
+      </w:r>
+    </w:p>
     <w:p/>
     <w:p>
       <w:pPr>
@@ -239,11 +288,70 @@
         <w:tabs>
           <w:tab w:val="right" w:leader="dot" w:pos="9360"/>
         </w:tabs>
-        <w:rPr>
-          <w:color w:val="467886"/>
-          <w:u w:val="single"/>
-        </w:rPr>
-      </w:pPr>
+      </w:pPr>
+      <w:r>
+        <w:t>V tem poročilu je predstavljen razvoj aplikacije za generacijo terena, ki se lahko nato uporabi v drugih digitalnih medijih. V začetnem delu poročila je predstavljena osnovna zgradba aplikacije</w:t>
+      </w:r>
+      <w:r>
+        <w:t xml:space="preserve"> in</w:t>
+      </w:r>
+      <w:r>
+        <w:t xml:space="preserve"> postopek vizualizacije terena, ki ga ustvari uporabnik. </w:t>
+      </w:r>
+      <w:r>
+        <w:t>Temu sledi opis sistema, ki uporabniku omogoča sestavljanje postopka generacije terena, ter njegova sestava in delovanje.</w:t>
+      </w:r>
+      <w:r>
+        <w:t xml:space="preserve"> </w:t>
+      </w:r>
+      <w:r>
+        <w:t>Podrobneje so predstavljene tudi povezave med posameznimi deli sistema.</w:t>
+      </w:r>
+      <w:r>
+        <w:t xml:space="preserve"> V osrednjem delu so predstavljene metode in tehnike, uporabljene pri ustvarjanju terena, kot je simulacija erozije, ter njihova izvedba v aplikaciji. V zadnjem delu so opisani še sistemi za izvoz terena in shranjevanje projektov, ustvarjenih v aplikaciji.</w:t>
+      </w:r>
+    </w:p>
+    <w:p/>
+    <w:p>
+      <w:r>
+        <w:t xml:space="preserve">Ključne besede: </w:t>
+      </w:r>
+      <w:r>
+        <w:t>proceduralna generacija, teren</w:t>
+      </w:r>
+      <w:r>
+        <w:t xml:space="preserve">, </w:t>
+      </w:r>
+      <w:r>
+        <w:t>višinski zemljevid</w:t>
+      </w:r>
+      <w:r>
+        <w:t xml:space="preserve">, </w:t>
+      </w:r>
+      <w:r>
+        <w:t>erozijsk</w:t>
+      </w:r>
+      <w:r>
+        <w:t>a</w:t>
+      </w:r>
+      <w:r>
+        <w:t xml:space="preserve"> simulacij</w:t>
+      </w:r>
+      <w:r>
+        <w:t>a</w:t>
+      </w:r>
+      <w:r>
+        <w:t xml:space="preserve">, </w:t>
+      </w:r>
+      <w:r>
+        <w:t>Godot</w:t>
+      </w:r>
+      <w:r>
+        <w:t xml:space="preserve">, </w:t>
+      </w:r>
+      <w:r>
+        <w:t>C#</w:t>
+      </w:r>
     </w:p>
     <w:p>
       <w:r>
@@ -8127,6 +8235,9 @@
         <w:keepNext/>
       </w:pPr>
       <w:r>
+        <w:rPr>
+          <w:noProof/>
+        </w:rPr>
         <w:drawing>
           <wp:inline distT="0" distB="0" distL="0" distR="0" wp14:anchorId="5D76D0A2" wp14:editId="3C68A708">
             <wp:extent cx="5943600" cy="2518410"/>
@@ -8419,6 +8530,9 @@
         <w:keepNext/>
       </w:pPr>
       <w:r>
+        <w:rPr>
+          <w:noProof/>
+        </w:rPr>
         <w:drawing>
           <wp:inline distT="0" distB="0" distL="0" distR="0" wp14:anchorId="3E669F78" wp14:editId="5B2B3838">
             <wp:extent cx="3343275" cy="1112136"/>
@@ -8548,6 +8662,7 @@
       </w:pPr>
       <w:r>
         <w:rPr>
+          <w:noProof/>
           <w:lang w:val="en-SI"/>
         </w:rPr>
         <w:lastRenderedPageBreak/>
@@ -8732,6 +8847,9 @@
         <w:keepNext/>
       </w:pPr>
       <w:r>
+        <w:rPr>
+          <w:noProof/>
+        </w:rPr>
         <w:drawing>
           <wp:inline distT="0" distB="0" distL="0" distR="0" wp14:anchorId="4EBE95EB" wp14:editId="1BE2D022">
             <wp:extent cx="5049260" cy="1943100"/>
@@ -8838,16 +8956,7 @@
     <w:p/>
     <w:p>
       <w:r>
-        <w:t xml:space="preserve">Glavni cilj naloge je bil dosežen, saj aplikacija deluje in </w:t>
-      </w:r>
-      <w:r>
-        <w:t>sem jo med in po razvijanjem pogosto preizkušal</w:t>
-      </w:r>
-      <w:r>
-        <w:t>. Omogoča generacijo terena z uporabo različnih funkcionalnosti in njihovo povezovanje v grafu, kar daje uporabniku fleksibilnost pri ustvarjanju različnih oblik terena.</w:t>
-      </w:r>
-      <w:r>
-        <w:t xml:space="preserve"> </w:t>
+        <w:t xml:space="preserve">Glavni cilj naloge je bil dosežen, saj aplikacija deluje in sem jo med in po razvijanjem pogosto preizkušal. Omogoča generacijo terena z uporabo različnih funkcionalnosti in njihovo povezovanje v grafu, kar daje uporabniku fleksibilnost pri ustvarjanju različnih oblik terena. </w:t>
       </w:r>
       <w:r>
         <w:t>Izvedba operacij</w:t>

</xml_diff>

<commit_message>
Report small update, no sources yet
</commit_message>
<xml_diff>
--- a/Strokovno Porocilo.docx
+++ b/Strokovno Porocilo.docx
@@ -260,10 +260,7 @@
         <w:t>Keywords: procedural generation, terrain, height map, erosion simulation, Godot</w:t>
       </w:r>
       <w:r>
-        <w:t xml:space="preserve">, </w:t>
-      </w:r>
-      <w:r>
-        <w:t>C#</w:t>
+        <w:t>, C#</w:t>
       </w:r>
     </w:p>
     <w:p/>
@@ -347,10 +344,7 @@
         <w:t>Godot</w:t>
       </w:r>
       <w:r>
-        <w:t xml:space="preserve">, </w:t>
-      </w:r>
-      <w:r>
-        <w:t>C#</w:t>
+        <w:t>, C#</w:t>
       </w:r>
     </w:p>
     <w:p>
@@ -8227,7 +8221,13 @@
         <w:t>, ki ima shranjene vse celice terena, na katere lahko iz trenutne pozicije kapljice erozija vpliva.</w:t>
       </w:r>
       <w:r>
-        <w:t xml:space="preserve"> Odlaganje sedimenta tega sistema ne uporablja.</w:t>
+        <w:t xml:space="preserve"> Odlaganje sedimenta tega sistema ne uporablja</w:t>
+      </w:r>
+      <w:r>
+        <w:t>, nižanje terena pa</w:t>
+      </w:r>
+      <w:r>
+        <w:t>.</w:t>
       </w:r>
     </w:p>
     <w:p>
@@ -11192,6 +11192,7 @@
   <w:style w:type="character" w:default="1" w:styleId="DefaultParagraphFont">
     <w:name w:val="Default Paragraph Font"/>
     <w:uiPriority w:val="1"/>
+    <w:semiHidden/>
     <w:unhideWhenUsed/>
   </w:style>
   <w:style w:type="table" w:default="1" w:styleId="TableNormal">

</xml_diff>